<commit_message>
Running only UXVis items uncolapsed
</commit_message>
<xml_diff>
--- a/Readme - Notebooks - Validation phase.docx
+++ b/Readme - Notebooks - Validation phase.docx
@@ -1,6 +1,6 @@
 
 <file path=word/document.xml><?xml version="1.0" encoding="utf-8"?>
-<w:document xmlns:wpc="http://schemas.microsoft.com/office/word/2010/wordprocessingCanvas" xmlns:cx="http://schemas.microsoft.com/office/drawing/2014/chartex" xmlns:cx1="http://schemas.microsoft.com/office/drawing/2015/9/8/chartex" xmlns:cx2="http://schemas.microsoft.com/office/drawing/2015/10/21/chartex" xmlns:cx3="http://schemas.microsoft.com/office/drawing/2016/5/9/chartex" xmlns:cx4="http://schemas.microsoft.com/office/drawing/2016/5/10/chartex" xmlns:cx5="http://schemas.microsoft.com/office/drawing/2016/5/11/chartex" xmlns:cx6="http://schemas.microsoft.com/office/drawing/2016/5/12/chartex" xmlns:cx7="http://schemas.microsoft.com/office/drawing/2016/5/13/chartex" xmlns:cx8="http://schemas.microsoft.com/office/drawing/2016/5/14/chartex" xmlns:mc="http://schemas.openxmlformats.org/markup-compatibility/2006" xmlns:aink="http://schemas.microsoft.com/office/drawing/2016/ink" xmlns:am3d="http://schemas.microsoft.com/office/drawing/2017/model3d" xmlns:o="urn:schemas-microsoft-com:office:office" xmlns:oel="http://schemas.microsoft.com/office/2019/extlst" xmlns:r="http://schemas.openxmlformats.org/officeDocument/2006/relationships" xmlns:m="http://schemas.openxmlformats.org/officeDocument/2006/math" xmlns:v="urn:schemas-microsoft-com:vml" xmlns:wp14="http://schemas.microsoft.com/office/word/2010/wordprocessingDrawing" xmlns:wp="http://schemas.openxmlformats.org/drawingml/2006/wordprocessingDrawing" xmlns:w10="urn:schemas-microsoft-com:office:word" xmlns:w="http://schemas.openxmlformats.org/wordprocessingml/2006/main" xmlns:w14="http://schemas.microsoft.com/office/word/2010/wordml" xmlns:w15="http://schemas.microsoft.com/office/word/2012/wordml" xmlns:w16cei="http://schemas.microsoft.com/office/word/2026/wordml/cei" xmlns:w16cex="http://schemas.microsoft.com/office/word/2018/wordml/cex" xmlns:w16cid="http://schemas.microsoft.com/office/word/2016/wordml/cid" xmlns:w16="http://schemas.microsoft.com/office/word/2018/wordml" xmlns:w16du="http://schemas.microsoft.com/office/word/2023/wordml/word16du" xmlns:w16sdtdh="http://schemas.microsoft.com/office/word/2020/wordml/sdtdatahash" xmlns:w16sdtfl="http://schemas.microsoft.com/office/word/2024/wordml/sdtformatlock" xmlns:w16se="http://schemas.microsoft.com/office/word/2015/wordml/symex" xmlns:wpg="http://schemas.microsoft.com/office/word/2010/wordprocessingGroup" xmlns:wpi="http://schemas.microsoft.com/office/word/2010/wordprocessingInk" xmlns:wne="http://schemas.microsoft.com/office/word/2006/wordml" xmlns:wps="http://schemas.microsoft.com/office/word/2010/wordprocessingShape" mc:Ignorable="w14 w15 w16se w16cid w16 w16cex w16sdtdh w16sdtfl w16du wp14">
+<w:document xmlns:wpc="http://schemas.microsoft.com/office/word/2010/wordprocessingCanvas" xmlns:cx="http://schemas.microsoft.com/office/drawing/2014/chartex" xmlns:cx1="http://schemas.microsoft.com/office/drawing/2015/9/8/chartex" xmlns:cx2="http://schemas.microsoft.com/office/drawing/2015/10/21/chartex" xmlns:cx3="http://schemas.microsoft.com/office/drawing/2016/5/9/chartex" xmlns:cx4="http://schemas.microsoft.com/office/drawing/2016/5/10/chartex" xmlns:cx5="http://schemas.microsoft.com/office/drawing/2016/5/11/chartex" xmlns:cx6="http://schemas.microsoft.com/office/drawing/2016/5/12/chartex" xmlns:cx7="http://schemas.microsoft.com/office/drawing/2016/5/13/chartex" xmlns:cx8="http://schemas.microsoft.com/office/drawing/2016/5/14/chartex" xmlns:mc="http://schemas.openxmlformats.org/markup-compatibility/2006" xmlns:aink="http://schemas.microsoft.com/office/drawing/2016/ink" xmlns:am3d="http://schemas.microsoft.com/office/drawing/2017/model3d" xmlns:o="urn:schemas-microsoft-com:office:office" xmlns:oel="http://schemas.microsoft.com/office/2019/extlst" xmlns:r="http://schemas.openxmlformats.org/officeDocument/2006/relationships" xmlns:m="http://schemas.openxmlformats.org/officeDocument/2006/math" xmlns:v="urn:schemas-microsoft-com:vml" xmlns:wp14="http://schemas.microsoft.com/office/word/2010/wordprocessingDrawing" xmlns:wp="http://schemas.openxmlformats.org/drawingml/2006/wordprocessingDrawing" xmlns:w10="urn:schemas-microsoft-com:office:word" xmlns:w="http://schemas.openxmlformats.org/wordprocessingml/2006/main" xmlns:w14="http://schemas.microsoft.com/office/word/2010/wordml" xmlns:w15="http://schemas.microsoft.com/office/word/2012/wordml" xmlns:w16cex="http://schemas.microsoft.com/office/word/2018/wordml/cex" xmlns:w16cid="http://schemas.microsoft.com/office/word/2016/wordml/cid" xmlns:w16="http://schemas.microsoft.com/office/word/2018/wordml" xmlns:w16du="http://schemas.microsoft.com/office/word/2023/wordml/word16du" xmlns:w16sdtdh="http://schemas.microsoft.com/office/word/2020/wordml/sdtdatahash" xmlns:w16sdtfl="http://schemas.microsoft.com/office/word/2024/wordml/sdtformatlock" xmlns:w16se="http://schemas.microsoft.com/office/word/2015/wordml/symex" xmlns:wpg="http://schemas.microsoft.com/office/word/2010/wordprocessingGroup" xmlns:wpi="http://schemas.microsoft.com/office/word/2010/wordprocessingInk" xmlns:wne="http://schemas.microsoft.com/office/word/2006/wordml" xmlns:wps="http://schemas.microsoft.com/office/word/2010/wordprocessingShape" mc:Ignorable="w14 w15 w16se w16cid w16 w16cex w16sdtdh w16sdtfl w16du wp14">
   <w:body>
     <w:p>
       <w:pPr>
@@ -2154,24 +2154,50 @@
           <w:w w:val="90"/>
           <w:lang w:val="pt-BR"/>
         </w:rPr>
-        <w:t>Val_1_Gold_standard_</w:t>
-      </w:r>
-      <w:proofErr w:type="gramStart"/>
-      <w:r>
-        <w:rPr>
-          <w:w w:val="90"/>
-          <w:lang w:val="pt-BR"/>
-        </w:rPr>
-        <w:t>reliability</w:t>
-      </w:r>
-      <w:r>
-        <w:rPr>
-          <w:w w:val="90"/>
-          <w:lang w:val="pt-BR"/>
-        </w:rPr>
-        <w:t>.Rmd</w:t>
-      </w:r>
-      <w:proofErr w:type="gramEnd"/>
+        <w:t xml:space="preserve">Reproduce0 - </w:t>
+      </w:r>
+      <w:r>
+        <w:rPr>
+          <w:w w:val="90"/>
+          <w:lang w:val="pt-BR"/>
+        </w:rPr>
+        <w:t>Colapse</w:t>
+      </w:r>
+      <w:r>
+        <w:rPr>
+          <w:w w:val="90"/>
+          <w:lang w:val="pt-BR"/>
+        </w:rPr>
+        <w:t xml:space="preserve"> input data</w:t>
+      </w:r>
+      <w:r>
+        <w:rPr>
+          <w:w w:val="90"/>
+          <w:lang w:val="pt-BR"/>
+        </w:rPr>
+        <w:t>/</w:t>
+      </w:r>
+      <w:r>
+        <w:rPr>
+          <w:w w:val="90"/>
+          <w:lang w:val="pt-BR"/>
+        </w:rPr>
+        <w:t>Val_0_Colapsing_Low-Frequency_Categories-toMoreFrequent</w:t>
+      </w:r>
+    </w:p>
+    <w:p>
+      <w:pPr>
+        <w:pStyle w:val="Heading1"/>
+        <w:numPr>
+          <w:ilvl w:val="0"/>
+          <w:numId w:val="0"/>
+        </w:numPr>
+        <w:ind w:left="862" w:hanging="360"/>
+        <w:rPr>
+          <w:w w:val="90"/>
+          <w:lang w:val="pt-BR"/>
+        </w:rPr>
+      </w:pPr>
     </w:p>
     <w:p>
       <w:pPr>
@@ -2182,32 +2208,728 @@
           <w:lang w:val="pt-BR"/>
         </w:rPr>
       </w:pPr>
+      <w:proofErr w:type="spellStart"/>
+      <w:r>
+        <w:rPr>
+          <w:w w:val="90"/>
+          <w:lang w:val="pt-BR"/>
+        </w:rPr>
+        <w:t>Description</w:t>
+      </w:r>
+      <w:proofErr w:type="spellEnd"/>
+      <w:r>
+        <w:rPr>
+          <w:w w:val="90"/>
+          <w:lang w:val="pt-BR"/>
+        </w:rPr>
+        <w:t xml:space="preserve">: </w:t>
+      </w:r>
+    </w:p>
+    <w:p>
+      <w:pPr>
+        <w:pStyle w:val="Heading1"/>
+        <w:numPr>
+          <w:ilvl w:val="0"/>
+          <w:numId w:val="0"/>
+        </w:numPr>
+        <w:ind w:left="862" w:hanging="360"/>
+        <w:rPr>
+          <w:w w:val="90"/>
+          <w:lang w:val="pt-BR"/>
+        </w:rPr>
+      </w:pPr>
+    </w:p>
+    <w:p>
+      <w:pPr>
+        <w:pStyle w:val="Heading3"/>
+        <w:rPr>
+          <w:b w:val="0"/>
+          <w:bCs w:val="0"/>
+          <w:w w:val="90"/>
+          <w:lang w:val="pt-BR"/>
+        </w:rPr>
+      </w:pPr>
+      <w:proofErr w:type="spellStart"/>
+      <w:r>
+        <w:rPr>
+          <w:b w:val="0"/>
+          <w:bCs w:val="0"/>
+          <w:w w:val="90"/>
+          <w:lang w:val="pt-BR"/>
+        </w:rPr>
+        <w:t>This</w:t>
+      </w:r>
+      <w:proofErr w:type="spellEnd"/>
+      <w:r>
+        <w:rPr>
+          <w:b w:val="0"/>
+          <w:bCs w:val="0"/>
+          <w:w w:val="90"/>
+          <w:lang w:val="pt-BR"/>
+        </w:rPr>
+        <w:t xml:space="preserve"> R script </w:t>
+      </w:r>
+      <w:proofErr w:type="spellStart"/>
+      <w:r>
+        <w:rPr>
+          <w:b w:val="0"/>
+          <w:bCs w:val="0"/>
+          <w:w w:val="90"/>
+          <w:lang w:val="pt-BR"/>
+        </w:rPr>
+        <w:t>iteratively</w:t>
+      </w:r>
+      <w:proofErr w:type="spellEnd"/>
+      <w:r>
+        <w:rPr>
+          <w:b w:val="0"/>
+          <w:bCs w:val="0"/>
+          <w:w w:val="90"/>
+          <w:lang w:val="pt-BR"/>
+        </w:rPr>
+        <w:t xml:space="preserve"> </w:t>
+      </w:r>
+      <w:proofErr w:type="spellStart"/>
+      <w:r>
+        <w:rPr>
+          <w:b w:val="0"/>
+          <w:bCs w:val="0"/>
+          <w:w w:val="90"/>
+          <w:lang w:val="pt-BR"/>
+        </w:rPr>
+        <w:t>collapses</w:t>
+      </w:r>
+      <w:proofErr w:type="spellEnd"/>
+      <w:r>
+        <w:rPr>
+          <w:b w:val="0"/>
+          <w:bCs w:val="0"/>
+          <w:w w:val="90"/>
+          <w:lang w:val="pt-BR"/>
+        </w:rPr>
+        <w:t xml:space="preserve"> </w:t>
+      </w:r>
+      <w:proofErr w:type="spellStart"/>
+      <w:r>
+        <w:rPr>
+          <w:b w:val="0"/>
+          <w:bCs w:val="0"/>
+          <w:w w:val="90"/>
+          <w:lang w:val="pt-BR"/>
+        </w:rPr>
+        <w:t>sparse</w:t>
+      </w:r>
+      <w:proofErr w:type="spellEnd"/>
+      <w:r>
+        <w:rPr>
+          <w:b w:val="0"/>
+          <w:bCs w:val="0"/>
+          <w:w w:val="90"/>
+          <w:lang w:val="pt-BR"/>
+        </w:rPr>
+        <w:t xml:space="preserve"> </w:t>
+      </w:r>
+      <w:proofErr w:type="spellStart"/>
+      <w:r>
+        <w:rPr>
+          <w:b w:val="0"/>
+          <w:bCs w:val="0"/>
+          <w:w w:val="90"/>
+          <w:lang w:val="pt-BR"/>
+        </w:rPr>
+        <w:t>Likert</w:t>
+      </w:r>
+      <w:proofErr w:type="spellEnd"/>
+      <w:r>
+        <w:rPr>
+          <w:b w:val="0"/>
+          <w:bCs w:val="0"/>
+          <w:w w:val="90"/>
+          <w:lang w:val="pt-BR"/>
+        </w:rPr>
+        <w:t xml:space="preserve"> </w:t>
+      </w:r>
+      <w:proofErr w:type="spellStart"/>
+      <w:r>
+        <w:rPr>
+          <w:b w:val="0"/>
+          <w:bCs w:val="0"/>
+          <w:w w:val="90"/>
+          <w:lang w:val="pt-BR"/>
+        </w:rPr>
+        <w:t>scale</w:t>
+      </w:r>
+      <w:proofErr w:type="spellEnd"/>
+      <w:r>
+        <w:rPr>
+          <w:b w:val="0"/>
+          <w:bCs w:val="0"/>
+          <w:w w:val="90"/>
+          <w:lang w:val="pt-BR"/>
+        </w:rPr>
+        <w:t xml:space="preserve"> </w:t>
+      </w:r>
+      <w:proofErr w:type="spellStart"/>
+      <w:r>
+        <w:rPr>
+          <w:b w:val="0"/>
+          <w:bCs w:val="0"/>
+          <w:w w:val="90"/>
+          <w:lang w:val="pt-BR"/>
+        </w:rPr>
+        <w:t>categories</w:t>
+      </w:r>
+      <w:proofErr w:type="spellEnd"/>
+      <w:r>
+        <w:rPr>
+          <w:b w:val="0"/>
+          <w:bCs w:val="0"/>
+          <w:w w:val="90"/>
+          <w:lang w:val="pt-BR"/>
+        </w:rPr>
+        <w:t xml:space="preserve"> (</w:t>
+      </w:r>
+      <m:oMath>
+        <m:r>
+          <m:rPr>
+            <m:sty m:val="p"/>
+          </m:rPr>
+          <w:rPr>
+            <w:rFonts w:ascii="Cambria Math" w:hAnsi="Cambria Math"/>
+            <w:w w:val="90"/>
+            <w:lang w:val="pt-BR"/>
+          </w:rPr>
+          <m:t>≤</m:t>
+        </m:r>
+        <m:r>
+          <m:rPr>
+            <m:nor/>
+          </m:rPr>
+          <w:rPr>
+            <w:b w:val="0"/>
+            <w:bCs w:val="0"/>
+            <w:w w:val="90"/>
+            <w:lang w:val="pt-BR"/>
+          </w:rPr>
+          <m:t>threshold</m:t>
+        </m:r>
+      </m:oMath>
+      <w:r>
+        <w:rPr>
+          <w:b w:val="0"/>
+          <w:bCs w:val="0"/>
+          <w:w w:val="90"/>
+          <w:lang w:val="pt-BR"/>
+        </w:rPr>
+        <w:t xml:space="preserve">) </w:t>
+      </w:r>
+      <w:proofErr w:type="spellStart"/>
+      <w:r>
+        <w:rPr>
+          <w:b w:val="0"/>
+          <w:bCs w:val="0"/>
+          <w:w w:val="90"/>
+          <w:lang w:val="pt-BR"/>
+        </w:rPr>
+        <w:t>into</w:t>
+      </w:r>
+      <w:proofErr w:type="spellEnd"/>
+      <w:r>
+        <w:rPr>
+          <w:b w:val="0"/>
+          <w:bCs w:val="0"/>
+          <w:w w:val="90"/>
+          <w:lang w:val="pt-BR"/>
+        </w:rPr>
+        <w:t xml:space="preserve"> </w:t>
+      </w:r>
+      <w:proofErr w:type="spellStart"/>
+      <w:r>
+        <w:rPr>
+          <w:b w:val="0"/>
+          <w:bCs w:val="0"/>
+          <w:w w:val="90"/>
+          <w:lang w:val="pt-BR"/>
+        </w:rPr>
+        <w:t>their</w:t>
+      </w:r>
+      <w:proofErr w:type="spellEnd"/>
+      <w:r>
+        <w:rPr>
+          <w:b w:val="0"/>
+          <w:bCs w:val="0"/>
+          <w:w w:val="90"/>
+          <w:lang w:val="pt-BR"/>
+        </w:rPr>
+        <w:t xml:space="preserve"> </w:t>
+      </w:r>
+      <w:proofErr w:type="spellStart"/>
+      <w:r>
+        <w:rPr>
+          <w:b w:val="0"/>
+          <w:bCs w:val="0"/>
+          <w:w w:val="90"/>
+          <w:lang w:val="pt-BR"/>
+        </w:rPr>
+        <w:t>most</w:t>
+      </w:r>
+      <w:proofErr w:type="spellEnd"/>
+      <w:r>
+        <w:rPr>
+          <w:b w:val="0"/>
+          <w:bCs w:val="0"/>
+          <w:w w:val="90"/>
+          <w:lang w:val="pt-BR"/>
+        </w:rPr>
+        <w:t xml:space="preserve"> </w:t>
+      </w:r>
+      <w:proofErr w:type="spellStart"/>
+      <w:r>
+        <w:rPr>
+          <w:b w:val="0"/>
+          <w:bCs w:val="0"/>
+          <w:w w:val="90"/>
+          <w:lang w:val="pt-BR"/>
+        </w:rPr>
+        <w:t>frequent</w:t>
+      </w:r>
+      <w:proofErr w:type="spellEnd"/>
+      <w:r>
+        <w:rPr>
+          <w:b w:val="0"/>
+          <w:bCs w:val="0"/>
+          <w:w w:val="90"/>
+          <w:lang w:val="pt-BR"/>
+        </w:rPr>
+        <w:t xml:space="preserve"> </w:t>
+      </w:r>
+      <w:proofErr w:type="spellStart"/>
+      <w:r>
+        <w:rPr>
+          <w:b w:val="0"/>
+          <w:bCs w:val="0"/>
+          <w:w w:val="90"/>
+          <w:lang w:val="pt-BR"/>
+        </w:rPr>
+        <w:t>adjacent</w:t>
+      </w:r>
+      <w:proofErr w:type="spellEnd"/>
+      <w:r>
+        <w:rPr>
+          <w:b w:val="0"/>
+          <w:bCs w:val="0"/>
+          <w:w w:val="90"/>
+          <w:lang w:val="pt-BR"/>
+        </w:rPr>
+        <w:t xml:space="preserve"> response </w:t>
+      </w:r>
+      <w:proofErr w:type="spellStart"/>
+      <w:r>
+        <w:rPr>
+          <w:b w:val="0"/>
+          <w:bCs w:val="0"/>
+          <w:w w:val="90"/>
+          <w:lang w:val="pt-BR"/>
+        </w:rPr>
+        <w:t>options</w:t>
+      </w:r>
+      <w:proofErr w:type="spellEnd"/>
+      <w:r>
+        <w:rPr>
+          <w:b w:val="0"/>
+          <w:bCs w:val="0"/>
+          <w:w w:val="90"/>
+          <w:lang w:val="pt-BR"/>
+        </w:rPr>
+        <w:t xml:space="preserve">, </w:t>
+      </w:r>
+      <w:proofErr w:type="spellStart"/>
+      <w:r>
+        <w:rPr>
+          <w:b w:val="0"/>
+          <w:bCs w:val="0"/>
+          <w:w w:val="90"/>
+          <w:lang w:val="pt-BR"/>
+        </w:rPr>
+        <w:t>excluding</w:t>
+      </w:r>
+      <w:proofErr w:type="spellEnd"/>
+      <w:r>
+        <w:rPr>
+          <w:b w:val="0"/>
+          <w:bCs w:val="0"/>
+          <w:w w:val="90"/>
+          <w:lang w:val="pt-BR"/>
+        </w:rPr>
+        <w:t xml:space="preserve"> </w:t>
+      </w:r>
+      <w:proofErr w:type="spellStart"/>
+      <w:r>
+        <w:rPr>
+          <w:b w:val="0"/>
+          <w:bCs w:val="0"/>
+          <w:w w:val="90"/>
+          <w:lang w:val="pt-BR"/>
+        </w:rPr>
+        <w:t>metadata</w:t>
+      </w:r>
+      <w:proofErr w:type="spellEnd"/>
+      <w:r>
+        <w:rPr>
+          <w:b w:val="0"/>
+          <w:bCs w:val="0"/>
+          <w:w w:val="90"/>
+          <w:lang w:val="pt-BR"/>
+        </w:rPr>
+        <w:t xml:space="preserve"> </w:t>
+      </w:r>
+      <w:proofErr w:type="spellStart"/>
+      <w:r>
+        <w:rPr>
+          <w:b w:val="0"/>
+          <w:bCs w:val="0"/>
+          <w:w w:val="90"/>
+          <w:lang w:val="pt-BR"/>
+        </w:rPr>
+        <w:t>and</w:t>
+      </w:r>
+      <w:proofErr w:type="spellEnd"/>
+      <w:r>
+        <w:rPr>
+          <w:b w:val="0"/>
+          <w:bCs w:val="0"/>
+          <w:w w:val="90"/>
+          <w:lang w:val="pt-BR"/>
+        </w:rPr>
+        <w:t xml:space="preserve"> </w:t>
+      </w:r>
+      <w:proofErr w:type="spellStart"/>
+      <w:r>
+        <w:rPr>
+          <w:b w:val="0"/>
+          <w:bCs w:val="0"/>
+          <w:w w:val="90"/>
+          <w:lang w:val="pt-BR"/>
+        </w:rPr>
+        <w:t>external</w:t>
+      </w:r>
+      <w:proofErr w:type="spellEnd"/>
+      <w:r>
+        <w:rPr>
+          <w:b w:val="0"/>
+          <w:bCs w:val="0"/>
+          <w:w w:val="90"/>
+          <w:lang w:val="pt-BR"/>
+        </w:rPr>
+        <w:t xml:space="preserve"> </w:t>
+      </w:r>
+      <w:proofErr w:type="spellStart"/>
+      <w:r>
+        <w:rPr>
+          <w:b w:val="0"/>
+          <w:bCs w:val="0"/>
+          <w:w w:val="90"/>
+          <w:lang w:val="pt-BR"/>
+        </w:rPr>
+        <w:t>instruments</w:t>
+      </w:r>
+      <w:proofErr w:type="spellEnd"/>
+      <w:r>
+        <w:rPr>
+          <w:b w:val="0"/>
+          <w:bCs w:val="0"/>
+          <w:w w:val="90"/>
+          <w:lang w:val="pt-BR"/>
+        </w:rPr>
+        <w:t xml:space="preserve"> (SUS/UEQ), </w:t>
+      </w:r>
+      <w:proofErr w:type="spellStart"/>
+      <w:r>
+        <w:rPr>
+          <w:b w:val="0"/>
+          <w:bCs w:val="0"/>
+          <w:w w:val="90"/>
+          <w:lang w:val="pt-BR"/>
+        </w:rPr>
+        <w:t>while</w:t>
+      </w:r>
+      <w:proofErr w:type="spellEnd"/>
+      <w:r>
+        <w:rPr>
+          <w:b w:val="0"/>
+          <w:bCs w:val="0"/>
+          <w:w w:val="90"/>
+          <w:lang w:val="pt-BR"/>
+        </w:rPr>
+        <w:t xml:space="preserve"> </w:t>
+      </w:r>
+      <w:proofErr w:type="spellStart"/>
+      <w:r>
+        <w:rPr>
+          <w:b w:val="0"/>
+          <w:bCs w:val="0"/>
+          <w:w w:val="90"/>
+          <w:lang w:val="pt-BR"/>
+        </w:rPr>
+        <w:t>logging</w:t>
+      </w:r>
+      <w:proofErr w:type="spellEnd"/>
+      <w:r>
+        <w:rPr>
+          <w:b w:val="0"/>
+          <w:bCs w:val="0"/>
+          <w:w w:val="90"/>
+          <w:lang w:val="pt-BR"/>
+        </w:rPr>
+        <w:t xml:space="preserve"> </w:t>
+      </w:r>
+      <w:proofErr w:type="spellStart"/>
+      <w:r>
+        <w:rPr>
+          <w:b w:val="0"/>
+          <w:bCs w:val="0"/>
+          <w:w w:val="90"/>
+          <w:lang w:val="pt-BR"/>
+        </w:rPr>
+        <w:t>all</w:t>
+      </w:r>
+      <w:proofErr w:type="spellEnd"/>
+      <w:r>
+        <w:rPr>
+          <w:b w:val="0"/>
+          <w:bCs w:val="0"/>
+          <w:w w:val="90"/>
+          <w:lang w:val="pt-BR"/>
+        </w:rPr>
+        <w:t xml:space="preserve"> </w:t>
+      </w:r>
+      <w:proofErr w:type="spellStart"/>
+      <w:r>
+        <w:rPr>
+          <w:b w:val="0"/>
+          <w:bCs w:val="0"/>
+          <w:w w:val="90"/>
+          <w:lang w:val="pt-BR"/>
+        </w:rPr>
+        <w:t>category</w:t>
+      </w:r>
+      <w:proofErr w:type="spellEnd"/>
+      <w:r>
+        <w:rPr>
+          <w:b w:val="0"/>
+          <w:bCs w:val="0"/>
+          <w:w w:val="90"/>
+          <w:lang w:val="pt-BR"/>
+        </w:rPr>
+        <w:t xml:space="preserve"> </w:t>
+      </w:r>
+      <w:proofErr w:type="spellStart"/>
+      <w:r>
+        <w:rPr>
+          <w:b w:val="0"/>
+          <w:bCs w:val="0"/>
+          <w:w w:val="90"/>
+          <w:lang w:val="pt-BR"/>
+        </w:rPr>
+        <w:t>mergers</w:t>
+      </w:r>
+      <w:proofErr w:type="spellEnd"/>
+      <w:r>
+        <w:rPr>
+          <w:b w:val="0"/>
+          <w:bCs w:val="0"/>
+          <w:w w:val="90"/>
+          <w:lang w:val="pt-BR"/>
+        </w:rPr>
+        <w:t xml:space="preserve"> </w:t>
+      </w:r>
+      <w:proofErr w:type="spellStart"/>
+      <w:r>
+        <w:rPr>
+          <w:b w:val="0"/>
+          <w:bCs w:val="0"/>
+          <w:w w:val="90"/>
+          <w:lang w:val="pt-BR"/>
+        </w:rPr>
+        <w:t>and</w:t>
+      </w:r>
+      <w:proofErr w:type="spellEnd"/>
+      <w:r>
+        <w:rPr>
+          <w:b w:val="0"/>
+          <w:bCs w:val="0"/>
+          <w:w w:val="90"/>
+          <w:lang w:val="pt-BR"/>
+        </w:rPr>
+        <w:t xml:space="preserve"> </w:t>
+      </w:r>
+      <w:proofErr w:type="spellStart"/>
+      <w:r>
+        <w:rPr>
+          <w:b w:val="0"/>
+          <w:bCs w:val="0"/>
+          <w:w w:val="90"/>
+          <w:lang w:val="pt-BR"/>
+        </w:rPr>
+        <w:t>exporting</w:t>
+      </w:r>
+      <w:proofErr w:type="spellEnd"/>
+      <w:r>
+        <w:rPr>
+          <w:b w:val="0"/>
+          <w:bCs w:val="0"/>
+          <w:w w:val="90"/>
+          <w:lang w:val="pt-BR"/>
+        </w:rPr>
+        <w:t xml:space="preserve"> </w:t>
+      </w:r>
+      <w:proofErr w:type="spellStart"/>
+      <w:r>
+        <w:rPr>
+          <w:b w:val="0"/>
+          <w:bCs w:val="0"/>
+          <w:w w:val="90"/>
+          <w:lang w:val="pt-BR"/>
+        </w:rPr>
+        <w:t>the</w:t>
+      </w:r>
+      <w:proofErr w:type="spellEnd"/>
+      <w:r>
+        <w:rPr>
+          <w:b w:val="0"/>
+          <w:bCs w:val="0"/>
+          <w:w w:val="90"/>
+          <w:lang w:val="pt-BR"/>
+        </w:rPr>
+        <w:t xml:space="preserve"> </w:t>
+      </w:r>
+      <w:proofErr w:type="spellStart"/>
+      <w:r>
+        <w:rPr>
+          <w:b w:val="0"/>
+          <w:bCs w:val="0"/>
+          <w:w w:val="90"/>
+          <w:lang w:val="pt-BR"/>
+        </w:rPr>
+        <w:t>modified</w:t>
+      </w:r>
+      <w:proofErr w:type="spellEnd"/>
+      <w:r>
+        <w:rPr>
+          <w:b w:val="0"/>
+          <w:bCs w:val="0"/>
+          <w:w w:val="90"/>
+          <w:lang w:val="pt-BR"/>
+        </w:rPr>
+        <w:t xml:space="preserve"> </w:t>
+      </w:r>
+      <w:proofErr w:type="spellStart"/>
+      <w:r>
+        <w:rPr>
+          <w:b w:val="0"/>
+          <w:bCs w:val="0"/>
+          <w:w w:val="90"/>
+          <w:lang w:val="pt-BR"/>
+        </w:rPr>
+        <w:t>dataset</w:t>
+      </w:r>
+      <w:proofErr w:type="spellEnd"/>
+      <w:r>
+        <w:rPr>
+          <w:b w:val="0"/>
+          <w:bCs w:val="0"/>
+          <w:w w:val="90"/>
+          <w:lang w:val="pt-BR"/>
+        </w:rPr>
+        <w:t>.</w:t>
+      </w:r>
+    </w:p>
+    <w:p>
+      <w:pPr>
+        <w:pStyle w:val="Heading3"/>
+        <w:rPr>
+          <w:b w:val="0"/>
+          <w:bCs w:val="0"/>
+          <w:w w:val="90"/>
+          <w:lang w:val="pt-BR"/>
+        </w:rPr>
+      </w:pPr>
+    </w:p>
+    <w:p>
+      <w:pPr>
+        <w:pStyle w:val="Heading3"/>
+        <w:rPr>
+          <w:b w:val="0"/>
+          <w:bCs w:val="0"/>
+          <w:w w:val="90"/>
+          <w:lang w:val="pt-BR"/>
+        </w:rPr>
+      </w:pPr>
     </w:p>
     <w:p>
       <w:pPr>
         <w:pStyle w:val="Heading3"/>
         <w:ind w:left="0" w:firstLine="0"/>
         <w:rPr>
-          <w:w w:val="90"/>
-          <w:lang w:val="pt-BR"/>
-        </w:rPr>
-      </w:pPr>
-      <w:proofErr w:type="spellStart"/>
-      <w:r>
-        <w:rPr>
-          <w:w w:val="90"/>
-          <w:lang w:val="pt-BR"/>
-        </w:rPr>
-        <w:t>Description</w:t>
-      </w:r>
-      <w:proofErr w:type="spellEnd"/>
-      <w:r>
-        <w:rPr>
-          <w:w w:val="90"/>
-          <w:lang w:val="pt-BR"/>
-        </w:rPr>
-        <w:t xml:space="preserve">: </w:t>
-      </w:r>
+          <w:rFonts w:ascii="Arial" w:hAnsi="Arial" w:cs="Arial"/>
+          <w:spacing w:val="-2"/>
+          <w:w w:val="90"/>
+          <w:lang w:val="pt-BR"/>
+        </w:rPr>
+      </w:pPr>
+      <w:r>
+        <w:rPr>
+          <w:w w:val="90"/>
+          <w:lang w:val="pt-BR"/>
+        </w:rPr>
+        <w:t xml:space="preserve">INPUT file </w:t>
+      </w:r>
+      <w:proofErr w:type="spellStart"/>
+      <w:r>
+        <w:rPr>
+          <w:w w:val="90"/>
+          <w:lang w:val="pt-BR"/>
+        </w:rPr>
+        <w:t>on</w:t>
+      </w:r>
+      <w:proofErr w:type="spellEnd"/>
+      <w:r>
+        <w:t xml:space="preserve"> </w:t>
+      </w:r>
+      <w:r>
+        <w:t>/</w:t>
+      </w:r>
+      <w:r>
+        <w:t>Data</w:t>
+      </w:r>
+      <w:r>
+        <w:t>/</w:t>
+      </w:r>
+      <w:r>
+        <w:t xml:space="preserve"> directory</w:t>
+      </w:r>
+    </w:p>
+    <w:p>
+      <w:pPr>
+        <w:pStyle w:val="Heading3"/>
+        <w:rPr>
+          <w:b w:val="0"/>
+          <w:bCs w:val="0"/>
+          <w:w w:val="90"/>
+          <w:lang w:val="pt-BR"/>
+        </w:rPr>
+      </w:pPr>
+    </w:p>
+    <w:p>
+      <w:pPr>
+        <w:pStyle w:val="Heading3"/>
+        <w:rPr>
+          <w:b w:val="0"/>
+          <w:bCs w:val="0"/>
+          <w:w w:val="90"/>
+          <w:lang w:val="pt-BR"/>
+        </w:rPr>
+      </w:pPr>
     </w:p>
     <w:p>
       <w:pPr>
@@ -2218,6 +2940,89 @@
           <w:lang w:val="pt-BR"/>
         </w:rPr>
       </w:pPr>
+      <w:r>
+        <w:rPr>
+          <w:w w:val="90"/>
+          <w:lang w:val="pt-BR"/>
+        </w:rPr>
+        <w:t>O</w:t>
+      </w:r>
+      <w:r>
+        <w:rPr>
+          <w:w w:val="90"/>
+          <w:lang w:val="pt-BR"/>
+        </w:rPr>
+        <w:t>UTPUT</w:t>
+      </w:r>
+      <w:r>
+        <w:rPr>
+          <w:w w:val="90"/>
+          <w:lang w:val="pt-BR"/>
+        </w:rPr>
+        <w:t xml:space="preserve"> Files </w:t>
+      </w:r>
+      <w:proofErr w:type="spellStart"/>
+      <w:r>
+        <w:rPr>
+          <w:w w:val="90"/>
+          <w:lang w:val="pt-BR"/>
+        </w:rPr>
+        <w:t>on</w:t>
+      </w:r>
+      <w:proofErr w:type="spellEnd"/>
+      <w:r>
+        <w:rPr>
+          <w:w w:val="90"/>
+          <w:lang w:val="pt-BR"/>
+        </w:rPr>
+        <w:t xml:space="preserve"> </w:t>
+      </w:r>
+      <w:r>
+        <w:rPr>
+          <w:w w:val="90"/>
+          <w:lang w:val="pt-BR"/>
+        </w:rPr>
+        <w:t>/</w:t>
+      </w:r>
+      <w:proofErr w:type="spellStart"/>
+      <w:r>
+        <w:rPr>
+          <w:w w:val="90"/>
+          <w:lang w:val="pt-BR"/>
+        </w:rPr>
+        <w:t>Data_Analysis</w:t>
+      </w:r>
+      <w:proofErr w:type="spellEnd"/>
+      <w:r>
+        <w:rPr>
+          <w:w w:val="90"/>
+          <w:lang w:val="pt-BR"/>
+        </w:rPr>
+        <w:t>/</w:t>
+      </w:r>
+      <w:r>
+        <w:rPr>
+          <w:w w:val="90"/>
+          <w:lang w:val="pt-BR"/>
+        </w:rPr>
+        <w:t xml:space="preserve"> </w:t>
+      </w:r>
+      <w:proofErr w:type="spellStart"/>
+      <w:r>
+        <w:rPr>
+          <w:w w:val="90"/>
+          <w:lang w:val="pt-BR"/>
+        </w:rPr>
+        <w:t>directory</w:t>
+      </w:r>
+      <w:proofErr w:type="spellEnd"/>
+      <w:r>
+        <w:rPr>
+          <w:w w:val="90"/>
+          <w:lang w:val="pt-BR"/>
+        </w:rPr>
+        <w:t>:</w:t>
+      </w:r>
     </w:p>
     <w:p>
       <w:pPr>
@@ -2229,986 +3034,41 @@
           <w:lang w:val="pt-BR"/>
         </w:rPr>
       </w:pPr>
+    </w:p>
+    <w:p>
+      <w:pPr>
+        <w:pStyle w:val="Heading3"/>
+        <w:rPr>
+          <w:b w:val="0"/>
+          <w:bCs w:val="0"/>
+          <w:w w:val="90"/>
+          <w:lang w:val="pt-BR"/>
+        </w:rPr>
+      </w:pPr>
+    </w:p>
+    <w:p>
+      <w:pPr>
+        <w:pStyle w:val="Heading3"/>
+        <w:rPr>
+          <w:w w:val="90"/>
+          <w:lang w:val="pt-BR"/>
+        </w:rPr>
+      </w:pPr>
       <w:proofErr w:type="gramStart"/>
       <w:r>
         <w:rPr>
-          <w:b w:val="0"/>
-          <w:bCs w:val="0"/>
-          <w:w w:val="90"/>
-          <w:lang w:val="pt-BR"/>
-        </w:rPr>
-        <w:t xml:space="preserve">  </w:t>
-      </w:r>
-      <w:proofErr w:type="spellStart"/>
-      <w:r>
-        <w:rPr>
-          <w:b w:val="0"/>
-          <w:bCs w:val="0"/>
-          <w:w w:val="90"/>
-          <w:lang w:val="pt-BR"/>
-        </w:rPr>
-        <w:t>Loads</w:t>
-      </w:r>
-      <w:proofErr w:type="spellEnd"/>
+          <w:w w:val="90"/>
+          <w:lang w:val="pt-BR"/>
+        </w:rPr>
+        <w:t>  Input</w:t>
+      </w:r>
       <w:proofErr w:type="gramEnd"/>
       <w:r>
         <w:rPr>
-          <w:b w:val="0"/>
-          <w:bCs w:val="0"/>
-          <w:w w:val="90"/>
-          <w:lang w:val="pt-BR"/>
-        </w:rPr>
-        <w:t xml:space="preserve"> </w:t>
-      </w:r>
-      <w:r>
-        <w:rPr>
-          <w:b w:val="0"/>
-          <w:bCs w:val="0"/>
-          <w:w w:val="90"/>
-          <w:lang w:val="pt-BR"/>
-        </w:rPr>
-        <w:t xml:space="preserve">SUS </w:t>
-      </w:r>
-      <w:proofErr w:type="spellStart"/>
-      <w:r>
-        <w:rPr>
-          <w:b w:val="0"/>
-          <w:bCs w:val="0"/>
-          <w:w w:val="90"/>
-          <w:lang w:val="pt-BR"/>
-        </w:rPr>
-        <w:t>and</w:t>
-      </w:r>
-      <w:proofErr w:type="spellEnd"/>
-      <w:r>
-        <w:rPr>
-          <w:b w:val="0"/>
-          <w:bCs w:val="0"/>
-          <w:w w:val="90"/>
-          <w:lang w:val="pt-BR"/>
-        </w:rPr>
-        <w:t xml:space="preserve"> UEQ-S </w:t>
-      </w:r>
-      <w:r>
-        <w:rPr>
-          <w:b w:val="0"/>
-          <w:bCs w:val="0"/>
-          <w:w w:val="90"/>
-          <w:lang w:val="pt-BR"/>
-        </w:rPr>
-        <w:t xml:space="preserve">responses </w:t>
-      </w:r>
-      <w:proofErr w:type="spellStart"/>
-      <w:r>
-        <w:rPr>
-          <w:b w:val="0"/>
-          <w:bCs w:val="0"/>
-          <w:w w:val="90"/>
-          <w:lang w:val="pt-BR"/>
-        </w:rPr>
-        <w:t>from</w:t>
-      </w:r>
-      <w:proofErr w:type="spellEnd"/>
-      <w:r>
-        <w:rPr>
-          <w:b w:val="0"/>
-          <w:bCs w:val="0"/>
-          <w:w w:val="90"/>
-          <w:lang w:val="pt-BR"/>
-        </w:rPr>
-        <w:t xml:space="preserve"> CSV files, </w:t>
-      </w:r>
-      <w:proofErr w:type="spellStart"/>
-      <w:r>
-        <w:rPr>
-          <w:b w:val="0"/>
-          <w:bCs w:val="0"/>
-          <w:w w:val="90"/>
-          <w:lang w:val="pt-BR"/>
-        </w:rPr>
-        <w:t>standardizes</w:t>
-      </w:r>
-      <w:proofErr w:type="spellEnd"/>
-      <w:r>
-        <w:rPr>
-          <w:b w:val="0"/>
-          <w:bCs w:val="0"/>
-          <w:w w:val="90"/>
-          <w:lang w:val="pt-BR"/>
-        </w:rPr>
-        <w:t xml:space="preserve"> </w:t>
-      </w:r>
-      <w:proofErr w:type="spellStart"/>
-      <w:r>
-        <w:rPr>
-          <w:b w:val="0"/>
-          <w:bCs w:val="0"/>
-          <w:w w:val="90"/>
-          <w:lang w:val="pt-BR"/>
-        </w:rPr>
-        <w:t>column</w:t>
-      </w:r>
-      <w:proofErr w:type="spellEnd"/>
-      <w:r>
-        <w:rPr>
-          <w:b w:val="0"/>
-          <w:bCs w:val="0"/>
-          <w:w w:val="90"/>
-          <w:lang w:val="pt-BR"/>
-        </w:rPr>
-        <w:t xml:space="preserve"> </w:t>
-      </w:r>
-      <w:proofErr w:type="spellStart"/>
-      <w:r>
-        <w:rPr>
-          <w:b w:val="0"/>
-          <w:bCs w:val="0"/>
-          <w:w w:val="90"/>
-          <w:lang w:val="pt-BR"/>
-        </w:rPr>
-        <w:t>names</w:t>
-      </w:r>
-      <w:proofErr w:type="spellEnd"/>
-      <w:r>
-        <w:rPr>
-          <w:b w:val="0"/>
-          <w:bCs w:val="0"/>
-          <w:w w:val="90"/>
-          <w:lang w:val="pt-BR"/>
-        </w:rPr>
-        <w:t xml:space="preserve">, </w:t>
-      </w:r>
-      <w:proofErr w:type="spellStart"/>
-      <w:r>
-        <w:rPr>
-          <w:b w:val="0"/>
-          <w:bCs w:val="0"/>
-          <w:w w:val="90"/>
-          <w:lang w:val="pt-BR"/>
-        </w:rPr>
-        <w:t>and</w:t>
-      </w:r>
-      <w:proofErr w:type="spellEnd"/>
-      <w:r>
-        <w:rPr>
-          <w:b w:val="0"/>
-          <w:bCs w:val="0"/>
-          <w:w w:val="90"/>
-          <w:lang w:val="pt-BR"/>
-        </w:rPr>
-        <w:t xml:space="preserve"> </w:t>
-      </w:r>
-      <w:proofErr w:type="spellStart"/>
-      <w:r>
-        <w:rPr>
-          <w:b w:val="0"/>
-          <w:bCs w:val="0"/>
-          <w:w w:val="90"/>
-          <w:lang w:val="pt-BR"/>
-        </w:rPr>
-        <w:t>applies</w:t>
-      </w:r>
-      <w:proofErr w:type="spellEnd"/>
-      <w:r>
-        <w:rPr>
-          <w:b w:val="0"/>
-          <w:bCs w:val="0"/>
-          <w:w w:val="90"/>
-          <w:lang w:val="pt-BR"/>
-        </w:rPr>
-        <w:t xml:space="preserve"> reverse </w:t>
-      </w:r>
-      <w:proofErr w:type="spellStart"/>
-      <w:r>
-        <w:rPr>
-          <w:b w:val="0"/>
-          <w:bCs w:val="0"/>
-          <w:w w:val="90"/>
-          <w:lang w:val="pt-BR"/>
-        </w:rPr>
-        <w:t>scoring</w:t>
-      </w:r>
-      <w:proofErr w:type="spellEnd"/>
-      <w:r>
-        <w:rPr>
-          <w:b w:val="0"/>
-          <w:bCs w:val="0"/>
-          <w:w w:val="90"/>
-          <w:lang w:val="pt-BR"/>
-        </w:rPr>
-        <w:t xml:space="preserve"> </w:t>
-      </w:r>
-      <w:proofErr w:type="spellStart"/>
-      <w:r>
-        <w:rPr>
-          <w:b w:val="0"/>
-          <w:bCs w:val="0"/>
-          <w:w w:val="90"/>
-          <w:lang w:val="pt-BR"/>
-        </w:rPr>
-        <w:t>to</w:t>
-      </w:r>
-      <w:proofErr w:type="spellEnd"/>
-      <w:r>
-        <w:rPr>
-          <w:b w:val="0"/>
-          <w:bCs w:val="0"/>
-          <w:w w:val="90"/>
-          <w:lang w:val="pt-BR"/>
-        </w:rPr>
-        <w:t xml:space="preserve"> negative SUS </w:t>
-      </w:r>
-      <w:proofErr w:type="spellStart"/>
-      <w:r>
-        <w:rPr>
-          <w:b w:val="0"/>
-          <w:bCs w:val="0"/>
-          <w:w w:val="90"/>
-          <w:lang w:val="pt-BR"/>
-        </w:rPr>
-        <w:t>items</w:t>
-      </w:r>
-      <w:proofErr w:type="spellEnd"/>
-      <w:r>
-        <w:rPr>
-          <w:b w:val="0"/>
-          <w:bCs w:val="0"/>
-          <w:w w:val="90"/>
-          <w:lang w:val="pt-BR"/>
-        </w:rPr>
-        <w:t>.</w:t>
-      </w:r>
-      <w:r>
-        <w:rPr>
-          <w:b w:val="0"/>
-          <w:bCs w:val="0"/>
-          <w:w w:val="90"/>
-          <w:lang w:val="pt-BR"/>
-        </w:rPr>
-        <w:t xml:space="preserve"> </w:t>
-      </w:r>
-      <w:proofErr w:type="spellStart"/>
-      <w:r>
-        <w:rPr>
-          <w:b w:val="0"/>
-          <w:bCs w:val="0"/>
-          <w:w w:val="90"/>
-          <w:lang w:val="pt-BR"/>
-        </w:rPr>
-        <w:t>Calculates</w:t>
-      </w:r>
-      <w:proofErr w:type="spellEnd"/>
-      <w:r>
-        <w:rPr>
-          <w:b w:val="0"/>
-          <w:bCs w:val="0"/>
-          <w:w w:val="90"/>
-          <w:lang w:val="pt-BR"/>
-        </w:rPr>
-        <w:t xml:space="preserve"> </w:t>
-      </w:r>
-      <w:proofErr w:type="spellStart"/>
-      <w:r>
-        <w:rPr>
-          <w:b w:val="0"/>
-          <w:bCs w:val="0"/>
-          <w:w w:val="90"/>
-          <w:lang w:val="pt-BR"/>
-        </w:rPr>
-        <w:t>reliability</w:t>
-      </w:r>
-      <w:proofErr w:type="spellEnd"/>
-      <w:r>
-        <w:rPr>
-          <w:b w:val="0"/>
-          <w:bCs w:val="0"/>
-          <w:w w:val="90"/>
-          <w:lang w:val="pt-BR"/>
-        </w:rPr>
-        <w:t xml:space="preserve"> </w:t>
-      </w:r>
-      <w:proofErr w:type="spellStart"/>
-      <w:r>
-        <w:rPr>
-          <w:b w:val="0"/>
-          <w:bCs w:val="0"/>
-          <w:w w:val="90"/>
-          <w:lang w:val="pt-BR"/>
-        </w:rPr>
-        <w:t>metrics</w:t>
-      </w:r>
-      <w:proofErr w:type="spellEnd"/>
-      <w:r>
-        <w:rPr>
-          <w:b w:val="0"/>
-          <w:bCs w:val="0"/>
-          <w:w w:val="90"/>
-          <w:lang w:val="pt-BR"/>
-        </w:rPr>
-        <w:t>:</w:t>
-      </w:r>
-    </w:p>
-    <w:p>
-      <w:pPr>
-        <w:pStyle w:val="Heading3"/>
-        <w:numPr>
-          <w:ilvl w:val="0"/>
-          <w:numId w:val="2"/>
-        </w:numPr>
-        <w:rPr>
-          <w:b w:val="0"/>
-          <w:bCs w:val="0"/>
-          <w:w w:val="90"/>
-          <w:lang w:val="pt-BR"/>
-        </w:rPr>
-      </w:pPr>
-      <w:proofErr w:type="spellStart"/>
-      <w:r>
-        <w:rPr>
-          <w:b w:val="0"/>
-          <w:bCs w:val="0"/>
-          <w:w w:val="90"/>
-          <w:lang w:val="pt-BR"/>
-        </w:rPr>
-        <w:t>Cronbach's</w:t>
-      </w:r>
-      <w:proofErr w:type="spellEnd"/>
-      <w:r>
-        <w:rPr>
-          <w:b w:val="0"/>
-          <w:bCs w:val="0"/>
-          <w:w w:val="90"/>
-          <w:lang w:val="pt-BR"/>
-        </w:rPr>
-        <w:t xml:space="preserve"> alpha (</w:t>
-      </w:r>
-      <w:proofErr w:type="spellStart"/>
-      <w:r>
-        <w:rPr>
-          <w:b w:val="0"/>
-          <w:bCs w:val="0"/>
-          <w:w w:val="90"/>
-          <w:lang w:val="pt-BR"/>
-        </w:rPr>
-        <w:t>raw</w:t>
-      </w:r>
-      <w:proofErr w:type="spellEnd"/>
-      <w:r>
-        <w:rPr>
-          <w:b w:val="0"/>
-          <w:bCs w:val="0"/>
-          <w:w w:val="90"/>
-          <w:lang w:val="pt-BR"/>
-        </w:rPr>
-        <w:t xml:space="preserve"> </w:t>
-      </w:r>
-      <w:proofErr w:type="spellStart"/>
-      <w:r>
-        <w:rPr>
-          <w:b w:val="0"/>
-          <w:bCs w:val="0"/>
-          <w:w w:val="90"/>
-          <w:lang w:val="pt-BR"/>
-        </w:rPr>
-        <w:t>and</w:t>
-      </w:r>
-      <w:proofErr w:type="spellEnd"/>
-      <w:r>
-        <w:rPr>
-          <w:b w:val="0"/>
-          <w:bCs w:val="0"/>
-          <w:w w:val="90"/>
-          <w:lang w:val="pt-BR"/>
-        </w:rPr>
-        <w:t xml:space="preserve"> </w:t>
-      </w:r>
-      <w:proofErr w:type="spellStart"/>
-      <w:r>
-        <w:rPr>
-          <w:b w:val="0"/>
-          <w:bCs w:val="0"/>
-          <w:w w:val="90"/>
-          <w:lang w:val="pt-BR"/>
-        </w:rPr>
-        <w:t>standardized</w:t>
-      </w:r>
-      <w:proofErr w:type="spellEnd"/>
-      <w:r>
-        <w:rPr>
-          <w:b w:val="0"/>
-          <w:bCs w:val="0"/>
-          <w:w w:val="90"/>
-          <w:lang w:val="pt-BR"/>
-        </w:rPr>
-        <w:t xml:space="preserve">). </w:t>
-      </w:r>
-    </w:p>
-    <w:p>
-      <w:pPr>
-        <w:pStyle w:val="Heading3"/>
-        <w:numPr>
-          <w:ilvl w:val="0"/>
-          <w:numId w:val="2"/>
-        </w:numPr>
-        <w:rPr>
-          <w:b w:val="0"/>
-          <w:bCs w:val="0"/>
-          <w:w w:val="90"/>
-          <w:lang w:val="pt-BR"/>
-        </w:rPr>
-      </w:pPr>
-      <w:r>
-        <w:rPr>
-          <w:b w:val="0"/>
-          <w:bCs w:val="0"/>
-          <w:w w:val="90"/>
-          <w:lang w:val="pt-BR"/>
-        </w:rPr>
-        <w:t xml:space="preserve">McDonald's </w:t>
-      </w:r>
-      <w:proofErr w:type="spellStart"/>
-      <w:r>
-        <w:rPr>
-          <w:b w:val="0"/>
-          <w:bCs w:val="0"/>
-          <w:w w:val="90"/>
-          <w:lang w:val="pt-BR"/>
-        </w:rPr>
-        <w:t>omega</w:t>
-      </w:r>
-      <w:proofErr w:type="spellEnd"/>
-      <w:r>
-        <w:rPr>
-          <w:b w:val="0"/>
-          <w:bCs w:val="0"/>
-          <w:w w:val="90"/>
-          <w:lang w:val="pt-BR"/>
-        </w:rPr>
-        <w:t xml:space="preserve"> (</w:t>
-      </w:r>
-      <w:proofErr w:type="spellStart"/>
-      <w:r>
-        <w:rPr>
-          <w:b w:val="0"/>
-          <w:bCs w:val="0"/>
-          <w:w w:val="90"/>
-          <w:lang w:val="pt-BR"/>
-        </w:rPr>
-        <w:t>ω_total</w:t>
-      </w:r>
-      <w:proofErr w:type="spellEnd"/>
-      <w:r>
-        <w:rPr>
-          <w:b w:val="0"/>
-          <w:bCs w:val="0"/>
-          <w:w w:val="90"/>
-          <w:lang w:val="pt-BR"/>
-        </w:rPr>
-        <w:t xml:space="preserve">). </w:t>
-      </w:r>
-    </w:p>
-    <w:p>
-      <w:pPr>
-        <w:pStyle w:val="Heading3"/>
-        <w:numPr>
-          <w:ilvl w:val="0"/>
-          <w:numId w:val="2"/>
-        </w:numPr>
-        <w:rPr>
-          <w:b w:val="0"/>
-          <w:bCs w:val="0"/>
-          <w:w w:val="90"/>
-          <w:lang w:val="pt-BR"/>
-        </w:rPr>
-      </w:pPr>
-      <w:r>
-        <w:rPr>
-          <w:b w:val="0"/>
-          <w:bCs w:val="0"/>
-          <w:w w:val="90"/>
-          <w:lang w:val="pt-BR"/>
-        </w:rPr>
-        <w:t xml:space="preserve">SUS </w:t>
-      </w:r>
-      <w:proofErr w:type="spellStart"/>
-      <w:r>
-        <w:rPr>
-          <w:b w:val="0"/>
-          <w:bCs w:val="0"/>
-          <w:w w:val="90"/>
-          <w:lang w:val="pt-BR"/>
-        </w:rPr>
-        <w:t>scale</w:t>
-      </w:r>
-      <w:proofErr w:type="spellEnd"/>
-      <w:r>
-        <w:rPr>
-          <w:b w:val="0"/>
-          <w:bCs w:val="0"/>
-          <w:w w:val="90"/>
-          <w:lang w:val="pt-BR"/>
-        </w:rPr>
-        <w:t xml:space="preserve"> (unidimensional),</w:t>
-      </w:r>
-    </w:p>
-    <w:p>
-      <w:pPr>
-        <w:pStyle w:val="Heading3"/>
-        <w:numPr>
-          <w:ilvl w:val="0"/>
-          <w:numId w:val="2"/>
-        </w:numPr>
-        <w:rPr>
-          <w:b w:val="0"/>
-          <w:bCs w:val="0"/>
-          <w:w w:val="90"/>
-          <w:lang w:val="pt-BR"/>
-        </w:rPr>
-      </w:pPr>
-      <w:r>
-        <w:rPr>
-          <w:b w:val="0"/>
-          <w:bCs w:val="0"/>
-          <w:w w:val="90"/>
-          <w:lang w:val="pt-BR"/>
-        </w:rPr>
-        <w:t xml:space="preserve">UEQ-S </w:t>
-      </w:r>
-      <w:proofErr w:type="spellStart"/>
-      <w:r>
-        <w:rPr>
-          <w:b w:val="0"/>
-          <w:bCs w:val="0"/>
-          <w:w w:val="90"/>
-          <w:lang w:val="pt-BR"/>
-        </w:rPr>
-        <w:t>dimensions</w:t>
-      </w:r>
-      <w:proofErr w:type="spellEnd"/>
-      <w:r>
-        <w:rPr>
-          <w:b w:val="0"/>
-          <w:bCs w:val="0"/>
-          <w:w w:val="90"/>
-          <w:lang w:val="pt-BR"/>
-        </w:rPr>
-        <w:t xml:space="preserve"> (</w:t>
-      </w:r>
-      <w:proofErr w:type="spellStart"/>
-      <w:r>
-        <w:rPr>
-          <w:b w:val="0"/>
-          <w:bCs w:val="0"/>
-          <w:w w:val="90"/>
-          <w:lang w:val="pt-BR"/>
-        </w:rPr>
-        <w:t>Pragmatic</w:t>
-      </w:r>
-      <w:proofErr w:type="spellEnd"/>
-      <w:r>
-        <w:rPr>
-          <w:b w:val="0"/>
-          <w:bCs w:val="0"/>
-          <w:w w:val="90"/>
-          <w:lang w:val="pt-BR"/>
-        </w:rPr>
-        <w:t xml:space="preserve"> </w:t>
-      </w:r>
-      <w:proofErr w:type="spellStart"/>
-      <w:r>
-        <w:rPr>
-          <w:b w:val="0"/>
-          <w:bCs w:val="0"/>
-          <w:w w:val="90"/>
-          <w:lang w:val="pt-BR"/>
-        </w:rPr>
-        <w:t>Quality</w:t>
-      </w:r>
-      <w:proofErr w:type="spellEnd"/>
-      <w:r>
-        <w:rPr>
-          <w:b w:val="0"/>
-          <w:bCs w:val="0"/>
-          <w:w w:val="90"/>
-          <w:lang w:val="pt-BR"/>
-        </w:rPr>
-        <w:t xml:space="preserve"> </w:t>
-      </w:r>
-      <w:proofErr w:type="spellStart"/>
-      <w:r>
-        <w:rPr>
-          <w:b w:val="0"/>
-          <w:bCs w:val="0"/>
-          <w:w w:val="90"/>
-          <w:lang w:val="pt-BR"/>
-        </w:rPr>
-        <w:t>and</w:t>
-      </w:r>
-      <w:proofErr w:type="spellEnd"/>
-      <w:r>
-        <w:rPr>
-          <w:b w:val="0"/>
-          <w:bCs w:val="0"/>
-          <w:w w:val="90"/>
-          <w:lang w:val="pt-BR"/>
-        </w:rPr>
-        <w:t xml:space="preserve"> </w:t>
-      </w:r>
-      <w:proofErr w:type="spellStart"/>
-      <w:r>
-        <w:rPr>
-          <w:b w:val="0"/>
-          <w:bCs w:val="0"/>
-          <w:w w:val="90"/>
-          <w:lang w:val="pt-BR"/>
-        </w:rPr>
-        <w:t>Hedonic</w:t>
-      </w:r>
-      <w:proofErr w:type="spellEnd"/>
-      <w:r>
-        <w:rPr>
-          <w:b w:val="0"/>
-          <w:bCs w:val="0"/>
-          <w:w w:val="90"/>
-          <w:lang w:val="pt-BR"/>
-        </w:rPr>
-        <w:t xml:space="preserve"> </w:t>
-      </w:r>
-      <w:proofErr w:type="spellStart"/>
-      <w:r>
-        <w:rPr>
-          <w:b w:val="0"/>
-          <w:bCs w:val="0"/>
-          <w:w w:val="90"/>
-          <w:lang w:val="pt-BR"/>
-        </w:rPr>
-        <w:t>Quality</w:t>
-      </w:r>
-      <w:proofErr w:type="spellEnd"/>
-      <w:r>
-        <w:rPr>
-          <w:b w:val="0"/>
-          <w:bCs w:val="0"/>
-          <w:w w:val="90"/>
-          <w:lang w:val="pt-BR"/>
-        </w:rPr>
-        <w:t xml:space="preserve">), </w:t>
-      </w:r>
-      <w:proofErr w:type="spellStart"/>
-      <w:r>
-        <w:rPr>
-          <w:b w:val="0"/>
-          <w:bCs w:val="0"/>
-          <w:w w:val="90"/>
-          <w:lang w:val="pt-BR"/>
-        </w:rPr>
-        <w:t>and</w:t>
-      </w:r>
-      <w:proofErr w:type="spellEnd"/>
-      <w:r>
-        <w:rPr>
-          <w:b w:val="0"/>
-          <w:bCs w:val="0"/>
-          <w:w w:val="90"/>
-          <w:lang w:val="pt-BR"/>
-        </w:rPr>
-        <w:t xml:space="preserve"> </w:t>
-      </w:r>
-      <w:proofErr w:type="spellStart"/>
-      <w:r>
-        <w:rPr>
-          <w:b w:val="0"/>
-          <w:bCs w:val="0"/>
-          <w:w w:val="90"/>
-          <w:lang w:val="pt-BR"/>
-        </w:rPr>
-        <w:t>the</w:t>
-      </w:r>
-      <w:proofErr w:type="spellEnd"/>
-      <w:r>
-        <w:rPr>
-          <w:b w:val="0"/>
-          <w:bCs w:val="0"/>
-          <w:w w:val="90"/>
-          <w:lang w:val="pt-BR"/>
-        </w:rPr>
-        <w:t xml:space="preserve"> overall UEQ-S.</w:t>
-      </w:r>
-    </w:p>
-    <w:p>
-      <w:pPr>
-        <w:pStyle w:val="Heading3"/>
-        <w:numPr>
-          <w:ilvl w:val="0"/>
-          <w:numId w:val="2"/>
-        </w:numPr>
-        <w:rPr>
-          <w:b w:val="0"/>
-          <w:bCs w:val="0"/>
-          <w:w w:val="90"/>
-          <w:lang w:val="pt-BR"/>
-        </w:rPr>
-      </w:pPr>
-      <w:r>
-        <w:rPr>
-          <w:b w:val="0"/>
-          <w:bCs w:val="0"/>
-          <w:w w:val="90"/>
-          <w:lang w:val="pt-BR"/>
-        </w:rPr>
-        <w:t>T</w:t>
-      </w:r>
-      <w:r>
-        <w:rPr>
-          <w:b w:val="0"/>
-          <w:bCs w:val="0"/>
-          <w:w w:val="90"/>
-          <w:lang w:val="pt-BR"/>
-        </w:rPr>
-        <w:t xml:space="preserve">he </w:t>
-      </w:r>
-      <w:proofErr w:type="spellStart"/>
-      <w:r>
-        <w:rPr>
-          <w:b w:val="0"/>
-          <w:bCs w:val="0"/>
-          <w:w w:val="90"/>
-          <w:lang w:val="pt-BR"/>
-        </w:rPr>
-        <w:t>impact</w:t>
-      </w:r>
-      <w:proofErr w:type="spellEnd"/>
-      <w:r>
-        <w:rPr>
-          <w:b w:val="0"/>
-          <w:bCs w:val="0"/>
-          <w:w w:val="90"/>
-          <w:lang w:val="pt-BR"/>
-        </w:rPr>
-        <w:t xml:space="preserve"> </w:t>
-      </w:r>
-      <w:proofErr w:type="spellStart"/>
-      <w:r>
-        <w:rPr>
-          <w:b w:val="0"/>
-          <w:bCs w:val="0"/>
-          <w:w w:val="90"/>
-          <w:lang w:val="pt-BR"/>
-        </w:rPr>
-        <w:t>on</w:t>
-      </w:r>
-      <w:proofErr w:type="spellEnd"/>
-      <w:r>
-        <w:rPr>
-          <w:b w:val="0"/>
-          <w:bCs w:val="0"/>
-          <w:w w:val="90"/>
-          <w:lang w:val="pt-BR"/>
-        </w:rPr>
-        <w:t xml:space="preserve"> </w:t>
-      </w:r>
-      <w:proofErr w:type="spellStart"/>
-      <w:r>
-        <w:rPr>
-          <w:b w:val="0"/>
-          <w:bCs w:val="0"/>
-          <w:w w:val="90"/>
-          <w:lang w:val="pt-BR"/>
-        </w:rPr>
-        <w:t>reliability</w:t>
-      </w:r>
-      <w:proofErr w:type="spellEnd"/>
-      <w:r>
-        <w:rPr>
-          <w:b w:val="0"/>
-          <w:bCs w:val="0"/>
-          <w:w w:val="90"/>
-          <w:lang w:val="pt-BR"/>
-        </w:rPr>
-        <w:t xml:space="preserve"> </w:t>
-      </w:r>
-      <w:proofErr w:type="spellStart"/>
-      <w:r>
-        <w:rPr>
-          <w:b w:val="0"/>
-          <w:bCs w:val="0"/>
-          <w:w w:val="90"/>
-          <w:lang w:val="pt-BR"/>
-        </w:rPr>
-        <w:t>if</w:t>
-      </w:r>
-      <w:proofErr w:type="spellEnd"/>
-      <w:r>
-        <w:rPr>
-          <w:b w:val="0"/>
-          <w:bCs w:val="0"/>
-          <w:w w:val="90"/>
-          <w:lang w:val="pt-BR"/>
-        </w:rPr>
-        <w:t xml:space="preserve"> </w:t>
-      </w:r>
-      <w:proofErr w:type="spellStart"/>
-      <w:r>
-        <w:rPr>
-          <w:b w:val="0"/>
-          <w:bCs w:val="0"/>
-          <w:w w:val="90"/>
-          <w:lang w:val="pt-BR"/>
-        </w:rPr>
-        <w:t>each</w:t>
-      </w:r>
-      <w:proofErr w:type="spellEnd"/>
-      <w:r>
-        <w:rPr>
-          <w:b w:val="0"/>
-          <w:bCs w:val="0"/>
-          <w:w w:val="90"/>
-          <w:lang w:val="pt-BR"/>
-        </w:rPr>
-        <w:t xml:space="preserve"> item </w:t>
-      </w:r>
-      <w:proofErr w:type="spellStart"/>
-      <w:r>
-        <w:rPr>
-          <w:b w:val="0"/>
-          <w:bCs w:val="0"/>
-          <w:w w:val="90"/>
-          <w:lang w:val="pt-BR"/>
-        </w:rPr>
-        <w:t>is</w:t>
-      </w:r>
-      <w:proofErr w:type="spellEnd"/>
-      <w:r>
-        <w:rPr>
-          <w:b w:val="0"/>
-          <w:bCs w:val="0"/>
-          <w:w w:val="90"/>
-          <w:lang w:val="pt-BR"/>
-        </w:rPr>
-        <w:t xml:space="preserve"> </w:t>
-      </w:r>
-      <w:proofErr w:type="spellStart"/>
-      <w:r>
-        <w:rPr>
-          <w:b w:val="0"/>
-          <w:bCs w:val="0"/>
-          <w:w w:val="90"/>
-          <w:lang w:val="pt-BR"/>
-        </w:rPr>
-        <w:t>removed</w:t>
-      </w:r>
-      <w:proofErr w:type="spellEnd"/>
-      <w:r>
-        <w:rPr>
-          <w:b w:val="0"/>
-          <w:bCs w:val="0"/>
-          <w:w w:val="90"/>
-          <w:lang w:val="pt-BR"/>
-        </w:rPr>
-        <w:t xml:space="preserve"> (alpha </w:t>
-      </w:r>
-      <w:proofErr w:type="spellStart"/>
-      <w:r>
-        <w:rPr>
-          <w:b w:val="0"/>
-          <w:bCs w:val="0"/>
-          <w:w w:val="90"/>
-          <w:lang w:val="pt-BR"/>
-        </w:rPr>
-        <w:t>if</w:t>
-      </w:r>
-      <w:proofErr w:type="spellEnd"/>
-      <w:r>
-        <w:rPr>
-          <w:b w:val="0"/>
-          <w:bCs w:val="0"/>
-          <w:w w:val="90"/>
-          <w:lang w:val="pt-BR"/>
-        </w:rPr>
-        <w:t xml:space="preserve"> </w:t>
-      </w:r>
-      <w:proofErr w:type="spellStart"/>
-      <w:r>
-        <w:rPr>
-          <w:b w:val="0"/>
-          <w:bCs w:val="0"/>
-          <w:w w:val="90"/>
-          <w:lang w:val="pt-BR"/>
-        </w:rPr>
-        <w:t>dropped</w:t>
-      </w:r>
-      <w:proofErr w:type="spellEnd"/>
-      <w:r>
-        <w:rPr>
-          <w:b w:val="0"/>
-          <w:bCs w:val="0"/>
-          <w:w w:val="90"/>
-          <w:lang w:val="pt-BR"/>
-        </w:rPr>
-        <w:t>).</w:t>
-      </w:r>
-    </w:p>
-    <w:p>
-      <w:pPr>
-        <w:pStyle w:val="Heading3"/>
-        <w:ind w:left="0" w:firstLine="0"/>
-        <w:rPr>
-          <w:w w:val="90"/>
-          <w:lang w:val="pt-BR"/>
-        </w:rPr>
-      </w:pPr>
-    </w:p>
-    <w:p>
-      <w:pPr>
-        <w:pStyle w:val="Heading3"/>
-        <w:ind w:left="0" w:firstLine="0"/>
-        <w:rPr>
-          <w:w w:val="90"/>
-          <w:lang w:val="pt-BR"/>
-        </w:rPr>
-      </w:pPr>
-    </w:p>
-    <w:p>
-      <w:pPr>
-        <w:pStyle w:val="Heading3"/>
-        <w:ind w:left="0" w:firstLine="0"/>
-        <w:rPr>
-          <w:rFonts w:ascii="Arial" w:hAnsi="Arial" w:cs="Arial"/>
-          <w:spacing w:val="-2"/>
-          <w:w w:val="90"/>
-          <w:lang w:val="pt-BR"/>
-        </w:rPr>
-      </w:pPr>
-      <w:r>
-        <w:rPr>
-          <w:w w:val="90"/>
-          <w:lang w:val="pt-BR"/>
-        </w:rPr>
-        <w:t xml:space="preserve">INPUT file </w:t>
-      </w:r>
-      <w:proofErr w:type="spellStart"/>
-      <w:r>
-        <w:rPr>
-          <w:w w:val="90"/>
-          <w:lang w:val="pt-BR"/>
-        </w:rPr>
-        <w:t>on</w:t>
-      </w:r>
-      <w:proofErr w:type="spellEnd"/>
-      <w:r>
-        <w:t xml:space="preserve"> </w:t>
-      </w:r>
-      <w:r>
-        <w:t>/</w:t>
-      </w:r>
-      <w:r>
-        <w:t>Data</w:t>
-      </w:r>
-      <w:r>
-        <w:t>/</w:t>
-      </w:r>
-      <w:r>
-        <w:t xml:space="preserve"> directory</w:t>
+          <w:w w:val="90"/>
+          <w:lang w:val="pt-BR"/>
+        </w:rPr>
+        <w:t xml:space="preserve"> File:</w:t>
       </w:r>
     </w:p>
     <w:p>
@@ -3219,237 +3079,30 @@
         <w:spacing w:before="216" w:line="304" w:lineRule="auto"/>
         <w:ind w:left="511" w:right="106"/>
         <w:jc w:val="both"/>
-        <w:rPr>
-          <w:rFonts w:ascii="Arial" w:hAnsi="Arial" w:cs="Arial"/>
-          <w:spacing w:val="-2"/>
-          <w:w w:val="90"/>
-          <w:lang w:val="pt-BR"/>
-        </w:rPr>
-      </w:pPr>
-      <w:proofErr w:type="spellStart"/>
-      <w:r>
-        <w:t>ueqs_ratings</w:t>
-      </w:r>
-      <w:proofErr w:type="spellEnd"/>
-      <w:r>
-        <w:t xml:space="preserve"> and </w:t>
-      </w:r>
-      <w:proofErr w:type="spellStart"/>
-      <w:r>
-        <w:t>sus_ratings</w:t>
-      </w:r>
-      <w:proofErr w:type="spellEnd"/>
-      <w:r>
-        <w:t xml:space="preserve"> </w:t>
-      </w:r>
-      <w:r>
-        <w:rPr>
-          <w:rFonts w:ascii="Arial" w:hAnsi="Arial" w:cs="Arial"/>
-          <w:spacing w:val="-2"/>
-          <w:w w:val="90"/>
-          <w:lang w:val="pt-BR"/>
-        </w:rPr>
-        <w:t xml:space="preserve">- </w:t>
-      </w:r>
-      <w:proofErr w:type="spellStart"/>
-      <w:r>
-        <w:rPr>
-          <w:rFonts w:ascii="Arial" w:hAnsi="Arial" w:cs="Arial"/>
-          <w:spacing w:val="-2"/>
-          <w:w w:val="90"/>
-          <w:lang w:val="pt-BR"/>
-        </w:rPr>
-        <w:t>Comma-separated</w:t>
-      </w:r>
-      <w:proofErr w:type="spellEnd"/>
-      <w:r>
-        <w:rPr>
-          <w:rFonts w:ascii="Arial" w:hAnsi="Arial" w:cs="Arial"/>
-          <w:spacing w:val="-2"/>
-          <w:w w:val="90"/>
-          <w:lang w:val="pt-BR"/>
-        </w:rPr>
-        <w:t xml:space="preserve"> files </w:t>
-      </w:r>
-      <w:proofErr w:type="spellStart"/>
-      <w:r>
-        <w:rPr>
-          <w:rFonts w:ascii="Arial" w:hAnsi="Arial" w:cs="Arial"/>
-          <w:spacing w:val="-2"/>
-          <w:w w:val="90"/>
-          <w:lang w:val="pt-BR"/>
-        </w:rPr>
-        <w:t>consisting</w:t>
-      </w:r>
-      <w:proofErr w:type="spellEnd"/>
-      <w:r>
-        <w:rPr>
-          <w:rFonts w:ascii="Arial" w:hAnsi="Arial" w:cs="Arial"/>
-          <w:spacing w:val="-2"/>
-          <w:w w:val="90"/>
-          <w:lang w:val="pt-BR"/>
-        </w:rPr>
-        <w:t xml:space="preserve"> </w:t>
-      </w:r>
-      <w:proofErr w:type="spellStart"/>
-      <w:r>
-        <w:rPr>
-          <w:rFonts w:ascii="Arial" w:hAnsi="Arial" w:cs="Arial"/>
-          <w:spacing w:val="-2"/>
-          <w:w w:val="90"/>
-          <w:lang w:val="pt-BR"/>
-        </w:rPr>
-        <w:t>of</w:t>
-      </w:r>
-      <w:proofErr w:type="spellEnd"/>
-      <w:r>
-        <w:rPr>
-          <w:rFonts w:ascii="Arial" w:hAnsi="Arial" w:cs="Arial"/>
-          <w:spacing w:val="-2"/>
-          <w:w w:val="90"/>
-          <w:lang w:val="pt-BR"/>
-        </w:rPr>
-        <w:t xml:space="preserve"> responses </w:t>
-      </w:r>
-      <w:proofErr w:type="spellStart"/>
-      <w:r>
-        <w:rPr>
-          <w:rFonts w:ascii="Arial" w:hAnsi="Arial" w:cs="Arial"/>
-          <w:spacing w:val="-2"/>
-          <w:w w:val="90"/>
-          <w:lang w:val="pt-BR"/>
-        </w:rPr>
-        <w:t>to</w:t>
-      </w:r>
-      <w:proofErr w:type="spellEnd"/>
-      <w:r>
-        <w:rPr>
-          <w:rFonts w:ascii="Arial" w:hAnsi="Arial" w:cs="Arial"/>
-          <w:spacing w:val="-2"/>
-          <w:w w:val="90"/>
-          <w:lang w:val="pt-BR"/>
-        </w:rPr>
-        <w:t xml:space="preserve"> </w:t>
-      </w:r>
-      <w:proofErr w:type="spellStart"/>
-      <w:r>
-        <w:rPr>
-          <w:rFonts w:ascii="Arial" w:hAnsi="Arial" w:cs="Arial"/>
-          <w:spacing w:val="-2"/>
-          <w:w w:val="90"/>
-          <w:lang w:val="pt-BR"/>
-        </w:rPr>
-        <w:t>the</w:t>
-      </w:r>
-      <w:proofErr w:type="spellEnd"/>
-      <w:r>
-        <w:rPr>
-          <w:rFonts w:ascii="Arial" w:hAnsi="Arial" w:cs="Arial"/>
-          <w:spacing w:val="-2"/>
-          <w:w w:val="90"/>
-          <w:lang w:val="pt-BR"/>
-        </w:rPr>
-        <w:t xml:space="preserve"> </w:t>
-      </w:r>
-      <w:proofErr w:type="spellStart"/>
-      <w:r>
-        <w:rPr>
-          <w:rFonts w:ascii="Arial" w:hAnsi="Arial" w:cs="Arial"/>
-          <w:spacing w:val="-2"/>
-          <w:w w:val="90"/>
-          <w:lang w:val="pt-BR"/>
-        </w:rPr>
-        <w:t>items</w:t>
-      </w:r>
-      <w:proofErr w:type="spellEnd"/>
-      <w:r>
-        <w:rPr>
-          <w:rFonts w:ascii="Arial" w:hAnsi="Arial" w:cs="Arial"/>
-          <w:spacing w:val="-2"/>
-          <w:w w:val="90"/>
-          <w:lang w:val="pt-BR"/>
-        </w:rPr>
-        <w:t xml:space="preserve"> </w:t>
-      </w:r>
-      <w:proofErr w:type="spellStart"/>
-      <w:r>
-        <w:rPr>
-          <w:rFonts w:ascii="Arial" w:hAnsi="Arial" w:cs="Arial"/>
-          <w:spacing w:val="-2"/>
-          <w:w w:val="90"/>
-          <w:lang w:val="pt-BR"/>
-        </w:rPr>
-        <w:t>of</w:t>
-      </w:r>
-      <w:proofErr w:type="spellEnd"/>
-      <w:r>
-        <w:rPr>
-          <w:rFonts w:ascii="Arial" w:hAnsi="Arial" w:cs="Arial"/>
-          <w:spacing w:val="-2"/>
-          <w:w w:val="90"/>
-          <w:lang w:val="pt-BR"/>
-        </w:rPr>
-        <w:t xml:space="preserve"> </w:t>
-      </w:r>
-      <w:proofErr w:type="spellStart"/>
-      <w:r>
-        <w:rPr>
-          <w:rFonts w:ascii="Arial" w:hAnsi="Arial" w:cs="Arial"/>
-          <w:spacing w:val="-2"/>
-          <w:w w:val="90"/>
-          <w:lang w:val="pt-BR"/>
-        </w:rPr>
-        <w:t>each</w:t>
-      </w:r>
-      <w:proofErr w:type="spellEnd"/>
-      <w:r>
-        <w:rPr>
-          <w:rFonts w:ascii="Arial" w:hAnsi="Arial" w:cs="Arial"/>
-          <w:spacing w:val="-2"/>
-          <w:w w:val="90"/>
-          <w:lang w:val="pt-BR"/>
-        </w:rPr>
-        <w:t xml:space="preserve"> </w:t>
-      </w:r>
-      <w:proofErr w:type="spellStart"/>
-      <w:r>
-        <w:rPr>
-          <w:rFonts w:ascii="Arial" w:hAnsi="Arial" w:cs="Arial"/>
-          <w:spacing w:val="-2"/>
-          <w:w w:val="90"/>
-          <w:lang w:val="pt-BR"/>
-        </w:rPr>
-        <w:t>gold</w:t>
-      </w:r>
-      <w:proofErr w:type="spellEnd"/>
-      <w:r>
-        <w:rPr>
-          <w:rFonts w:ascii="Arial" w:hAnsi="Arial" w:cs="Arial"/>
-          <w:spacing w:val="-2"/>
-          <w:w w:val="90"/>
-          <w:lang w:val="pt-BR"/>
-        </w:rPr>
-        <w:t xml:space="preserve"> standard </w:t>
-      </w:r>
-      <w:proofErr w:type="spellStart"/>
-      <w:r>
-        <w:rPr>
-          <w:rFonts w:ascii="Arial" w:hAnsi="Arial" w:cs="Arial"/>
-          <w:spacing w:val="-2"/>
-          <w:w w:val="90"/>
-          <w:lang w:val="pt-BR"/>
-        </w:rPr>
-        <w:t>questionnaire</w:t>
-      </w:r>
-      <w:proofErr w:type="spellEnd"/>
-      <w:r>
-        <w:rPr>
-          <w:rFonts w:ascii="Arial" w:hAnsi="Arial" w:cs="Arial"/>
-          <w:spacing w:val="-2"/>
-          <w:w w:val="90"/>
-          <w:lang w:val="pt-BR"/>
-        </w:rPr>
-        <w:t xml:space="preserve">. </w:t>
+      </w:pPr>
+      <w:proofErr w:type="spellStart"/>
+      <w:r>
+        <w:t>Name</w:t>
+      </w:r>
+      <w:proofErr w:type="spellEnd"/>
+      <w:r>
+        <w:t>: multigroup_ratings-withNAs-withoutAttFails.csv (</w:t>
+      </w:r>
+      <w:proofErr w:type="spellStart"/>
+      <w:r>
+        <w:t>located</w:t>
+      </w:r>
+      <w:proofErr w:type="spellEnd"/>
+      <w:r>
+        <w:t xml:space="preserve"> in Reproduce0 - </w:t>
+      </w:r>
+      <w:proofErr w:type="spellStart"/>
+      <w:r>
+        <w:t>Collapse</w:t>
+      </w:r>
+      <w:proofErr w:type="spellEnd"/>
+      <w:r>
+        <w:t xml:space="preserve"> input data/Data).</w:t>
       </w:r>
     </w:p>
     <w:p>
@@ -3460,6 +3113,1845 @@
         <w:spacing w:before="216" w:line="304" w:lineRule="auto"/>
         <w:ind w:left="511" w:right="106"/>
         <w:jc w:val="both"/>
+      </w:pPr>
+      <w:proofErr w:type="spellStart"/>
+      <w:r>
+        <w:t>Content</w:t>
+      </w:r>
+      <w:proofErr w:type="spellEnd"/>
+      <w:r>
+        <w:t xml:space="preserve">: </w:t>
+      </w:r>
+      <w:proofErr w:type="spellStart"/>
+      <w:r>
+        <w:t>Raw</w:t>
+      </w:r>
+      <w:proofErr w:type="spellEnd"/>
+      <w:r>
+        <w:t xml:space="preserve"> </w:t>
+      </w:r>
+      <w:proofErr w:type="spellStart"/>
+      <w:r>
+        <w:t>dataset</w:t>
+      </w:r>
+      <w:proofErr w:type="spellEnd"/>
+      <w:r>
+        <w:t xml:space="preserve"> </w:t>
+      </w:r>
+      <w:proofErr w:type="spellStart"/>
+      <w:r>
+        <w:t>containing</w:t>
+      </w:r>
+      <w:proofErr w:type="spellEnd"/>
+      <w:r>
+        <w:t xml:space="preserve"> </w:t>
+      </w:r>
+      <w:proofErr w:type="spellStart"/>
+      <w:r>
+        <w:t>main</w:t>
+      </w:r>
+      <w:proofErr w:type="spellEnd"/>
+      <w:r>
+        <w:t xml:space="preserve"> </w:t>
+      </w:r>
+      <w:proofErr w:type="spellStart"/>
+      <w:r>
+        <w:t>scale</w:t>
+      </w:r>
+      <w:proofErr w:type="spellEnd"/>
+      <w:r>
+        <w:t xml:space="preserve"> responses, </w:t>
+      </w:r>
+      <w:proofErr w:type="spellStart"/>
+      <w:r>
+        <w:t>metadata</w:t>
+      </w:r>
+      <w:proofErr w:type="spellEnd"/>
+      <w:r>
+        <w:t xml:space="preserve"> (id, </w:t>
+      </w:r>
+      <w:proofErr w:type="spellStart"/>
+      <w:r>
+        <w:t>seed</w:t>
+      </w:r>
+      <w:proofErr w:type="spellEnd"/>
+      <w:r>
+        <w:t xml:space="preserve">, </w:t>
+      </w:r>
+      <w:proofErr w:type="spellStart"/>
+      <w:r>
+        <w:t>stimulus</w:t>
+      </w:r>
+      <w:proofErr w:type="spellEnd"/>
+      <w:r>
+        <w:t xml:space="preserve">), </w:t>
+      </w:r>
+      <w:proofErr w:type="spellStart"/>
+      <w:r>
+        <w:t>and</w:t>
+      </w:r>
+      <w:proofErr w:type="spellEnd"/>
+      <w:r>
+        <w:t xml:space="preserve"> </w:t>
+      </w:r>
+      <w:proofErr w:type="spellStart"/>
+      <w:r>
+        <w:t>external</w:t>
+      </w:r>
+      <w:proofErr w:type="spellEnd"/>
+      <w:r>
+        <w:t xml:space="preserve"> </w:t>
+      </w:r>
+      <w:proofErr w:type="spellStart"/>
+      <w:r>
+        <w:t>instrument</w:t>
+      </w:r>
+      <w:proofErr w:type="spellEnd"/>
+      <w:r>
+        <w:t xml:space="preserve"> </w:t>
+      </w:r>
+      <w:proofErr w:type="spellStart"/>
+      <w:r>
+        <w:t>items</w:t>
+      </w:r>
+      <w:proofErr w:type="spellEnd"/>
+      <w:r>
+        <w:t xml:space="preserve"> (sus, </w:t>
+      </w:r>
+      <w:proofErr w:type="spellStart"/>
+      <w:r>
+        <w:t>ueq</w:t>
+      </w:r>
+      <w:proofErr w:type="spellEnd"/>
+      <w:r>
+        <w:t>).</w:t>
+      </w:r>
+    </w:p>
+    <w:p>
+      <w:pPr>
+        <w:pStyle w:val="Heading3"/>
+        <w:rPr>
+          <w:w w:val="90"/>
+          <w:lang w:val="pt-BR"/>
+        </w:rPr>
+      </w:pPr>
+      <w:proofErr w:type="gramStart"/>
+      <w:r>
+        <w:rPr>
+          <w:w w:val="90"/>
+          <w:lang w:val="pt-BR"/>
+        </w:rPr>
+        <w:lastRenderedPageBreak/>
+        <w:t>  Output</w:t>
+      </w:r>
+      <w:proofErr w:type="gramEnd"/>
+      <w:r>
+        <w:rPr>
+          <w:w w:val="90"/>
+          <w:lang w:val="pt-BR"/>
+        </w:rPr>
+        <w:t xml:space="preserve"> Files (</w:t>
+      </w:r>
+      <w:proofErr w:type="spellStart"/>
+      <w:r>
+        <w:rPr>
+          <w:w w:val="90"/>
+          <w:lang w:val="pt-BR"/>
+        </w:rPr>
+        <w:t>saved</w:t>
+      </w:r>
+      <w:proofErr w:type="spellEnd"/>
+      <w:r>
+        <w:rPr>
+          <w:w w:val="90"/>
+          <w:lang w:val="pt-BR"/>
+        </w:rPr>
+        <w:t xml:space="preserve"> </w:t>
+      </w:r>
+      <w:proofErr w:type="spellStart"/>
+      <w:r>
+        <w:rPr>
+          <w:w w:val="90"/>
+          <w:lang w:val="pt-BR"/>
+        </w:rPr>
+        <w:t>to</w:t>
+      </w:r>
+      <w:proofErr w:type="spellEnd"/>
+      <w:r>
+        <w:rPr>
+          <w:w w:val="90"/>
+          <w:lang w:val="pt-BR"/>
+        </w:rPr>
+        <w:t xml:space="preserve"> Reproduce0 - </w:t>
+      </w:r>
+      <w:proofErr w:type="spellStart"/>
+      <w:r>
+        <w:rPr>
+          <w:w w:val="90"/>
+          <w:lang w:val="pt-BR"/>
+        </w:rPr>
+        <w:t>Collapse</w:t>
+      </w:r>
+      <w:proofErr w:type="spellEnd"/>
+      <w:r>
+        <w:rPr>
+          <w:w w:val="90"/>
+          <w:lang w:val="pt-BR"/>
+        </w:rPr>
+        <w:t xml:space="preserve"> input data/</w:t>
+      </w:r>
+      <w:proofErr w:type="spellStart"/>
+      <w:r>
+        <w:rPr>
+          <w:w w:val="90"/>
+          <w:lang w:val="pt-BR"/>
+        </w:rPr>
+        <w:t>Data_Analysis</w:t>
+      </w:r>
+      <w:proofErr w:type="spellEnd"/>
+      <w:r>
+        <w:rPr>
+          <w:w w:val="90"/>
+          <w:lang w:val="pt-BR"/>
+        </w:rPr>
+        <w:t>):</w:t>
+      </w:r>
+    </w:p>
+    <w:p>
+      <w:pPr>
+        <w:tabs>
+          <w:tab w:val="left" w:pos="687"/>
+        </w:tabs>
+        <w:spacing w:before="216" w:line="304" w:lineRule="auto"/>
+        <w:ind w:left="511" w:right="106"/>
+        <w:jc w:val="both"/>
+      </w:pPr>
+      <w:r>
+        <w:t>multigroup_ratings-withNAs-withoutAttFails_lowfreqcollapsed.csv</w:t>
+      </w:r>
+    </w:p>
+    <w:p>
+      <w:pPr>
+        <w:tabs>
+          <w:tab w:val="left" w:pos="687"/>
+        </w:tabs>
+        <w:spacing w:before="216" w:line="304" w:lineRule="auto"/>
+        <w:ind w:left="511" w:right="106"/>
+        <w:jc w:val="both"/>
+      </w:pPr>
+      <w:proofErr w:type="spellStart"/>
+      <w:r>
+        <w:t>Content</w:t>
+      </w:r>
+      <w:proofErr w:type="spellEnd"/>
+      <w:r>
+        <w:t xml:space="preserve">: Complete </w:t>
+      </w:r>
+      <w:proofErr w:type="spellStart"/>
+      <w:r>
+        <w:t>dataset</w:t>
+      </w:r>
+      <w:proofErr w:type="spellEnd"/>
+      <w:r>
+        <w:t xml:space="preserve"> </w:t>
+      </w:r>
+      <w:proofErr w:type="spellStart"/>
+      <w:r>
+        <w:t>with</w:t>
+      </w:r>
+      <w:proofErr w:type="spellEnd"/>
+      <w:r>
+        <w:t xml:space="preserve"> </w:t>
+      </w:r>
+      <w:proofErr w:type="spellStart"/>
+      <w:r>
+        <w:t>sparse</w:t>
+      </w:r>
+      <w:proofErr w:type="spellEnd"/>
+      <w:r>
+        <w:t xml:space="preserve"> </w:t>
+      </w:r>
+      <w:proofErr w:type="spellStart"/>
+      <w:r>
+        <w:t>categories</w:t>
+      </w:r>
+      <w:proofErr w:type="spellEnd"/>
+      <w:r>
+        <w:t xml:space="preserve"> </w:t>
+      </w:r>
+      <w:proofErr w:type="spellStart"/>
+      <w:r>
+        <w:t>merged</w:t>
+      </w:r>
+      <w:proofErr w:type="spellEnd"/>
+      <w:r>
+        <w:t xml:space="preserve"> for </w:t>
+      </w:r>
+      <w:proofErr w:type="spellStart"/>
+      <w:r>
+        <w:t>the</w:t>
+      </w:r>
+      <w:proofErr w:type="spellEnd"/>
+      <w:r>
+        <w:t xml:space="preserve"> </w:t>
+      </w:r>
+      <w:proofErr w:type="spellStart"/>
+      <w:r>
+        <w:t>main</w:t>
+      </w:r>
+      <w:proofErr w:type="spellEnd"/>
+      <w:r>
+        <w:t xml:space="preserve"> </w:t>
+      </w:r>
+      <w:proofErr w:type="spellStart"/>
+      <w:r>
+        <w:t>scale</w:t>
+      </w:r>
+      <w:proofErr w:type="spellEnd"/>
+      <w:r>
+        <w:t xml:space="preserve"> </w:t>
+      </w:r>
+      <w:proofErr w:type="spellStart"/>
+      <w:r>
+        <w:t>items</w:t>
+      </w:r>
+      <w:proofErr w:type="spellEnd"/>
+      <w:r>
+        <w:t xml:space="preserve">, </w:t>
+      </w:r>
+      <w:proofErr w:type="spellStart"/>
+      <w:r>
+        <w:t>keeping</w:t>
+      </w:r>
+      <w:proofErr w:type="spellEnd"/>
+      <w:r>
+        <w:t xml:space="preserve"> </w:t>
+      </w:r>
+      <w:proofErr w:type="spellStart"/>
+      <w:r>
+        <w:t>all</w:t>
+      </w:r>
+      <w:proofErr w:type="spellEnd"/>
+      <w:r>
+        <w:t xml:space="preserve"> </w:t>
+      </w:r>
+      <w:proofErr w:type="spellStart"/>
+      <w:r>
+        <w:t>other</w:t>
+      </w:r>
+      <w:proofErr w:type="spellEnd"/>
+      <w:r>
+        <w:t xml:space="preserve"> </w:t>
+      </w:r>
+      <w:proofErr w:type="spellStart"/>
+      <w:r>
+        <w:t>variables</w:t>
+      </w:r>
+      <w:proofErr w:type="spellEnd"/>
+      <w:r>
+        <w:t xml:space="preserve"> </w:t>
+      </w:r>
+      <w:proofErr w:type="spellStart"/>
+      <w:r>
+        <w:t>intact</w:t>
+      </w:r>
+      <w:proofErr w:type="spellEnd"/>
+      <w:r>
+        <w:t>.</w:t>
+      </w:r>
+    </w:p>
+    <w:p>
+      <w:pPr>
+        <w:tabs>
+          <w:tab w:val="left" w:pos="687"/>
+        </w:tabs>
+        <w:spacing w:before="216" w:line="304" w:lineRule="auto"/>
+        <w:ind w:left="511" w:right="106"/>
+        <w:jc w:val="both"/>
+      </w:pPr>
+      <w:r>
+        <w:t>multigroup_ratings-withNAs-withoutAttFails_changes_made.csv</w:t>
+      </w:r>
+    </w:p>
+    <w:p>
+      <w:pPr>
+        <w:tabs>
+          <w:tab w:val="left" w:pos="687"/>
+        </w:tabs>
+        <w:spacing w:before="216" w:line="304" w:lineRule="auto"/>
+        <w:ind w:left="511" w:right="106"/>
+        <w:jc w:val="both"/>
+      </w:pPr>
+      <w:proofErr w:type="spellStart"/>
+      <w:r>
+        <w:t>Content</w:t>
+      </w:r>
+      <w:proofErr w:type="spellEnd"/>
+      <w:r>
+        <w:t xml:space="preserve">: </w:t>
+      </w:r>
+      <w:proofErr w:type="spellStart"/>
+      <w:r>
+        <w:t>Merger</w:t>
+      </w:r>
+      <w:proofErr w:type="spellEnd"/>
+      <w:r>
+        <w:t xml:space="preserve"> log </w:t>
+      </w:r>
+      <w:proofErr w:type="spellStart"/>
+      <w:r>
+        <w:t>recording</w:t>
+      </w:r>
+      <w:proofErr w:type="spellEnd"/>
+      <w:r>
+        <w:t xml:space="preserve"> </w:t>
+      </w:r>
+      <w:proofErr w:type="spellStart"/>
+      <w:r>
+        <w:t>each</w:t>
+      </w:r>
+      <w:proofErr w:type="spellEnd"/>
+      <w:r>
+        <w:t xml:space="preserve"> </w:t>
+      </w:r>
+      <w:proofErr w:type="spellStart"/>
+      <w:r>
+        <w:t>change</w:t>
+      </w:r>
+      <w:proofErr w:type="spellEnd"/>
+      <w:r>
+        <w:t xml:space="preserve"> (item, origem [</w:t>
+      </w:r>
+      <w:proofErr w:type="spellStart"/>
+      <w:r>
+        <w:t>source</w:t>
+      </w:r>
+      <w:proofErr w:type="spellEnd"/>
+      <w:r>
+        <w:t xml:space="preserve">], destino [target], </w:t>
+      </w:r>
+      <w:proofErr w:type="spellStart"/>
+      <w:r>
+        <w:t>prop_original</w:t>
+      </w:r>
+      <w:proofErr w:type="spellEnd"/>
+      <w:r>
+        <w:t xml:space="preserve"> [</w:t>
+      </w:r>
+      <w:proofErr w:type="spellStart"/>
+      <w:r>
+        <w:t>initial</w:t>
+      </w:r>
+      <w:proofErr w:type="spellEnd"/>
+      <w:r>
+        <w:t xml:space="preserve"> </w:t>
+      </w:r>
+      <w:proofErr w:type="spellStart"/>
+      <w:r>
+        <w:t>proportion</w:t>
+      </w:r>
+      <w:proofErr w:type="spellEnd"/>
+      <w:r>
+        <w:t xml:space="preserve">], </w:t>
+      </w:r>
+      <w:proofErr w:type="spellStart"/>
+      <w:r>
+        <w:t>and</w:t>
+      </w:r>
+      <w:proofErr w:type="spellEnd"/>
+      <w:r>
+        <w:t xml:space="preserve"> </w:t>
+      </w:r>
+      <w:proofErr w:type="spellStart"/>
+      <w:r>
+        <w:t>n_casos</w:t>
+      </w:r>
+      <w:proofErr w:type="spellEnd"/>
+      <w:r>
+        <w:t xml:space="preserve"> [</w:t>
+      </w:r>
+      <w:proofErr w:type="spellStart"/>
+      <w:r>
+        <w:t>number</w:t>
+      </w:r>
+      <w:proofErr w:type="spellEnd"/>
+      <w:r>
+        <w:t xml:space="preserve"> </w:t>
+      </w:r>
+      <w:proofErr w:type="spellStart"/>
+      <w:r>
+        <w:t>of</w:t>
+      </w:r>
+      <w:proofErr w:type="spellEnd"/>
+      <w:r>
+        <w:t xml:space="preserve"> cases </w:t>
+      </w:r>
+      <w:proofErr w:type="spellStart"/>
+      <w:r>
+        <w:t>affected</w:t>
+      </w:r>
+      <w:proofErr w:type="spellEnd"/>
+      <w:r>
+        <w:t>]).</w:t>
+      </w:r>
+    </w:p>
+    <w:p>
+      <w:pPr>
+        <w:pStyle w:val="Heading3"/>
+        <w:rPr>
+          <w:b w:val="0"/>
+          <w:bCs w:val="0"/>
+          <w:w w:val="90"/>
+          <w:lang w:val="pt-BR"/>
+        </w:rPr>
+      </w:pPr>
+    </w:p>
+    <w:p>
+      <w:pPr>
+        <w:pStyle w:val="Heading1"/>
+        <w:numPr>
+          <w:ilvl w:val="0"/>
+          <w:numId w:val="0"/>
+        </w:numPr>
+        <w:rPr>
+          <w:w w:val="90"/>
+          <w:lang w:val="pt-BR"/>
+        </w:rPr>
+      </w:pPr>
+    </w:p>
+    <w:p>
+      <w:pPr>
+        <w:pStyle w:val="Heading1"/>
+        <w:numPr>
+          <w:ilvl w:val="0"/>
+          <w:numId w:val="0"/>
+        </w:numPr>
+        <w:ind w:left="862"/>
+        <w:rPr>
+          <w:w w:val="90"/>
+          <w:lang w:val="pt-BR"/>
+        </w:rPr>
+      </w:pPr>
+    </w:p>
+    <w:p>
+      <w:pPr>
+        <w:pStyle w:val="Heading1"/>
+        <w:rPr>
+          <w:w w:val="90"/>
+          <w:lang w:val="pt-BR"/>
+        </w:rPr>
+      </w:pPr>
+      <w:r>
+        <w:rPr>
+          <w:w w:val="90"/>
+          <w:lang w:val="pt-BR"/>
+        </w:rPr>
+        <w:t>Val_1_Gold_standard_</w:t>
+      </w:r>
+      <w:proofErr w:type="gramStart"/>
+      <w:r>
+        <w:rPr>
+          <w:w w:val="90"/>
+          <w:lang w:val="pt-BR"/>
+        </w:rPr>
+        <w:t>reliability</w:t>
+      </w:r>
+      <w:r>
+        <w:rPr>
+          <w:w w:val="90"/>
+          <w:lang w:val="pt-BR"/>
+        </w:rPr>
+        <w:t>.Rmd</w:t>
+      </w:r>
+      <w:proofErr w:type="gramEnd"/>
+    </w:p>
+    <w:p>
+      <w:pPr>
+        <w:pStyle w:val="Heading3"/>
+        <w:ind w:left="0" w:firstLine="0"/>
+        <w:rPr>
+          <w:w w:val="90"/>
+          <w:lang w:val="pt-BR"/>
+        </w:rPr>
+      </w:pPr>
+    </w:p>
+    <w:p>
+      <w:pPr>
+        <w:pStyle w:val="Heading3"/>
+        <w:ind w:left="0" w:firstLine="0"/>
+        <w:rPr>
+          <w:w w:val="90"/>
+          <w:lang w:val="pt-BR"/>
+        </w:rPr>
+      </w:pPr>
+      <w:proofErr w:type="spellStart"/>
+      <w:r>
+        <w:rPr>
+          <w:w w:val="90"/>
+          <w:lang w:val="pt-BR"/>
+        </w:rPr>
+        <w:t>Description</w:t>
+      </w:r>
+      <w:proofErr w:type="spellEnd"/>
+      <w:r>
+        <w:rPr>
+          <w:w w:val="90"/>
+          <w:lang w:val="pt-BR"/>
+        </w:rPr>
+        <w:t xml:space="preserve">: </w:t>
+      </w:r>
+    </w:p>
+    <w:p>
+      <w:pPr>
+        <w:pStyle w:val="Heading3"/>
+        <w:ind w:left="0" w:firstLine="0"/>
+        <w:rPr>
+          <w:w w:val="90"/>
+          <w:lang w:val="pt-BR"/>
+        </w:rPr>
+      </w:pPr>
+    </w:p>
+    <w:p>
+      <w:pPr>
+        <w:pStyle w:val="Heading3"/>
+        <w:rPr>
+          <w:b w:val="0"/>
+          <w:bCs w:val="0"/>
+          <w:w w:val="90"/>
+          <w:lang w:val="pt-BR"/>
+        </w:rPr>
+      </w:pPr>
+      <w:proofErr w:type="gramStart"/>
+      <w:r>
+        <w:rPr>
+          <w:b w:val="0"/>
+          <w:bCs w:val="0"/>
+          <w:w w:val="90"/>
+          <w:lang w:val="pt-BR"/>
+        </w:rPr>
+        <w:t xml:space="preserve">  </w:t>
+      </w:r>
+      <w:proofErr w:type="spellStart"/>
+      <w:r>
+        <w:rPr>
+          <w:b w:val="0"/>
+          <w:bCs w:val="0"/>
+          <w:w w:val="90"/>
+          <w:lang w:val="pt-BR"/>
+        </w:rPr>
+        <w:t>Loads</w:t>
+      </w:r>
+      <w:proofErr w:type="spellEnd"/>
+      <w:proofErr w:type="gramEnd"/>
+      <w:r>
+        <w:rPr>
+          <w:b w:val="0"/>
+          <w:bCs w:val="0"/>
+          <w:w w:val="90"/>
+          <w:lang w:val="pt-BR"/>
+        </w:rPr>
+        <w:t xml:space="preserve"> </w:t>
+      </w:r>
+      <w:r>
+        <w:rPr>
+          <w:b w:val="0"/>
+          <w:bCs w:val="0"/>
+          <w:w w:val="90"/>
+          <w:lang w:val="pt-BR"/>
+        </w:rPr>
+        <w:t xml:space="preserve">SUS </w:t>
+      </w:r>
+      <w:proofErr w:type="spellStart"/>
+      <w:r>
+        <w:rPr>
+          <w:b w:val="0"/>
+          <w:bCs w:val="0"/>
+          <w:w w:val="90"/>
+          <w:lang w:val="pt-BR"/>
+        </w:rPr>
+        <w:t>and</w:t>
+      </w:r>
+      <w:proofErr w:type="spellEnd"/>
+      <w:r>
+        <w:rPr>
+          <w:b w:val="0"/>
+          <w:bCs w:val="0"/>
+          <w:w w:val="90"/>
+          <w:lang w:val="pt-BR"/>
+        </w:rPr>
+        <w:t xml:space="preserve"> UEQ-S </w:t>
+      </w:r>
+      <w:r>
+        <w:rPr>
+          <w:b w:val="0"/>
+          <w:bCs w:val="0"/>
+          <w:w w:val="90"/>
+          <w:lang w:val="pt-BR"/>
+        </w:rPr>
+        <w:t xml:space="preserve">responses </w:t>
+      </w:r>
+      <w:proofErr w:type="spellStart"/>
+      <w:r>
+        <w:rPr>
+          <w:b w:val="0"/>
+          <w:bCs w:val="0"/>
+          <w:w w:val="90"/>
+          <w:lang w:val="pt-BR"/>
+        </w:rPr>
+        <w:t>from</w:t>
+      </w:r>
+      <w:proofErr w:type="spellEnd"/>
+      <w:r>
+        <w:rPr>
+          <w:b w:val="0"/>
+          <w:bCs w:val="0"/>
+          <w:w w:val="90"/>
+          <w:lang w:val="pt-BR"/>
+        </w:rPr>
+        <w:t xml:space="preserve"> CSV files, </w:t>
+      </w:r>
+      <w:proofErr w:type="spellStart"/>
+      <w:r>
+        <w:rPr>
+          <w:b w:val="0"/>
+          <w:bCs w:val="0"/>
+          <w:w w:val="90"/>
+          <w:lang w:val="pt-BR"/>
+        </w:rPr>
+        <w:t>standardizes</w:t>
+      </w:r>
+      <w:proofErr w:type="spellEnd"/>
+      <w:r>
+        <w:rPr>
+          <w:b w:val="0"/>
+          <w:bCs w:val="0"/>
+          <w:w w:val="90"/>
+          <w:lang w:val="pt-BR"/>
+        </w:rPr>
+        <w:t xml:space="preserve"> </w:t>
+      </w:r>
+      <w:proofErr w:type="spellStart"/>
+      <w:r>
+        <w:rPr>
+          <w:b w:val="0"/>
+          <w:bCs w:val="0"/>
+          <w:w w:val="90"/>
+          <w:lang w:val="pt-BR"/>
+        </w:rPr>
+        <w:t>column</w:t>
+      </w:r>
+      <w:proofErr w:type="spellEnd"/>
+      <w:r>
+        <w:rPr>
+          <w:b w:val="0"/>
+          <w:bCs w:val="0"/>
+          <w:w w:val="90"/>
+          <w:lang w:val="pt-BR"/>
+        </w:rPr>
+        <w:t xml:space="preserve"> </w:t>
+      </w:r>
+      <w:proofErr w:type="spellStart"/>
+      <w:r>
+        <w:rPr>
+          <w:b w:val="0"/>
+          <w:bCs w:val="0"/>
+          <w:w w:val="90"/>
+          <w:lang w:val="pt-BR"/>
+        </w:rPr>
+        <w:t>names</w:t>
+      </w:r>
+      <w:proofErr w:type="spellEnd"/>
+      <w:r>
+        <w:rPr>
+          <w:b w:val="0"/>
+          <w:bCs w:val="0"/>
+          <w:w w:val="90"/>
+          <w:lang w:val="pt-BR"/>
+        </w:rPr>
+        <w:t xml:space="preserve">, </w:t>
+      </w:r>
+      <w:proofErr w:type="spellStart"/>
+      <w:r>
+        <w:rPr>
+          <w:b w:val="0"/>
+          <w:bCs w:val="0"/>
+          <w:w w:val="90"/>
+          <w:lang w:val="pt-BR"/>
+        </w:rPr>
+        <w:t>and</w:t>
+      </w:r>
+      <w:proofErr w:type="spellEnd"/>
+      <w:r>
+        <w:rPr>
+          <w:b w:val="0"/>
+          <w:bCs w:val="0"/>
+          <w:w w:val="90"/>
+          <w:lang w:val="pt-BR"/>
+        </w:rPr>
+        <w:t xml:space="preserve"> </w:t>
+      </w:r>
+      <w:proofErr w:type="spellStart"/>
+      <w:r>
+        <w:rPr>
+          <w:b w:val="0"/>
+          <w:bCs w:val="0"/>
+          <w:w w:val="90"/>
+          <w:lang w:val="pt-BR"/>
+        </w:rPr>
+        <w:t>applies</w:t>
+      </w:r>
+      <w:proofErr w:type="spellEnd"/>
+      <w:r>
+        <w:rPr>
+          <w:b w:val="0"/>
+          <w:bCs w:val="0"/>
+          <w:w w:val="90"/>
+          <w:lang w:val="pt-BR"/>
+        </w:rPr>
+        <w:t xml:space="preserve"> reverse </w:t>
+      </w:r>
+      <w:proofErr w:type="spellStart"/>
+      <w:r>
+        <w:rPr>
+          <w:b w:val="0"/>
+          <w:bCs w:val="0"/>
+          <w:w w:val="90"/>
+          <w:lang w:val="pt-BR"/>
+        </w:rPr>
+        <w:t>scoring</w:t>
+      </w:r>
+      <w:proofErr w:type="spellEnd"/>
+      <w:r>
+        <w:rPr>
+          <w:b w:val="0"/>
+          <w:bCs w:val="0"/>
+          <w:w w:val="90"/>
+          <w:lang w:val="pt-BR"/>
+        </w:rPr>
+        <w:t xml:space="preserve"> </w:t>
+      </w:r>
+      <w:proofErr w:type="spellStart"/>
+      <w:r>
+        <w:rPr>
+          <w:b w:val="0"/>
+          <w:bCs w:val="0"/>
+          <w:w w:val="90"/>
+          <w:lang w:val="pt-BR"/>
+        </w:rPr>
+        <w:t>to</w:t>
+      </w:r>
+      <w:proofErr w:type="spellEnd"/>
+      <w:r>
+        <w:rPr>
+          <w:b w:val="0"/>
+          <w:bCs w:val="0"/>
+          <w:w w:val="90"/>
+          <w:lang w:val="pt-BR"/>
+        </w:rPr>
+        <w:t xml:space="preserve"> negative SUS </w:t>
+      </w:r>
+      <w:proofErr w:type="spellStart"/>
+      <w:r>
+        <w:rPr>
+          <w:b w:val="0"/>
+          <w:bCs w:val="0"/>
+          <w:w w:val="90"/>
+          <w:lang w:val="pt-BR"/>
+        </w:rPr>
+        <w:t>items</w:t>
+      </w:r>
+      <w:proofErr w:type="spellEnd"/>
+      <w:r>
+        <w:rPr>
+          <w:b w:val="0"/>
+          <w:bCs w:val="0"/>
+          <w:w w:val="90"/>
+          <w:lang w:val="pt-BR"/>
+        </w:rPr>
+        <w:t>.</w:t>
+      </w:r>
+      <w:r>
+        <w:rPr>
+          <w:b w:val="0"/>
+          <w:bCs w:val="0"/>
+          <w:w w:val="90"/>
+          <w:lang w:val="pt-BR"/>
+        </w:rPr>
+        <w:t xml:space="preserve"> </w:t>
+      </w:r>
+      <w:proofErr w:type="spellStart"/>
+      <w:r>
+        <w:rPr>
+          <w:b w:val="0"/>
+          <w:bCs w:val="0"/>
+          <w:w w:val="90"/>
+          <w:lang w:val="pt-BR"/>
+        </w:rPr>
+        <w:t>Calculates</w:t>
+      </w:r>
+      <w:proofErr w:type="spellEnd"/>
+      <w:r>
+        <w:rPr>
+          <w:b w:val="0"/>
+          <w:bCs w:val="0"/>
+          <w:w w:val="90"/>
+          <w:lang w:val="pt-BR"/>
+        </w:rPr>
+        <w:t xml:space="preserve"> </w:t>
+      </w:r>
+      <w:proofErr w:type="spellStart"/>
+      <w:r>
+        <w:rPr>
+          <w:b w:val="0"/>
+          <w:bCs w:val="0"/>
+          <w:w w:val="90"/>
+          <w:lang w:val="pt-BR"/>
+        </w:rPr>
+        <w:t>reliability</w:t>
+      </w:r>
+      <w:proofErr w:type="spellEnd"/>
+      <w:r>
+        <w:rPr>
+          <w:b w:val="0"/>
+          <w:bCs w:val="0"/>
+          <w:w w:val="90"/>
+          <w:lang w:val="pt-BR"/>
+        </w:rPr>
+        <w:t xml:space="preserve"> </w:t>
+      </w:r>
+      <w:proofErr w:type="spellStart"/>
+      <w:r>
+        <w:rPr>
+          <w:b w:val="0"/>
+          <w:bCs w:val="0"/>
+          <w:w w:val="90"/>
+          <w:lang w:val="pt-BR"/>
+        </w:rPr>
+        <w:t>metrics</w:t>
+      </w:r>
+      <w:proofErr w:type="spellEnd"/>
+      <w:r>
+        <w:rPr>
+          <w:b w:val="0"/>
+          <w:bCs w:val="0"/>
+          <w:w w:val="90"/>
+          <w:lang w:val="pt-BR"/>
+        </w:rPr>
+        <w:t>:</w:t>
+      </w:r>
+    </w:p>
+    <w:p>
+      <w:pPr>
+        <w:pStyle w:val="Heading3"/>
+        <w:numPr>
+          <w:ilvl w:val="0"/>
+          <w:numId w:val="2"/>
+        </w:numPr>
+        <w:rPr>
+          <w:b w:val="0"/>
+          <w:bCs w:val="0"/>
+          <w:w w:val="90"/>
+          <w:lang w:val="pt-BR"/>
+        </w:rPr>
+      </w:pPr>
+      <w:proofErr w:type="spellStart"/>
+      <w:r>
+        <w:rPr>
+          <w:b w:val="0"/>
+          <w:bCs w:val="0"/>
+          <w:w w:val="90"/>
+          <w:lang w:val="pt-BR"/>
+        </w:rPr>
+        <w:t>Cronbach's</w:t>
+      </w:r>
+      <w:proofErr w:type="spellEnd"/>
+      <w:r>
+        <w:rPr>
+          <w:b w:val="0"/>
+          <w:bCs w:val="0"/>
+          <w:w w:val="90"/>
+          <w:lang w:val="pt-BR"/>
+        </w:rPr>
+        <w:t xml:space="preserve"> alpha (</w:t>
+      </w:r>
+      <w:proofErr w:type="spellStart"/>
+      <w:r>
+        <w:rPr>
+          <w:b w:val="0"/>
+          <w:bCs w:val="0"/>
+          <w:w w:val="90"/>
+          <w:lang w:val="pt-BR"/>
+        </w:rPr>
+        <w:t>raw</w:t>
+      </w:r>
+      <w:proofErr w:type="spellEnd"/>
+      <w:r>
+        <w:rPr>
+          <w:b w:val="0"/>
+          <w:bCs w:val="0"/>
+          <w:w w:val="90"/>
+          <w:lang w:val="pt-BR"/>
+        </w:rPr>
+        <w:t xml:space="preserve"> </w:t>
+      </w:r>
+      <w:proofErr w:type="spellStart"/>
+      <w:r>
+        <w:rPr>
+          <w:b w:val="0"/>
+          <w:bCs w:val="0"/>
+          <w:w w:val="90"/>
+          <w:lang w:val="pt-BR"/>
+        </w:rPr>
+        <w:t>and</w:t>
+      </w:r>
+      <w:proofErr w:type="spellEnd"/>
+      <w:r>
+        <w:rPr>
+          <w:b w:val="0"/>
+          <w:bCs w:val="0"/>
+          <w:w w:val="90"/>
+          <w:lang w:val="pt-BR"/>
+        </w:rPr>
+        <w:t xml:space="preserve"> </w:t>
+      </w:r>
+      <w:proofErr w:type="spellStart"/>
+      <w:r>
+        <w:rPr>
+          <w:b w:val="0"/>
+          <w:bCs w:val="0"/>
+          <w:w w:val="90"/>
+          <w:lang w:val="pt-BR"/>
+        </w:rPr>
+        <w:t>standardized</w:t>
+      </w:r>
+      <w:proofErr w:type="spellEnd"/>
+      <w:r>
+        <w:rPr>
+          <w:b w:val="0"/>
+          <w:bCs w:val="0"/>
+          <w:w w:val="90"/>
+          <w:lang w:val="pt-BR"/>
+        </w:rPr>
+        <w:t xml:space="preserve">). </w:t>
+      </w:r>
+    </w:p>
+    <w:p>
+      <w:pPr>
+        <w:pStyle w:val="Heading3"/>
+        <w:numPr>
+          <w:ilvl w:val="0"/>
+          <w:numId w:val="2"/>
+        </w:numPr>
+        <w:rPr>
+          <w:b w:val="0"/>
+          <w:bCs w:val="0"/>
+          <w:w w:val="90"/>
+          <w:lang w:val="pt-BR"/>
+        </w:rPr>
+      </w:pPr>
+      <w:r>
+        <w:rPr>
+          <w:b w:val="0"/>
+          <w:bCs w:val="0"/>
+          <w:w w:val="90"/>
+          <w:lang w:val="pt-BR"/>
+        </w:rPr>
+        <w:t xml:space="preserve">McDonald's </w:t>
+      </w:r>
+      <w:proofErr w:type="spellStart"/>
+      <w:r>
+        <w:rPr>
+          <w:b w:val="0"/>
+          <w:bCs w:val="0"/>
+          <w:w w:val="90"/>
+          <w:lang w:val="pt-BR"/>
+        </w:rPr>
+        <w:t>omega</w:t>
+      </w:r>
+      <w:proofErr w:type="spellEnd"/>
+      <w:r>
+        <w:rPr>
+          <w:b w:val="0"/>
+          <w:bCs w:val="0"/>
+          <w:w w:val="90"/>
+          <w:lang w:val="pt-BR"/>
+        </w:rPr>
+        <w:t xml:space="preserve"> (</w:t>
+      </w:r>
+      <w:proofErr w:type="spellStart"/>
+      <w:r>
+        <w:rPr>
+          <w:b w:val="0"/>
+          <w:bCs w:val="0"/>
+          <w:w w:val="90"/>
+          <w:lang w:val="pt-BR"/>
+        </w:rPr>
+        <w:t>ω_total</w:t>
+      </w:r>
+      <w:proofErr w:type="spellEnd"/>
+      <w:r>
+        <w:rPr>
+          <w:b w:val="0"/>
+          <w:bCs w:val="0"/>
+          <w:w w:val="90"/>
+          <w:lang w:val="pt-BR"/>
+        </w:rPr>
+        <w:t xml:space="preserve">). </w:t>
+      </w:r>
+    </w:p>
+    <w:p>
+      <w:pPr>
+        <w:pStyle w:val="Heading3"/>
+        <w:numPr>
+          <w:ilvl w:val="0"/>
+          <w:numId w:val="2"/>
+        </w:numPr>
+        <w:rPr>
+          <w:b w:val="0"/>
+          <w:bCs w:val="0"/>
+          <w:w w:val="90"/>
+          <w:lang w:val="pt-BR"/>
+        </w:rPr>
+      </w:pPr>
+      <w:r>
+        <w:rPr>
+          <w:b w:val="0"/>
+          <w:bCs w:val="0"/>
+          <w:w w:val="90"/>
+          <w:lang w:val="pt-BR"/>
+        </w:rPr>
+        <w:t xml:space="preserve">SUS </w:t>
+      </w:r>
+      <w:proofErr w:type="spellStart"/>
+      <w:r>
+        <w:rPr>
+          <w:b w:val="0"/>
+          <w:bCs w:val="0"/>
+          <w:w w:val="90"/>
+          <w:lang w:val="pt-BR"/>
+        </w:rPr>
+        <w:t>scale</w:t>
+      </w:r>
+      <w:proofErr w:type="spellEnd"/>
+      <w:r>
+        <w:rPr>
+          <w:b w:val="0"/>
+          <w:bCs w:val="0"/>
+          <w:w w:val="90"/>
+          <w:lang w:val="pt-BR"/>
+        </w:rPr>
+        <w:t xml:space="preserve"> (unidimensional),</w:t>
+      </w:r>
+    </w:p>
+    <w:p>
+      <w:pPr>
+        <w:pStyle w:val="Heading3"/>
+        <w:numPr>
+          <w:ilvl w:val="0"/>
+          <w:numId w:val="2"/>
+        </w:numPr>
+        <w:rPr>
+          <w:b w:val="0"/>
+          <w:bCs w:val="0"/>
+          <w:w w:val="90"/>
+          <w:lang w:val="pt-BR"/>
+        </w:rPr>
+      </w:pPr>
+      <w:r>
+        <w:rPr>
+          <w:b w:val="0"/>
+          <w:bCs w:val="0"/>
+          <w:w w:val="90"/>
+          <w:lang w:val="pt-BR"/>
+        </w:rPr>
+        <w:t xml:space="preserve">UEQ-S </w:t>
+      </w:r>
+      <w:proofErr w:type="spellStart"/>
+      <w:r>
+        <w:rPr>
+          <w:b w:val="0"/>
+          <w:bCs w:val="0"/>
+          <w:w w:val="90"/>
+          <w:lang w:val="pt-BR"/>
+        </w:rPr>
+        <w:t>dimensions</w:t>
+      </w:r>
+      <w:proofErr w:type="spellEnd"/>
+      <w:r>
+        <w:rPr>
+          <w:b w:val="0"/>
+          <w:bCs w:val="0"/>
+          <w:w w:val="90"/>
+          <w:lang w:val="pt-BR"/>
+        </w:rPr>
+        <w:t xml:space="preserve"> (</w:t>
+      </w:r>
+      <w:proofErr w:type="spellStart"/>
+      <w:r>
+        <w:rPr>
+          <w:b w:val="0"/>
+          <w:bCs w:val="0"/>
+          <w:w w:val="90"/>
+          <w:lang w:val="pt-BR"/>
+        </w:rPr>
+        <w:t>Pragmatic</w:t>
+      </w:r>
+      <w:proofErr w:type="spellEnd"/>
+      <w:r>
+        <w:rPr>
+          <w:b w:val="0"/>
+          <w:bCs w:val="0"/>
+          <w:w w:val="90"/>
+          <w:lang w:val="pt-BR"/>
+        </w:rPr>
+        <w:t xml:space="preserve"> </w:t>
+      </w:r>
+      <w:proofErr w:type="spellStart"/>
+      <w:r>
+        <w:rPr>
+          <w:b w:val="0"/>
+          <w:bCs w:val="0"/>
+          <w:w w:val="90"/>
+          <w:lang w:val="pt-BR"/>
+        </w:rPr>
+        <w:t>Quality</w:t>
+      </w:r>
+      <w:proofErr w:type="spellEnd"/>
+      <w:r>
+        <w:rPr>
+          <w:b w:val="0"/>
+          <w:bCs w:val="0"/>
+          <w:w w:val="90"/>
+          <w:lang w:val="pt-BR"/>
+        </w:rPr>
+        <w:t xml:space="preserve"> </w:t>
+      </w:r>
+      <w:proofErr w:type="spellStart"/>
+      <w:r>
+        <w:rPr>
+          <w:b w:val="0"/>
+          <w:bCs w:val="0"/>
+          <w:w w:val="90"/>
+          <w:lang w:val="pt-BR"/>
+        </w:rPr>
+        <w:t>and</w:t>
+      </w:r>
+      <w:proofErr w:type="spellEnd"/>
+      <w:r>
+        <w:rPr>
+          <w:b w:val="0"/>
+          <w:bCs w:val="0"/>
+          <w:w w:val="90"/>
+          <w:lang w:val="pt-BR"/>
+        </w:rPr>
+        <w:t xml:space="preserve"> </w:t>
+      </w:r>
+      <w:proofErr w:type="spellStart"/>
+      <w:r>
+        <w:rPr>
+          <w:b w:val="0"/>
+          <w:bCs w:val="0"/>
+          <w:w w:val="90"/>
+          <w:lang w:val="pt-BR"/>
+        </w:rPr>
+        <w:t>Hedonic</w:t>
+      </w:r>
+      <w:proofErr w:type="spellEnd"/>
+      <w:r>
+        <w:rPr>
+          <w:b w:val="0"/>
+          <w:bCs w:val="0"/>
+          <w:w w:val="90"/>
+          <w:lang w:val="pt-BR"/>
+        </w:rPr>
+        <w:t xml:space="preserve"> </w:t>
+      </w:r>
+      <w:proofErr w:type="spellStart"/>
+      <w:r>
+        <w:rPr>
+          <w:b w:val="0"/>
+          <w:bCs w:val="0"/>
+          <w:w w:val="90"/>
+          <w:lang w:val="pt-BR"/>
+        </w:rPr>
+        <w:t>Quality</w:t>
+      </w:r>
+      <w:proofErr w:type="spellEnd"/>
+      <w:r>
+        <w:rPr>
+          <w:b w:val="0"/>
+          <w:bCs w:val="0"/>
+          <w:w w:val="90"/>
+          <w:lang w:val="pt-BR"/>
+        </w:rPr>
+        <w:t xml:space="preserve">), </w:t>
+      </w:r>
+      <w:proofErr w:type="spellStart"/>
+      <w:r>
+        <w:rPr>
+          <w:b w:val="0"/>
+          <w:bCs w:val="0"/>
+          <w:w w:val="90"/>
+          <w:lang w:val="pt-BR"/>
+        </w:rPr>
+        <w:t>and</w:t>
+      </w:r>
+      <w:proofErr w:type="spellEnd"/>
+      <w:r>
+        <w:rPr>
+          <w:b w:val="0"/>
+          <w:bCs w:val="0"/>
+          <w:w w:val="90"/>
+          <w:lang w:val="pt-BR"/>
+        </w:rPr>
+        <w:t xml:space="preserve"> </w:t>
+      </w:r>
+      <w:proofErr w:type="spellStart"/>
+      <w:r>
+        <w:rPr>
+          <w:b w:val="0"/>
+          <w:bCs w:val="0"/>
+          <w:w w:val="90"/>
+          <w:lang w:val="pt-BR"/>
+        </w:rPr>
+        <w:t>the</w:t>
+      </w:r>
+      <w:proofErr w:type="spellEnd"/>
+      <w:r>
+        <w:rPr>
+          <w:b w:val="0"/>
+          <w:bCs w:val="0"/>
+          <w:w w:val="90"/>
+          <w:lang w:val="pt-BR"/>
+        </w:rPr>
+        <w:t xml:space="preserve"> overall UEQ-S.</w:t>
+      </w:r>
+    </w:p>
+    <w:p>
+      <w:pPr>
+        <w:pStyle w:val="Heading3"/>
+        <w:numPr>
+          <w:ilvl w:val="0"/>
+          <w:numId w:val="2"/>
+        </w:numPr>
+        <w:rPr>
+          <w:b w:val="0"/>
+          <w:bCs w:val="0"/>
+          <w:w w:val="90"/>
+          <w:lang w:val="pt-BR"/>
+        </w:rPr>
+      </w:pPr>
+      <w:r>
+        <w:rPr>
+          <w:b w:val="0"/>
+          <w:bCs w:val="0"/>
+          <w:w w:val="90"/>
+          <w:lang w:val="pt-BR"/>
+        </w:rPr>
+        <w:t>T</w:t>
+      </w:r>
+      <w:r>
+        <w:rPr>
+          <w:b w:val="0"/>
+          <w:bCs w:val="0"/>
+          <w:w w:val="90"/>
+          <w:lang w:val="pt-BR"/>
+        </w:rPr>
+        <w:t xml:space="preserve">he </w:t>
+      </w:r>
+      <w:proofErr w:type="spellStart"/>
+      <w:r>
+        <w:rPr>
+          <w:b w:val="0"/>
+          <w:bCs w:val="0"/>
+          <w:w w:val="90"/>
+          <w:lang w:val="pt-BR"/>
+        </w:rPr>
+        <w:t>impact</w:t>
+      </w:r>
+      <w:proofErr w:type="spellEnd"/>
+      <w:r>
+        <w:rPr>
+          <w:b w:val="0"/>
+          <w:bCs w:val="0"/>
+          <w:w w:val="90"/>
+          <w:lang w:val="pt-BR"/>
+        </w:rPr>
+        <w:t xml:space="preserve"> </w:t>
+      </w:r>
+      <w:proofErr w:type="spellStart"/>
+      <w:r>
+        <w:rPr>
+          <w:b w:val="0"/>
+          <w:bCs w:val="0"/>
+          <w:w w:val="90"/>
+          <w:lang w:val="pt-BR"/>
+        </w:rPr>
+        <w:t>on</w:t>
+      </w:r>
+      <w:proofErr w:type="spellEnd"/>
+      <w:r>
+        <w:rPr>
+          <w:b w:val="0"/>
+          <w:bCs w:val="0"/>
+          <w:w w:val="90"/>
+          <w:lang w:val="pt-BR"/>
+        </w:rPr>
+        <w:t xml:space="preserve"> </w:t>
+      </w:r>
+      <w:proofErr w:type="spellStart"/>
+      <w:r>
+        <w:rPr>
+          <w:b w:val="0"/>
+          <w:bCs w:val="0"/>
+          <w:w w:val="90"/>
+          <w:lang w:val="pt-BR"/>
+        </w:rPr>
+        <w:t>reliability</w:t>
+      </w:r>
+      <w:proofErr w:type="spellEnd"/>
+      <w:r>
+        <w:rPr>
+          <w:b w:val="0"/>
+          <w:bCs w:val="0"/>
+          <w:w w:val="90"/>
+          <w:lang w:val="pt-BR"/>
+        </w:rPr>
+        <w:t xml:space="preserve"> </w:t>
+      </w:r>
+      <w:proofErr w:type="spellStart"/>
+      <w:r>
+        <w:rPr>
+          <w:b w:val="0"/>
+          <w:bCs w:val="0"/>
+          <w:w w:val="90"/>
+          <w:lang w:val="pt-BR"/>
+        </w:rPr>
+        <w:t>if</w:t>
+      </w:r>
+      <w:proofErr w:type="spellEnd"/>
+      <w:r>
+        <w:rPr>
+          <w:b w:val="0"/>
+          <w:bCs w:val="0"/>
+          <w:w w:val="90"/>
+          <w:lang w:val="pt-BR"/>
+        </w:rPr>
+        <w:t xml:space="preserve"> </w:t>
+      </w:r>
+      <w:proofErr w:type="spellStart"/>
+      <w:r>
+        <w:rPr>
+          <w:b w:val="0"/>
+          <w:bCs w:val="0"/>
+          <w:w w:val="90"/>
+          <w:lang w:val="pt-BR"/>
+        </w:rPr>
+        <w:t>each</w:t>
+      </w:r>
+      <w:proofErr w:type="spellEnd"/>
+      <w:r>
+        <w:rPr>
+          <w:b w:val="0"/>
+          <w:bCs w:val="0"/>
+          <w:w w:val="90"/>
+          <w:lang w:val="pt-BR"/>
+        </w:rPr>
+        <w:t xml:space="preserve"> item </w:t>
+      </w:r>
+      <w:proofErr w:type="spellStart"/>
+      <w:r>
+        <w:rPr>
+          <w:b w:val="0"/>
+          <w:bCs w:val="0"/>
+          <w:w w:val="90"/>
+          <w:lang w:val="pt-BR"/>
+        </w:rPr>
+        <w:t>is</w:t>
+      </w:r>
+      <w:proofErr w:type="spellEnd"/>
+      <w:r>
+        <w:rPr>
+          <w:b w:val="0"/>
+          <w:bCs w:val="0"/>
+          <w:w w:val="90"/>
+          <w:lang w:val="pt-BR"/>
+        </w:rPr>
+        <w:t xml:space="preserve"> </w:t>
+      </w:r>
+      <w:proofErr w:type="spellStart"/>
+      <w:r>
+        <w:rPr>
+          <w:b w:val="0"/>
+          <w:bCs w:val="0"/>
+          <w:w w:val="90"/>
+          <w:lang w:val="pt-BR"/>
+        </w:rPr>
+        <w:t>removed</w:t>
+      </w:r>
+      <w:proofErr w:type="spellEnd"/>
+      <w:r>
+        <w:rPr>
+          <w:b w:val="0"/>
+          <w:bCs w:val="0"/>
+          <w:w w:val="90"/>
+          <w:lang w:val="pt-BR"/>
+        </w:rPr>
+        <w:t xml:space="preserve"> (alpha </w:t>
+      </w:r>
+      <w:proofErr w:type="spellStart"/>
+      <w:r>
+        <w:rPr>
+          <w:b w:val="0"/>
+          <w:bCs w:val="0"/>
+          <w:w w:val="90"/>
+          <w:lang w:val="pt-BR"/>
+        </w:rPr>
+        <w:t>if</w:t>
+      </w:r>
+      <w:proofErr w:type="spellEnd"/>
+      <w:r>
+        <w:rPr>
+          <w:b w:val="0"/>
+          <w:bCs w:val="0"/>
+          <w:w w:val="90"/>
+          <w:lang w:val="pt-BR"/>
+        </w:rPr>
+        <w:t xml:space="preserve"> </w:t>
+      </w:r>
+      <w:proofErr w:type="spellStart"/>
+      <w:r>
+        <w:rPr>
+          <w:b w:val="0"/>
+          <w:bCs w:val="0"/>
+          <w:w w:val="90"/>
+          <w:lang w:val="pt-BR"/>
+        </w:rPr>
+        <w:t>dropped</w:t>
+      </w:r>
+      <w:proofErr w:type="spellEnd"/>
+      <w:r>
+        <w:rPr>
+          <w:b w:val="0"/>
+          <w:bCs w:val="0"/>
+          <w:w w:val="90"/>
+          <w:lang w:val="pt-BR"/>
+        </w:rPr>
+        <w:t>).</w:t>
+      </w:r>
+    </w:p>
+    <w:p>
+      <w:pPr>
+        <w:pStyle w:val="Heading3"/>
+        <w:ind w:left="0" w:firstLine="0"/>
+        <w:rPr>
+          <w:w w:val="90"/>
+          <w:lang w:val="pt-BR"/>
+        </w:rPr>
+      </w:pPr>
+    </w:p>
+    <w:p>
+      <w:pPr>
+        <w:pStyle w:val="Heading3"/>
+        <w:ind w:left="0" w:firstLine="0"/>
+        <w:rPr>
+          <w:w w:val="90"/>
+          <w:lang w:val="pt-BR"/>
+        </w:rPr>
+      </w:pPr>
+    </w:p>
+    <w:p>
+      <w:pPr>
+        <w:pStyle w:val="Heading3"/>
+        <w:ind w:left="0" w:firstLine="0"/>
+        <w:rPr>
+          <w:rFonts w:ascii="Arial" w:hAnsi="Arial" w:cs="Arial"/>
+          <w:spacing w:val="-2"/>
+          <w:w w:val="90"/>
+          <w:lang w:val="pt-BR"/>
+        </w:rPr>
+      </w:pPr>
+      <w:r>
+        <w:rPr>
+          <w:w w:val="90"/>
+          <w:lang w:val="pt-BR"/>
+        </w:rPr>
+        <w:t xml:space="preserve">INPUT file </w:t>
+      </w:r>
+      <w:proofErr w:type="spellStart"/>
+      <w:r>
+        <w:rPr>
+          <w:w w:val="90"/>
+          <w:lang w:val="pt-BR"/>
+        </w:rPr>
+        <w:t>on</w:t>
+      </w:r>
+      <w:proofErr w:type="spellEnd"/>
+      <w:r>
+        <w:t xml:space="preserve"> </w:t>
+      </w:r>
+      <w:r>
+        <w:t>/</w:t>
+      </w:r>
+      <w:r>
+        <w:t>Data</w:t>
+      </w:r>
+      <w:r>
+        <w:t>/</w:t>
+      </w:r>
+      <w:r>
+        <w:t xml:space="preserve"> directory</w:t>
+      </w:r>
+    </w:p>
+    <w:p>
+      <w:pPr>
+        <w:tabs>
+          <w:tab w:val="left" w:pos="687"/>
+        </w:tabs>
+        <w:spacing w:before="216" w:line="304" w:lineRule="auto"/>
+        <w:ind w:left="511" w:right="106"/>
+        <w:jc w:val="both"/>
+        <w:rPr>
+          <w:rFonts w:ascii="Arial" w:hAnsi="Arial" w:cs="Arial"/>
+          <w:spacing w:val="-2"/>
+          <w:w w:val="90"/>
+          <w:lang w:val="pt-BR"/>
+        </w:rPr>
+      </w:pPr>
+      <w:proofErr w:type="spellStart"/>
+      <w:r>
+        <w:t>ueqs_ratings</w:t>
+      </w:r>
+      <w:proofErr w:type="spellEnd"/>
+      <w:r>
+        <w:t xml:space="preserve"> and </w:t>
+      </w:r>
+      <w:proofErr w:type="spellStart"/>
+      <w:r>
+        <w:t>sus_ratings</w:t>
+      </w:r>
+      <w:proofErr w:type="spellEnd"/>
+      <w:r>
+        <w:t xml:space="preserve"> </w:t>
+      </w:r>
+      <w:r>
+        <w:rPr>
+          <w:rFonts w:ascii="Arial" w:hAnsi="Arial" w:cs="Arial"/>
+          <w:spacing w:val="-2"/>
+          <w:w w:val="90"/>
+          <w:lang w:val="pt-BR"/>
+        </w:rPr>
+        <w:t xml:space="preserve">- </w:t>
+      </w:r>
+      <w:proofErr w:type="spellStart"/>
+      <w:r>
+        <w:rPr>
+          <w:rFonts w:ascii="Arial" w:hAnsi="Arial" w:cs="Arial"/>
+          <w:spacing w:val="-2"/>
+          <w:w w:val="90"/>
+          <w:lang w:val="pt-BR"/>
+        </w:rPr>
+        <w:t>Comma-separated</w:t>
+      </w:r>
+      <w:proofErr w:type="spellEnd"/>
+      <w:r>
+        <w:rPr>
+          <w:rFonts w:ascii="Arial" w:hAnsi="Arial" w:cs="Arial"/>
+          <w:spacing w:val="-2"/>
+          <w:w w:val="90"/>
+          <w:lang w:val="pt-BR"/>
+        </w:rPr>
+        <w:t xml:space="preserve"> files </w:t>
+      </w:r>
+      <w:proofErr w:type="spellStart"/>
+      <w:r>
+        <w:rPr>
+          <w:rFonts w:ascii="Arial" w:hAnsi="Arial" w:cs="Arial"/>
+          <w:spacing w:val="-2"/>
+          <w:w w:val="90"/>
+          <w:lang w:val="pt-BR"/>
+        </w:rPr>
+        <w:t>consisting</w:t>
+      </w:r>
+      <w:proofErr w:type="spellEnd"/>
+      <w:r>
+        <w:rPr>
+          <w:rFonts w:ascii="Arial" w:hAnsi="Arial" w:cs="Arial"/>
+          <w:spacing w:val="-2"/>
+          <w:w w:val="90"/>
+          <w:lang w:val="pt-BR"/>
+        </w:rPr>
+        <w:t xml:space="preserve"> </w:t>
+      </w:r>
+      <w:proofErr w:type="spellStart"/>
+      <w:r>
+        <w:rPr>
+          <w:rFonts w:ascii="Arial" w:hAnsi="Arial" w:cs="Arial"/>
+          <w:spacing w:val="-2"/>
+          <w:w w:val="90"/>
+          <w:lang w:val="pt-BR"/>
+        </w:rPr>
+        <w:t>of</w:t>
+      </w:r>
+      <w:proofErr w:type="spellEnd"/>
+      <w:r>
+        <w:rPr>
+          <w:rFonts w:ascii="Arial" w:hAnsi="Arial" w:cs="Arial"/>
+          <w:spacing w:val="-2"/>
+          <w:w w:val="90"/>
+          <w:lang w:val="pt-BR"/>
+        </w:rPr>
+        <w:t xml:space="preserve"> responses </w:t>
+      </w:r>
+      <w:proofErr w:type="spellStart"/>
+      <w:r>
+        <w:rPr>
+          <w:rFonts w:ascii="Arial" w:hAnsi="Arial" w:cs="Arial"/>
+          <w:spacing w:val="-2"/>
+          <w:w w:val="90"/>
+          <w:lang w:val="pt-BR"/>
+        </w:rPr>
+        <w:t>to</w:t>
+      </w:r>
+      <w:proofErr w:type="spellEnd"/>
+      <w:r>
+        <w:rPr>
+          <w:rFonts w:ascii="Arial" w:hAnsi="Arial" w:cs="Arial"/>
+          <w:spacing w:val="-2"/>
+          <w:w w:val="90"/>
+          <w:lang w:val="pt-BR"/>
+        </w:rPr>
+        <w:t xml:space="preserve"> </w:t>
+      </w:r>
+      <w:proofErr w:type="spellStart"/>
+      <w:r>
+        <w:rPr>
+          <w:rFonts w:ascii="Arial" w:hAnsi="Arial" w:cs="Arial"/>
+          <w:spacing w:val="-2"/>
+          <w:w w:val="90"/>
+          <w:lang w:val="pt-BR"/>
+        </w:rPr>
+        <w:t>the</w:t>
+      </w:r>
+      <w:proofErr w:type="spellEnd"/>
+      <w:r>
+        <w:rPr>
+          <w:rFonts w:ascii="Arial" w:hAnsi="Arial" w:cs="Arial"/>
+          <w:spacing w:val="-2"/>
+          <w:w w:val="90"/>
+          <w:lang w:val="pt-BR"/>
+        </w:rPr>
+        <w:t xml:space="preserve"> </w:t>
+      </w:r>
+      <w:proofErr w:type="spellStart"/>
+      <w:r>
+        <w:rPr>
+          <w:rFonts w:ascii="Arial" w:hAnsi="Arial" w:cs="Arial"/>
+          <w:spacing w:val="-2"/>
+          <w:w w:val="90"/>
+          <w:lang w:val="pt-BR"/>
+        </w:rPr>
+        <w:t>items</w:t>
+      </w:r>
+      <w:proofErr w:type="spellEnd"/>
+      <w:r>
+        <w:rPr>
+          <w:rFonts w:ascii="Arial" w:hAnsi="Arial" w:cs="Arial"/>
+          <w:spacing w:val="-2"/>
+          <w:w w:val="90"/>
+          <w:lang w:val="pt-BR"/>
+        </w:rPr>
+        <w:t xml:space="preserve"> </w:t>
+      </w:r>
+      <w:proofErr w:type="spellStart"/>
+      <w:r>
+        <w:rPr>
+          <w:rFonts w:ascii="Arial" w:hAnsi="Arial" w:cs="Arial"/>
+          <w:spacing w:val="-2"/>
+          <w:w w:val="90"/>
+          <w:lang w:val="pt-BR"/>
+        </w:rPr>
+        <w:t>of</w:t>
+      </w:r>
+      <w:proofErr w:type="spellEnd"/>
+      <w:r>
+        <w:rPr>
+          <w:rFonts w:ascii="Arial" w:hAnsi="Arial" w:cs="Arial"/>
+          <w:spacing w:val="-2"/>
+          <w:w w:val="90"/>
+          <w:lang w:val="pt-BR"/>
+        </w:rPr>
+        <w:t xml:space="preserve"> </w:t>
+      </w:r>
+      <w:proofErr w:type="spellStart"/>
+      <w:r>
+        <w:rPr>
+          <w:rFonts w:ascii="Arial" w:hAnsi="Arial" w:cs="Arial"/>
+          <w:spacing w:val="-2"/>
+          <w:w w:val="90"/>
+          <w:lang w:val="pt-BR"/>
+        </w:rPr>
+        <w:t>each</w:t>
+      </w:r>
+      <w:proofErr w:type="spellEnd"/>
+      <w:r>
+        <w:rPr>
+          <w:rFonts w:ascii="Arial" w:hAnsi="Arial" w:cs="Arial"/>
+          <w:spacing w:val="-2"/>
+          <w:w w:val="90"/>
+          <w:lang w:val="pt-BR"/>
+        </w:rPr>
+        <w:t xml:space="preserve"> </w:t>
+      </w:r>
+      <w:proofErr w:type="spellStart"/>
+      <w:r>
+        <w:rPr>
+          <w:rFonts w:ascii="Arial" w:hAnsi="Arial" w:cs="Arial"/>
+          <w:spacing w:val="-2"/>
+          <w:w w:val="90"/>
+          <w:lang w:val="pt-BR"/>
+        </w:rPr>
+        <w:t>gold</w:t>
+      </w:r>
+      <w:proofErr w:type="spellEnd"/>
+      <w:r>
+        <w:rPr>
+          <w:rFonts w:ascii="Arial" w:hAnsi="Arial" w:cs="Arial"/>
+          <w:spacing w:val="-2"/>
+          <w:w w:val="90"/>
+          <w:lang w:val="pt-BR"/>
+        </w:rPr>
+        <w:t xml:space="preserve"> standard </w:t>
+      </w:r>
+      <w:proofErr w:type="spellStart"/>
+      <w:r>
+        <w:rPr>
+          <w:rFonts w:ascii="Arial" w:hAnsi="Arial" w:cs="Arial"/>
+          <w:spacing w:val="-2"/>
+          <w:w w:val="90"/>
+          <w:lang w:val="pt-BR"/>
+        </w:rPr>
+        <w:t>questionnaire</w:t>
+      </w:r>
+      <w:proofErr w:type="spellEnd"/>
+      <w:r>
+        <w:rPr>
+          <w:rFonts w:ascii="Arial" w:hAnsi="Arial" w:cs="Arial"/>
+          <w:spacing w:val="-2"/>
+          <w:w w:val="90"/>
+          <w:lang w:val="pt-BR"/>
+        </w:rPr>
+        <w:t xml:space="preserve">. </w:t>
+      </w:r>
+    </w:p>
+    <w:p>
+      <w:pPr>
+        <w:tabs>
+          <w:tab w:val="left" w:pos="687"/>
+        </w:tabs>
+        <w:spacing w:before="216" w:line="304" w:lineRule="auto"/>
+        <w:ind w:left="511" w:right="106"/>
+        <w:jc w:val="both"/>
         <w:rPr>
           <w:rFonts w:ascii="Arial" w:hAnsi="Arial" w:cs="Arial"/>
           <w:spacing w:val="-2"/>
@@ -3791,7 +5283,6 @@
           <w:spacing w:val="-2"/>
           <w:w w:val="90"/>
         </w:rPr>
-        <w:lastRenderedPageBreak/>
         <w:t>the</w:t>
       </w:r>
       <w:proofErr w:type="gramEnd"/>
@@ -4661,6 +6152,7 @@
           <w:w w:val="90"/>
           <w:lang w:val="pt-BR"/>
         </w:rPr>
+        <w:lastRenderedPageBreak/>
         <w:t>Cognitive</w:t>
       </w:r>
       <w:proofErr w:type="spellEnd"/>
@@ -7300,7 +8792,7 @@
 </file>
 
 <file path=word/endnotes.xml><?xml version="1.0" encoding="utf-8"?>
-<w:endnotes xmlns:wpc="http://schemas.microsoft.com/office/word/2010/wordprocessingCanvas" xmlns:cx="http://schemas.microsoft.com/office/drawing/2014/chartex" xmlns:cx1="http://schemas.microsoft.com/office/drawing/2015/9/8/chartex" xmlns:cx2="http://schemas.microsoft.com/office/drawing/2015/10/21/chartex" xmlns:cx3="http://schemas.microsoft.com/office/drawing/2016/5/9/chartex" xmlns:cx4="http://schemas.microsoft.com/office/drawing/2016/5/10/chartex" xmlns:cx5="http://schemas.microsoft.com/office/drawing/2016/5/11/chartex" xmlns:cx6="http://schemas.microsoft.com/office/drawing/2016/5/12/chartex" xmlns:cx7="http://schemas.microsoft.com/office/drawing/2016/5/13/chartex" xmlns:cx8="http://schemas.microsoft.com/office/drawing/2016/5/14/chartex" xmlns:mc="http://schemas.openxmlformats.org/markup-compatibility/2006" xmlns:aink="http://schemas.microsoft.com/office/drawing/2016/ink" xmlns:am3d="http://schemas.microsoft.com/office/drawing/2017/model3d" xmlns:o="urn:schemas-microsoft-com:office:office" xmlns:oel="http://schemas.microsoft.com/office/2019/extlst" xmlns:r="http://schemas.openxmlformats.org/officeDocument/2006/relationships" xmlns:m="http://schemas.openxmlformats.org/officeDocument/2006/math" xmlns:v="urn:schemas-microsoft-com:vml" xmlns:wp14="http://schemas.microsoft.com/office/word/2010/wordprocessingDrawing" xmlns:wp="http://schemas.openxmlformats.org/drawingml/2006/wordprocessingDrawing" xmlns:w10="urn:schemas-microsoft-com:office:word" xmlns:w="http://schemas.openxmlformats.org/wordprocessingml/2006/main" xmlns:w14="http://schemas.microsoft.com/office/word/2010/wordml" xmlns:w15="http://schemas.microsoft.com/office/word/2012/wordml" xmlns:w16cei="http://schemas.microsoft.com/office/word/2026/wordml/cei" xmlns:w16cex="http://schemas.microsoft.com/office/word/2018/wordml/cex" xmlns:w16cid="http://schemas.microsoft.com/office/word/2016/wordml/cid" xmlns:w16="http://schemas.microsoft.com/office/word/2018/wordml" xmlns:w16du="http://schemas.microsoft.com/office/word/2023/wordml/word16du" xmlns:w16sdtdh="http://schemas.microsoft.com/office/word/2020/wordml/sdtdatahash" xmlns:w16sdtfl="http://schemas.microsoft.com/office/word/2024/wordml/sdtformatlock" xmlns:w16se="http://schemas.microsoft.com/office/word/2015/wordml/symex" xmlns:wpg="http://schemas.microsoft.com/office/word/2010/wordprocessingGroup" xmlns:wpi="http://schemas.microsoft.com/office/word/2010/wordprocessingInk" xmlns:wne="http://schemas.microsoft.com/office/word/2006/wordml" xmlns:wps="http://schemas.microsoft.com/office/word/2010/wordprocessingShape" mc:Ignorable="w14 w15 w16se w16cid w16 w16cex w16sdtdh w16sdtfl w16du wp14">
+<w:endnotes xmlns:wpc="http://schemas.microsoft.com/office/word/2010/wordprocessingCanvas" xmlns:cx="http://schemas.microsoft.com/office/drawing/2014/chartex" xmlns:cx1="http://schemas.microsoft.com/office/drawing/2015/9/8/chartex" xmlns:cx2="http://schemas.microsoft.com/office/drawing/2015/10/21/chartex" xmlns:cx3="http://schemas.microsoft.com/office/drawing/2016/5/9/chartex" xmlns:cx4="http://schemas.microsoft.com/office/drawing/2016/5/10/chartex" xmlns:cx5="http://schemas.microsoft.com/office/drawing/2016/5/11/chartex" xmlns:cx6="http://schemas.microsoft.com/office/drawing/2016/5/12/chartex" xmlns:cx7="http://schemas.microsoft.com/office/drawing/2016/5/13/chartex" xmlns:cx8="http://schemas.microsoft.com/office/drawing/2016/5/14/chartex" xmlns:mc="http://schemas.openxmlformats.org/markup-compatibility/2006" xmlns:aink="http://schemas.microsoft.com/office/drawing/2016/ink" xmlns:am3d="http://schemas.microsoft.com/office/drawing/2017/model3d" xmlns:o="urn:schemas-microsoft-com:office:office" xmlns:oel="http://schemas.microsoft.com/office/2019/extlst" xmlns:r="http://schemas.openxmlformats.org/officeDocument/2006/relationships" xmlns:m="http://schemas.openxmlformats.org/officeDocument/2006/math" xmlns:v="urn:schemas-microsoft-com:vml" xmlns:wp14="http://schemas.microsoft.com/office/word/2010/wordprocessingDrawing" xmlns:wp="http://schemas.openxmlformats.org/drawingml/2006/wordprocessingDrawing" xmlns:w10="urn:schemas-microsoft-com:office:word" xmlns:w="http://schemas.openxmlformats.org/wordprocessingml/2006/main" xmlns:w14="http://schemas.microsoft.com/office/word/2010/wordml" xmlns:w15="http://schemas.microsoft.com/office/word/2012/wordml" xmlns:w16cex="http://schemas.microsoft.com/office/word/2018/wordml/cex" xmlns:w16cid="http://schemas.microsoft.com/office/word/2016/wordml/cid" xmlns:w16="http://schemas.microsoft.com/office/word/2018/wordml" xmlns:w16du="http://schemas.microsoft.com/office/word/2023/wordml/word16du" xmlns:w16sdtdh="http://schemas.microsoft.com/office/word/2020/wordml/sdtdatahash" xmlns:w16sdtfl="http://schemas.microsoft.com/office/word/2024/wordml/sdtformatlock" xmlns:w16se="http://schemas.microsoft.com/office/word/2015/wordml/symex" xmlns:wpg="http://schemas.microsoft.com/office/word/2010/wordprocessingGroup" xmlns:wpi="http://schemas.microsoft.com/office/word/2010/wordprocessingInk" xmlns:wne="http://schemas.microsoft.com/office/word/2006/wordml" xmlns:wps="http://schemas.microsoft.com/office/word/2010/wordprocessingShape" mc:Ignorable="w14 w15 w16se w16cid w16 w16cex w16sdtdh w16sdtfl w16du wp14">
   <w:endnote w:type="separator" w:id="-1">
     <w:p>
       <w:r>
@@ -7319,7 +8811,7 @@
 </file>
 
 <file path=word/footer1.xml><?xml version="1.0" encoding="utf-8"?>
-<w:ftr xmlns:wpc="http://schemas.microsoft.com/office/word/2010/wordprocessingCanvas" xmlns:cx="http://schemas.microsoft.com/office/drawing/2014/chartex" xmlns:cx1="http://schemas.microsoft.com/office/drawing/2015/9/8/chartex" xmlns:cx2="http://schemas.microsoft.com/office/drawing/2015/10/21/chartex" xmlns:cx3="http://schemas.microsoft.com/office/drawing/2016/5/9/chartex" xmlns:cx4="http://schemas.microsoft.com/office/drawing/2016/5/10/chartex" xmlns:cx5="http://schemas.microsoft.com/office/drawing/2016/5/11/chartex" xmlns:cx6="http://schemas.microsoft.com/office/drawing/2016/5/12/chartex" xmlns:cx7="http://schemas.microsoft.com/office/drawing/2016/5/13/chartex" xmlns:cx8="http://schemas.microsoft.com/office/drawing/2016/5/14/chartex" xmlns:mc="http://schemas.openxmlformats.org/markup-compatibility/2006" xmlns:aink="http://schemas.microsoft.com/office/drawing/2016/ink" xmlns:am3d="http://schemas.microsoft.com/office/drawing/2017/model3d" xmlns:o="urn:schemas-microsoft-com:office:office" xmlns:oel="http://schemas.microsoft.com/office/2019/extlst" xmlns:r="http://schemas.openxmlformats.org/officeDocument/2006/relationships" xmlns:m="http://schemas.openxmlformats.org/officeDocument/2006/math" xmlns:v="urn:schemas-microsoft-com:vml" xmlns:wp14="http://schemas.microsoft.com/office/word/2010/wordprocessingDrawing" xmlns:wp="http://schemas.openxmlformats.org/drawingml/2006/wordprocessingDrawing" xmlns:w10="urn:schemas-microsoft-com:office:word" xmlns:w="http://schemas.openxmlformats.org/wordprocessingml/2006/main" xmlns:w14="http://schemas.microsoft.com/office/word/2010/wordml" xmlns:w15="http://schemas.microsoft.com/office/word/2012/wordml" xmlns:w16cei="http://schemas.microsoft.com/office/word/2026/wordml/cei" xmlns:w16cex="http://schemas.microsoft.com/office/word/2018/wordml/cex" xmlns:w16cid="http://schemas.microsoft.com/office/word/2016/wordml/cid" xmlns:w16="http://schemas.microsoft.com/office/word/2018/wordml" xmlns:w16du="http://schemas.microsoft.com/office/word/2023/wordml/word16du" xmlns:w16sdtdh="http://schemas.microsoft.com/office/word/2020/wordml/sdtdatahash" xmlns:w16sdtfl="http://schemas.microsoft.com/office/word/2024/wordml/sdtformatlock" xmlns:w16se="http://schemas.microsoft.com/office/word/2015/wordml/symex" xmlns:wpg="http://schemas.microsoft.com/office/word/2010/wordprocessingGroup" xmlns:wpi="http://schemas.microsoft.com/office/word/2010/wordprocessingInk" xmlns:wne="http://schemas.microsoft.com/office/word/2006/wordml" xmlns:wps="http://schemas.microsoft.com/office/word/2010/wordprocessingShape" mc:Ignorable="w14 w15 w16se w16cid w16 w16cex w16sdtdh w16sdtfl w16du wp14">
+<w:ftr xmlns:wpc="http://schemas.microsoft.com/office/word/2010/wordprocessingCanvas" xmlns:cx="http://schemas.microsoft.com/office/drawing/2014/chartex" xmlns:cx1="http://schemas.microsoft.com/office/drawing/2015/9/8/chartex" xmlns:cx2="http://schemas.microsoft.com/office/drawing/2015/10/21/chartex" xmlns:cx3="http://schemas.microsoft.com/office/drawing/2016/5/9/chartex" xmlns:cx4="http://schemas.microsoft.com/office/drawing/2016/5/10/chartex" xmlns:cx5="http://schemas.microsoft.com/office/drawing/2016/5/11/chartex" xmlns:cx6="http://schemas.microsoft.com/office/drawing/2016/5/12/chartex" xmlns:cx7="http://schemas.microsoft.com/office/drawing/2016/5/13/chartex" xmlns:cx8="http://schemas.microsoft.com/office/drawing/2016/5/14/chartex" xmlns:mc="http://schemas.openxmlformats.org/markup-compatibility/2006" xmlns:aink="http://schemas.microsoft.com/office/drawing/2016/ink" xmlns:am3d="http://schemas.microsoft.com/office/drawing/2017/model3d" xmlns:o="urn:schemas-microsoft-com:office:office" xmlns:oel="http://schemas.microsoft.com/office/2019/extlst" xmlns:r="http://schemas.openxmlformats.org/officeDocument/2006/relationships" xmlns:m="http://schemas.openxmlformats.org/officeDocument/2006/math" xmlns:v="urn:schemas-microsoft-com:vml" xmlns:wp14="http://schemas.microsoft.com/office/word/2010/wordprocessingDrawing" xmlns:wp="http://schemas.openxmlformats.org/drawingml/2006/wordprocessingDrawing" xmlns:w10="urn:schemas-microsoft-com:office:word" xmlns:w="http://schemas.openxmlformats.org/wordprocessingml/2006/main" xmlns:w14="http://schemas.microsoft.com/office/word/2010/wordml" xmlns:w15="http://schemas.microsoft.com/office/word/2012/wordml" xmlns:w16cex="http://schemas.microsoft.com/office/word/2018/wordml/cex" xmlns:w16cid="http://schemas.microsoft.com/office/word/2016/wordml/cid" xmlns:w16="http://schemas.microsoft.com/office/word/2018/wordml" xmlns:w16du="http://schemas.microsoft.com/office/word/2023/wordml/word16du" xmlns:w16sdtdh="http://schemas.microsoft.com/office/word/2020/wordml/sdtdatahash" xmlns:w16sdtfl="http://schemas.microsoft.com/office/word/2024/wordml/sdtformatlock" xmlns:w16se="http://schemas.microsoft.com/office/word/2015/wordml/symex" xmlns:wpg="http://schemas.microsoft.com/office/word/2010/wordprocessingGroup" xmlns:wpi="http://schemas.microsoft.com/office/word/2010/wordprocessingInk" xmlns:wne="http://schemas.microsoft.com/office/word/2006/wordml" xmlns:wps="http://schemas.microsoft.com/office/word/2010/wordprocessingShape" mc:Ignorable="w14 w15 w16se w16cid w16 w16cex w16sdtdh w16sdtfl w16du wp14">
   <w:p>
     <w:pPr>
       <w:pStyle w:val="BodyText"/>
@@ -7398,7 +8890,7 @@
             </wp:anchor>
           </w:drawing>
         </mc:Choice>
-        <mc:Fallback>
+        <mc:Fallback xmlns:w16cei="http://schemas.microsoft.com/office/word/2026/wordml/cei">
           <w:pict>
             <v:shape w14:anchorId="7109D05F" id="Graphic 2" o:spid="_x0000_s1026" style="position:absolute;margin-left:70.85pt;margin-top:758.75pt;width:453.55pt;height:.1pt;z-index:-251657728;visibility:visible;mso-wrap-style:square;mso-wrap-distance-left:0;mso-wrap-distance-top:0;mso-wrap-distance-right:0;mso-wrap-distance-bottom:0;mso-position-horizontal:absolute;mso-position-horizontal-relative:page;mso-position-vertical:absolute;mso-position-vertical-relative:page;v-text-anchor:top" coordsize="5760085,1270" o:gfxdata="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" path="m,l5759996,e" filled="f" strokeweight=".14039mm">
               <v:path arrowok="t"/>
@@ -7555,7 +9047,7 @@
 </file>
 
 <file path=word/footnotes.xml><?xml version="1.0" encoding="utf-8"?>
-<w:footnotes xmlns:wpc="http://schemas.microsoft.com/office/word/2010/wordprocessingCanvas" xmlns:cx="http://schemas.microsoft.com/office/drawing/2014/chartex" xmlns:cx1="http://schemas.microsoft.com/office/drawing/2015/9/8/chartex" xmlns:cx2="http://schemas.microsoft.com/office/drawing/2015/10/21/chartex" xmlns:cx3="http://schemas.microsoft.com/office/drawing/2016/5/9/chartex" xmlns:cx4="http://schemas.microsoft.com/office/drawing/2016/5/10/chartex" xmlns:cx5="http://schemas.microsoft.com/office/drawing/2016/5/11/chartex" xmlns:cx6="http://schemas.microsoft.com/office/drawing/2016/5/12/chartex" xmlns:cx7="http://schemas.microsoft.com/office/drawing/2016/5/13/chartex" xmlns:cx8="http://schemas.microsoft.com/office/drawing/2016/5/14/chartex" xmlns:mc="http://schemas.openxmlformats.org/markup-compatibility/2006" xmlns:aink="http://schemas.microsoft.com/office/drawing/2016/ink" xmlns:am3d="http://schemas.microsoft.com/office/drawing/2017/model3d" xmlns:o="urn:schemas-microsoft-com:office:office" xmlns:oel="http://schemas.microsoft.com/office/2019/extlst" xmlns:r="http://schemas.openxmlformats.org/officeDocument/2006/relationships" xmlns:m="http://schemas.openxmlformats.org/officeDocument/2006/math" xmlns:v="urn:schemas-microsoft-com:vml" xmlns:wp14="http://schemas.microsoft.com/office/word/2010/wordprocessingDrawing" xmlns:wp="http://schemas.openxmlformats.org/drawingml/2006/wordprocessingDrawing" xmlns:w10="urn:schemas-microsoft-com:office:word" xmlns:w="http://schemas.openxmlformats.org/wordprocessingml/2006/main" xmlns:w14="http://schemas.microsoft.com/office/word/2010/wordml" xmlns:w15="http://schemas.microsoft.com/office/word/2012/wordml" xmlns:w16cei="http://schemas.microsoft.com/office/word/2026/wordml/cei" xmlns:w16cex="http://schemas.microsoft.com/office/word/2018/wordml/cex" xmlns:w16cid="http://schemas.microsoft.com/office/word/2016/wordml/cid" xmlns:w16="http://schemas.microsoft.com/office/word/2018/wordml" xmlns:w16du="http://schemas.microsoft.com/office/word/2023/wordml/word16du" xmlns:w16sdtdh="http://schemas.microsoft.com/office/word/2020/wordml/sdtdatahash" xmlns:w16sdtfl="http://schemas.microsoft.com/office/word/2024/wordml/sdtformatlock" xmlns:w16se="http://schemas.microsoft.com/office/word/2015/wordml/symex" xmlns:wpg="http://schemas.microsoft.com/office/word/2010/wordprocessingGroup" xmlns:wpi="http://schemas.microsoft.com/office/word/2010/wordprocessingInk" xmlns:wne="http://schemas.microsoft.com/office/word/2006/wordml" xmlns:wps="http://schemas.microsoft.com/office/word/2010/wordprocessingShape" mc:Ignorable="w14 w15 w16se w16cid w16 w16cex w16sdtdh w16sdtfl w16du wp14">
+<w:footnotes xmlns:wpc="http://schemas.microsoft.com/office/word/2010/wordprocessingCanvas" xmlns:cx="http://schemas.microsoft.com/office/drawing/2014/chartex" xmlns:cx1="http://schemas.microsoft.com/office/drawing/2015/9/8/chartex" xmlns:cx2="http://schemas.microsoft.com/office/drawing/2015/10/21/chartex" xmlns:cx3="http://schemas.microsoft.com/office/drawing/2016/5/9/chartex" xmlns:cx4="http://schemas.microsoft.com/office/drawing/2016/5/10/chartex" xmlns:cx5="http://schemas.microsoft.com/office/drawing/2016/5/11/chartex" xmlns:cx6="http://schemas.microsoft.com/office/drawing/2016/5/12/chartex" xmlns:cx7="http://schemas.microsoft.com/office/drawing/2016/5/13/chartex" xmlns:cx8="http://schemas.microsoft.com/office/drawing/2016/5/14/chartex" xmlns:mc="http://schemas.openxmlformats.org/markup-compatibility/2006" xmlns:aink="http://schemas.microsoft.com/office/drawing/2016/ink" xmlns:am3d="http://schemas.microsoft.com/office/drawing/2017/model3d" xmlns:o="urn:schemas-microsoft-com:office:office" xmlns:oel="http://schemas.microsoft.com/office/2019/extlst" xmlns:r="http://schemas.openxmlformats.org/officeDocument/2006/relationships" xmlns:m="http://schemas.openxmlformats.org/officeDocument/2006/math" xmlns:v="urn:schemas-microsoft-com:vml" xmlns:wp14="http://schemas.microsoft.com/office/word/2010/wordprocessingDrawing" xmlns:wp="http://schemas.openxmlformats.org/drawingml/2006/wordprocessingDrawing" xmlns:w10="urn:schemas-microsoft-com:office:word" xmlns:w="http://schemas.openxmlformats.org/wordprocessingml/2006/main" xmlns:w14="http://schemas.microsoft.com/office/word/2010/wordml" xmlns:w15="http://schemas.microsoft.com/office/word/2012/wordml" xmlns:w16cex="http://schemas.microsoft.com/office/word/2018/wordml/cex" xmlns:w16cid="http://schemas.microsoft.com/office/word/2016/wordml/cid" xmlns:w16="http://schemas.microsoft.com/office/word/2018/wordml" xmlns:w16du="http://schemas.microsoft.com/office/word/2023/wordml/word16du" xmlns:w16sdtdh="http://schemas.microsoft.com/office/word/2020/wordml/sdtdatahash" xmlns:w16sdtfl="http://schemas.microsoft.com/office/word/2024/wordml/sdtformatlock" xmlns:w16se="http://schemas.microsoft.com/office/word/2015/wordml/symex" xmlns:wpg="http://schemas.microsoft.com/office/word/2010/wordprocessingGroup" xmlns:wpi="http://schemas.microsoft.com/office/word/2010/wordprocessingInk" xmlns:wne="http://schemas.microsoft.com/office/word/2006/wordml" xmlns:wps="http://schemas.microsoft.com/office/word/2010/wordprocessingShape" mc:Ignorable="w14 w15 w16se w16cid w16 w16cex w16sdtdh w16sdtfl w16du wp14">
   <w:footnote w:type="separator" w:id="-1">
     <w:p>
       <w:r>
@@ -7574,7 +9066,7 @@
 </file>
 
 <file path=word/header1.xml><?xml version="1.0" encoding="utf-8"?>
-<w:hdr xmlns:wpc="http://schemas.microsoft.com/office/word/2010/wordprocessingCanvas" xmlns:cx="http://schemas.microsoft.com/office/drawing/2014/chartex" xmlns:cx1="http://schemas.microsoft.com/office/drawing/2015/9/8/chartex" xmlns:cx2="http://schemas.microsoft.com/office/drawing/2015/10/21/chartex" xmlns:cx3="http://schemas.microsoft.com/office/drawing/2016/5/9/chartex" xmlns:cx4="http://schemas.microsoft.com/office/drawing/2016/5/10/chartex" xmlns:cx5="http://schemas.microsoft.com/office/drawing/2016/5/11/chartex" xmlns:cx6="http://schemas.microsoft.com/office/drawing/2016/5/12/chartex" xmlns:cx7="http://schemas.microsoft.com/office/drawing/2016/5/13/chartex" xmlns:cx8="http://schemas.microsoft.com/office/drawing/2016/5/14/chartex" xmlns:mc="http://schemas.openxmlformats.org/markup-compatibility/2006" xmlns:aink="http://schemas.microsoft.com/office/drawing/2016/ink" xmlns:am3d="http://schemas.microsoft.com/office/drawing/2017/model3d" xmlns:o="urn:schemas-microsoft-com:office:office" xmlns:oel="http://schemas.microsoft.com/office/2019/extlst" xmlns:r="http://schemas.openxmlformats.org/officeDocument/2006/relationships" xmlns:m="http://schemas.openxmlformats.org/officeDocument/2006/math" xmlns:v="urn:schemas-microsoft-com:vml" xmlns:wp14="http://schemas.microsoft.com/office/word/2010/wordprocessingDrawing" xmlns:wp="http://schemas.openxmlformats.org/drawingml/2006/wordprocessingDrawing" xmlns:w10="urn:schemas-microsoft-com:office:word" xmlns:w="http://schemas.openxmlformats.org/wordprocessingml/2006/main" xmlns:w14="http://schemas.microsoft.com/office/word/2010/wordml" xmlns:w15="http://schemas.microsoft.com/office/word/2012/wordml" xmlns:w16cei="http://schemas.microsoft.com/office/word/2026/wordml/cei" xmlns:w16cex="http://schemas.microsoft.com/office/word/2018/wordml/cex" xmlns:w16cid="http://schemas.microsoft.com/office/word/2016/wordml/cid" xmlns:w16="http://schemas.microsoft.com/office/word/2018/wordml" xmlns:w16du="http://schemas.microsoft.com/office/word/2023/wordml/word16du" xmlns:w16sdtdh="http://schemas.microsoft.com/office/word/2020/wordml/sdtdatahash" xmlns:w16sdtfl="http://schemas.microsoft.com/office/word/2024/wordml/sdtformatlock" xmlns:w16se="http://schemas.microsoft.com/office/word/2015/wordml/symex" xmlns:wpg="http://schemas.microsoft.com/office/word/2010/wordprocessingGroup" xmlns:wpi="http://schemas.microsoft.com/office/word/2010/wordprocessingInk" xmlns:wne="http://schemas.microsoft.com/office/word/2006/wordml" xmlns:wps="http://schemas.microsoft.com/office/word/2010/wordprocessingShape" mc:Ignorable="w14 w15 w16se w16cid w16 w16cex w16sdtdh w16sdtfl w16du wp14">
+<w:hdr xmlns:wpc="http://schemas.microsoft.com/office/word/2010/wordprocessingCanvas" xmlns:cx="http://schemas.microsoft.com/office/drawing/2014/chartex" xmlns:cx1="http://schemas.microsoft.com/office/drawing/2015/9/8/chartex" xmlns:cx2="http://schemas.microsoft.com/office/drawing/2015/10/21/chartex" xmlns:cx3="http://schemas.microsoft.com/office/drawing/2016/5/9/chartex" xmlns:cx4="http://schemas.microsoft.com/office/drawing/2016/5/10/chartex" xmlns:cx5="http://schemas.microsoft.com/office/drawing/2016/5/11/chartex" xmlns:cx6="http://schemas.microsoft.com/office/drawing/2016/5/12/chartex" xmlns:cx7="http://schemas.microsoft.com/office/drawing/2016/5/13/chartex" xmlns:cx8="http://schemas.microsoft.com/office/drawing/2016/5/14/chartex" xmlns:mc="http://schemas.openxmlformats.org/markup-compatibility/2006" xmlns:aink="http://schemas.microsoft.com/office/drawing/2016/ink" xmlns:am3d="http://schemas.microsoft.com/office/drawing/2017/model3d" xmlns:o="urn:schemas-microsoft-com:office:office" xmlns:oel="http://schemas.microsoft.com/office/2019/extlst" xmlns:r="http://schemas.openxmlformats.org/officeDocument/2006/relationships" xmlns:m="http://schemas.openxmlformats.org/officeDocument/2006/math" xmlns:v="urn:schemas-microsoft-com:vml" xmlns:wp14="http://schemas.microsoft.com/office/word/2010/wordprocessingDrawing" xmlns:wp="http://schemas.openxmlformats.org/drawingml/2006/wordprocessingDrawing" xmlns:w10="urn:schemas-microsoft-com:office:word" xmlns:w="http://schemas.openxmlformats.org/wordprocessingml/2006/main" xmlns:w14="http://schemas.microsoft.com/office/word/2010/wordml" xmlns:w15="http://schemas.microsoft.com/office/word/2012/wordml" xmlns:w16cex="http://schemas.microsoft.com/office/word/2018/wordml/cex" xmlns:w16cid="http://schemas.microsoft.com/office/word/2016/wordml/cid" xmlns:w16="http://schemas.microsoft.com/office/word/2018/wordml" xmlns:w16du="http://schemas.microsoft.com/office/word/2023/wordml/word16du" xmlns:w16sdtdh="http://schemas.microsoft.com/office/word/2020/wordml/sdtdatahash" xmlns:w16sdtfl="http://schemas.microsoft.com/office/word/2024/wordml/sdtformatlock" xmlns:w16se="http://schemas.microsoft.com/office/word/2015/wordml/symex" xmlns:wpg="http://schemas.microsoft.com/office/word/2010/wordprocessingGroup" xmlns:wpi="http://schemas.microsoft.com/office/word/2010/wordprocessingInk" xmlns:wne="http://schemas.microsoft.com/office/word/2006/wordml" xmlns:wps="http://schemas.microsoft.com/office/word/2010/wordprocessingShape" mc:Ignorable="w14 w15 w16se w16cid w16 w16cex w16sdtdh w16sdtfl w16du wp14">
   <w:p>
     <w:pPr>
       <w:pStyle w:val="BodyText"/>
@@ -7653,7 +9145,7 @@
             </wp:anchor>
           </w:drawing>
         </mc:Choice>
-        <mc:Fallback>
+        <mc:Fallback xmlns:w16cei="http://schemas.microsoft.com/office/word/2026/wordml/cei">
           <w:pict>
             <v:shape w14:anchorId="002C8FB4" id="Graphic 1" o:spid="_x0000_s1026" style="position:absolute;margin-left:70.85pt;margin-top:88pt;width:453.55pt;height:.1pt;z-index:-251660800;visibility:visible;mso-wrap-style:square;mso-wrap-distance-left:0;mso-wrap-distance-top:0;mso-wrap-distance-right:0;mso-wrap-distance-bottom:0;mso-position-horizontal:absolute;mso-position-horizontal-relative:page;mso-position-vertical:absolute;mso-position-vertical-relative:page;v-text-anchor:top" coordsize="5760085,1270" o:gfxdata="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" path="m,l5759996,e" filled="f" strokeweight=".14039mm">
               <v:path arrowok="t"/>
@@ -7668,7 +9160,7 @@
 </file>
 
 <file path=word/numbering.xml><?xml version="1.0" encoding="utf-8"?>
-<w:numbering xmlns:wpc="http://schemas.microsoft.com/office/word/2010/wordprocessingCanvas" xmlns:cx="http://schemas.microsoft.com/office/drawing/2014/chartex" xmlns:cx1="http://schemas.microsoft.com/office/drawing/2015/9/8/chartex" xmlns:cx2="http://schemas.microsoft.com/office/drawing/2015/10/21/chartex" xmlns:cx3="http://schemas.microsoft.com/office/drawing/2016/5/9/chartex" xmlns:cx4="http://schemas.microsoft.com/office/drawing/2016/5/10/chartex" xmlns:cx5="http://schemas.microsoft.com/office/drawing/2016/5/11/chartex" xmlns:cx6="http://schemas.microsoft.com/office/drawing/2016/5/12/chartex" xmlns:cx7="http://schemas.microsoft.com/office/drawing/2016/5/13/chartex" xmlns:cx8="http://schemas.microsoft.com/office/drawing/2016/5/14/chartex" xmlns:mc="http://schemas.openxmlformats.org/markup-compatibility/2006" xmlns:aink="http://schemas.microsoft.com/office/drawing/2016/ink" xmlns:am3d="http://schemas.microsoft.com/office/drawing/2017/model3d" xmlns:o="urn:schemas-microsoft-com:office:office" xmlns:oel="http://schemas.microsoft.com/office/2019/extlst" xmlns:r="http://schemas.openxmlformats.org/officeDocument/2006/relationships" xmlns:m="http://schemas.openxmlformats.org/officeDocument/2006/math" xmlns:v="urn:schemas-microsoft-com:vml" xmlns:wp14="http://schemas.microsoft.com/office/word/2010/wordprocessingDrawing" xmlns:wp="http://schemas.openxmlformats.org/drawingml/2006/wordprocessingDrawing" xmlns:w10="urn:schemas-microsoft-com:office:word" xmlns:w="http://schemas.openxmlformats.org/wordprocessingml/2006/main" xmlns:w14="http://schemas.microsoft.com/office/word/2010/wordml" xmlns:w15="http://schemas.microsoft.com/office/word/2012/wordml" xmlns:w16cei="http://schemas.microsoft.com/office/word/2026/wordml/cei" xmlns:w16cex="http://schemas.microsoft.com/office/word/2018/wordml/cex" xmlns:w16cid="http://schemas.microsoft.com/office/word/2016/wordml/cid" xmlns:w16="http://schemas.microsoft.com/office/word/2018/wordml" xmlns:w16du="http://schemas.microsoft.com/office/word/2023/wordml/word16du" xmlns:w16sdtdh="http://schemas.microsoft.com/office/word/2020/wordml/sdtdatahash" xmlns:w16sdtfl="http://schemas.microsoft.com/office/word/2024/wordml/sdtformatlock" xmlns:w16se="http://schemas.microsoft.com/office/word/2015/wordml/symex" xmlns:wpg="http://schemas.microsoft.com/office/word/2010/wordprocessingGroup" xmlns:wpi="http://schemas.microsoft.com/office/word/2010/wordprocessingInk" xmlns:wne="http://schemas.microsoft.com/office/word/2006/wordml" xmlns:wps="http://schemas.microsoft.com/office/word/2010/wordprocessingShape" mc:Ignorable="w14 w15 w16se w16cid w16 w16cex w16sdtdh w16sdtfl w16du wp14">
+<w:numbering xmlns:wpc="http://schemas.microsoft.com/office/word/2010/wordprocessingCanvas" xmlns:cx="http://schemas.microsoft.com/office/drawing/2014/chartex" xmlns:cx1="http://schemas.microsoft.com/office/drawing/2015/9/8/chartex" xmlns:cx2="http://schemas.microsoft.com/office/drawing/2015/10/21/chartex" xmlns:cx3="http://schemas.microsoft.com/office/drawing/2016/5/9/chartex" xmlns:cx4="http://schemas.microsoft.com/office/drawing/2016/5/10/chartex" xmlns:cx5="http://schemas.microsoft.com/office/drawing/2016/5/11/chartex" xmlns:cx6="http://schemas.microsoft.com/office/drawing/2016/5/12/chartex" xmlns:cx7="http://schemas.microsoft.com/office/drawing/2016/5/13/chartex" xmlns:cx8="http://schemas.microsoft.com/office/drawing/2016/5/14/chartex" xmlns:mc="http://schemas.openxmlformats.org/markup-compatibility/2006" xmlns:aink="http://schemas.microsoft.com/office/drawing/2016/ink" xmlns:am3d="http://schemas.microsoft.com/office/drawing/2017/model3d" xmlns:o="urn:schemas-microsoft-com:office:office" xmlns:oel="http://schemas.microsoft.com/office/2019/extlst" xmlns:r="http://schemas.openxmlformats.org/officeDocument/2006/relationships" xmlns:m="http://schemas.openxmlformats.org/officeDocument/2006/math" xmlns:v="urn:schemas-microsoft-com:vml" xmlns:wp14="http://schemas.microsoft.com/office/word/2010/wordprocessingDrawing" xmlns:wp="http://schemas.openxmlformats.org/drawingml/2006/wordprocessingDrawing" xmlns:w10="urn:schemas-microsoft-com:office:word" xmlns:w="http://schemas.openxmlformats.org/wordprocessingml/2006/main" xmlns:w14="http://schemas.microsoft.com/office/word/2010/wordml" xmlns:w15="http://schemas.microsoft.com/office/word/2012/wordml" xmlns:w16cex="http://schemas.microsoft.com/office/word/2018/wordml/cex" xmlns:w16cid="http://schemas.microsoft.com/office/word/2016/wordml/cid" xmlns:w16="http://schemas.microsoft.com/office/word/2018/wordml" xmlns:w16du="http://schemas.microsoft.com/office/word/2023/wordml/word16du" xmlns:w16sdtdh="http://schemas.microsoft.com/office/word/2020/wordml/sdtdatahash" xmlns:w16sdtfl="http://schemas.microsoft.com/office/word/2024/wordml/sdtformatlock" xmlns:w16se="http://schemas.microsoft.com/office/word/2015/wordml/symex" xmlns:wpg="http://schemas.microsoft.com/office/word/2010/wordprocessingGroup" xmlns:wpi="http://schemas.microsoft.com/office/word/2010/wordprocessingInk" xmlns:wne="http://schemas.microsoft.com/office/word/2006/wordml" xmlns:wps="http://schemas.microsoft.com/office/word/2010/wordprocessingShape" mc:Ignorable="w14 w15 w16se w16cid w16 w16cex w16sdtdh w16sdtfl w16du wp14">
   <w:abstractNum w:abstractNumId="0" w15:restartNumberingAfterBreak="0">
     <w:nsid w:val="178208EB"/>
     <w:multiLevelType w:val="multilevel"/>
@@ -7819,6 +9311,123 @@
     </w:lvl>
   </w:abstractNum>
   <w:abstractNum w:abstractNumId="1" w15:restartNumberingAfterBreak="0">
+    <w:nsid w:val="38AB2CD5"/>
+    <w:multiLevelType w:val="multilevel"/>
+    <w:tmpl w:val="3500B7AA"/>
+    <w:lvl w:ilvl="0">
+      <w:start w:val="1"/>
+      <w:numFmt w:val="decimal"/>
+      <w:lvlText w:val="%1."/>
+      <w:lvlJc w:val="left"/>
+      <w:pPr>
+        <w:tabs>
+          <w:tab w:val="num" w:pos="720"/>
+        </w:tabs>
+        <w:ind w:left="720" w:hanging="360"/>
+      </w:pPr>
+    </w:lvl>
+    <w:lvl w:ilvl="1">
+      <w:start w:val="1"/>
+      <w:numFmt w:val="bullet"/>
+      <w:lvlText w:val="o"/>
+      <w:lvlJc w:val="left"/>
+      <w:pPr>
+        <w:tabs>
+          <w:tab w:val="num" w:pos="1440"/>
+        </w:tabs>
+        <w:ind w:left="1440" w:hanging="360"/>
+      </w:pPr>
+      <w:rPr>
+        <w:rFonts w:ascii="Courier New" w:hAnsi="Courier New" w:hint="default"/>
+        <w:sz w:val="20"/>
+      </w:rPr>
+    </w:lvl>
+    <w:lvl w:ilvl="2" w:tentative="1">
+      <w:start w:val="1"/>
+      <w:numFmt w:val="decimal"/>
+      <w:lvlText w:val="%3."/>
+      <w:lvlJc w:val="left"/>
+      <w:pPr>
+        <w:tabs>
+          <w:tab w:val="num" w:pos="2160"/>
+        </w:tabs>
+        <w:ind w:left="2160" w:hanging="360"/>
+      </w:pPr>
+    </w:lvl>
+    <w:lvl w:ilvl="3" w:tentative="1">
+      <w:start w:val="1"/>
+      <w:numFmt w:val="decimal"/>
+      <w:lvlText w:val="%4."/>
+      <w:lvlJc w:val="left"/>
+      <w:pPr>
+        <w:tabs>
+          <w:tab w:val="num" w:pos="2880"/>
+        </w:tabs>
+        <w:ind w:left="2880" w:hanging="360"/>
+      </w:pPr>
+    </w:lvl>
+    <w:lvl w:ilvl="4" w:tentative="1">
+      <w:start w:val="1"/>
+      <w:numFmt w:val="decimal"/>
+      <w:lvlText w:val="%5."/>
+      <w:lvlJc w:val="left"/>
+      <w:pPr>
+        <w:tabs>
+          <w:tab w:val="num" w:pos="3600"/>
+        </w:tabs>
+        <w:ind w:left="3600" w:hanging="360"/>
+      </w:pPr>
+    </w:lvl>
+    <w:lvl w:ilvl="5" w:tentative="1">
+      <w:start w:val="1"/>
+      <w:numFmt w:val="decimal"/>
+      <w:lvlText w:val="%6."/>
+      <w:lvlJc w:val="left"/>
+      <w:pPr>
+        <w:tabs>
+          <w:tab w:val="num" w:pos="4320"/>
+        </w:tabs>
+        <w:ind w:left="4320" w:hanging="360"/>
+      </w:pPr>
+    </w:lvl>
+    <w:lvl w:ilvl="6" w:tentative="1">
+      <w:start w:val="1"/>
+      <w:numFmt w:val="decimal"/>
+      <w:lvlText w:val="%7."/>
+      <w:lvlJc w:val="left"/>
+      <w:pPr>
+        <w:tabs>
+          <w:tab w:val="num" w:pos="5040"/>
+        </w:tabs>
+        <w:ind w:left="5040" w:hanging="360"/>
+      </w:pPr>
+    </w:lvl>
+    <w:lvl w:ilvl="7" w:tentative="1">
+      <w:start w:val="1"/>
+      <w:numFmt w:val="decimal"/>
+      <w:lvlText w:val="%8."/>
+      <w:lvlJc w:val="left"/>
+      <w:pPr>
+        <w:tabs>
+          <w:tab w:val="num" w:pos="5760"/>
+        </w:tabs>
+        <w:ind w:left="5760" w:hanging="360"/>
+      </w:pPr>
+    </w:lvl>
+    <w:lvl w:ilvl="8" w:tentative="1">
+      <w:start w:val="1"/>
+      <w:numFmt w:val="decimal"/>
+      <w:lvlText w:val="%9."/>
+      <w:lvlJc w:val="left"/>
+      <w:pPr>
+        <w:tabs>
+          <w:tab w:val="num" w:pos="6480"/>
+        </w:tabs>
+        <w:ind w:left="6480" w:hanging="360"/>
+      </w:pPr>
+    </w:lvl>
+  </w:abstractNum>
+  <w:abstractNum w:abstractNumId="2" w15:restartNumberingAfterBreak="0">
     <w:nsid w:val="46A74210"/>
     <w:multiLevelType w:val="multilevel"/>
     <w:tmpl w:val="53D234C8"/>
@@ -7967,7 +9576,156 @@
       </w:rPr>
     </w:lvl>
   </w:abstractNum>
-  <w:abstractNum w:abstractNumId="2" w15:restartNumberingAfterBreak="0">
+  <w:abstractNum w:abstractNumId="3" w15:restartNumberingAfterBreak="0">
+    <w:nsid w:val="48D12E70"/>
+    <w:multiLevelType w:val="multilevel"/>
+    <w:tmpl w:val="95D80154"/>
+    <w:lvl w:ilvl="0">
+      <w:start w:val="1"/>
+      <w:numFmt w:val="bullet"/>
+      <w:lvlText w:val=""/>
+      <w:lvlJc w:val="left"/>
+      <w:pPr>
+        <w:tabs>
+          <w:tab w:val="num" w:pos="720"/>
+        </w:tabs>
+        <w:ind w:left="720" w:hanging="360"/>
+      </w:pPr>
+      <w:rPr>
+        <w:rFonts w:ascii="Symbol" w:hAnsi="Symbol" w:hint="default"/>
+        <w:sz w:val="20"/>
+      </w:rPr>
+    </w:lvl>
+    <w:lvl w:ilvl="1" w:tentative="1">
+      <w:start w:val="1"/>
+      <w:numFmt w:val="bullet"/>
+      <w:lvlText w:val="o"/>
+      <w:lvlJc w:val="left"/>
+      <w:pPr>
+        <w:tabs>
+          <w:tab w:val="num" w:pos="1440"/>
+        </w:tabs>
+        <w:ind w:left="1440" w:hanging="360"/>
+      </w:pPr>
+      <w:rPr>
+        <w:rFonts w:ascii="Courier New" w:hAnsi="Courier New" w:hint="default"/>
+        <w:sz w:val="20"/>
+      </w:rPr>
+    </w:lvl>
+    <w:lvl w:ilvl="2" w:tentative="1">
+      <w:start w:val="1"/>
+      <w:numFmt w:val="bullet"/>
+      <w:lvlText w:val=""/>
+      <w:lvlJc w:val="left"/>
+      <w:pPr>
+        <w:tabs>
+          <w:tab w:val="num" w:pos="2160"/>
+        </w:tabs>
+        <w:ind w:left="2160" w:hanging="360"/>
+      </w:pPr>
+      <w:rPr>
+        <w:rFonts w:ascii="Wingdings" w:hAnsi="Wingdings" w:hint="default"/>
+        <w:sz w:val="20"/>
+      </w:rPr>
+    </w:lvl>
+    <w:lvl w:ilvl="3" w:tentative="1">
+      <w:start w:val="1"/>
+      <w:numFmt w:val="bullet"/>
+      <w:lvlText w:val=""/>
+      <w:lvlJc w:val="left"/>
+      <w:pPr>
+        <w:tabs>
+          <w:tab w:val="num" w:pos="2880"/>
+        </w:tabs>
+        <w:ind w:left="2880" w:hanging="360"/>
+      </w:pPr>
+      <w:rPr>
+        <w:rFonts w:ascii="Wingdings" w:hAnsi="Wingdings" w:hint="default"/>
+        <w:sz w:val="20"/>
+      </w:rPr>
+    </w:lvl>
+    <w:lvl w:ilvl="4" w:tentative="1">
+      <w:start w:val="1"/>
+      <w:numFmt w:val="bullet"/>
+      <w:lvlText w:val=""/>
+      <w:lvlJc w:val="left"/>
+      <w:pPr>
+        <w:tabs>
+          <w:tab w:val="num" w:pos="3600"/>
+        </w:tabs>
+        <w:ind w:left="3600" w:hanging="360"/>
+      </w:pPr>
+      <w:rPr>
+        <w:rFonts w:ascii="Wingdings" w:hAnsi="Wingdings" w:hint="default"/>
+        <w:sz w:val="20"/>
+      </w:rPr>
+    </w:lvl>
+    <w:lvl w:ilvl="5" w:tentative="1">
+      <w:start w:val="1"/>
+      <w:numFmt w:val="bullet"/>
+      <w:lvlText w:val=""/>
+      <w:lvlJc w:val="left"/>
+      <w:pPr>
+        <w:tabs>
+          <w:tab w:val="num" w:pos="4320"/>
+        </w:tabs>
+        <w:ind w:left="4320" w:hanging="360"/>
+      </w:pPr>
+      <w:rPr>
+        <w:rFonts w:ascii="Wingdings" w:hAnsi="Wingdings" w:hint="default"/>
+        <w:sz w:val="20"/>
+      </w:rPr>
+    </w:lvl>
+    <w:lvl w:ilvl="6" w:tentative="1">
+      <w:start w:val="1"/>
+      <w:numFmt w:val="bullet"/>
+      <w:lvlText w:val=""/>
+      <w:lvlJc w:val="left"/>
+      <w:pPr>
+        <w:tabs>
+          <w:tab w:val="num" w:pos="5040"/>
+        </w:tabs>
+        <w:ind w:left="5040" w:hanging="360"/>
+      </w:pPr>
+      <w:rPr>
+        <w:rFonts w:ascii="Wingdings" w:hAnsi="Wingdings" w:hint="default"/>
+        <w:sz w:val="20"/>
+      </w:rPr>
+    </w:lvl>
+    <w:lvl w:ilvl="7" w:tentative="1">
+      <w:start w:val="1"/>
+      <w:numFmt w:val="bullet"/>
+      <w:lvlText w:val=""/>
+      <w:lvlJc w:val="left"/>
+      <w:pPr>
+        <w:tabs>
+          <w:tab w:val="num" w:pos="5760"/>
+        </w:tabs>
+        <w:ind w:left="5760" w:hanging="360"/>
+      </w:pPr>
+      <w:rPr>
+        <w:rFonts w:ascii="Wingdings" w:hAnsi="Wingdings" w:hint="default"/>
+        <w:sz w:val="20"/>
+      </w:rPr>
+    </w:lvl>
+    <w:lvl w:ilvl="8" w:tentative="1">
+      <w:start w:val="1"/>
+      <w:numFmt w:val="bullet"/>
+      <w:lvlText w:val=""/>
+      <w:lvlJc w:val="left"/>
+      <w:pPr>
+        <w:tabs>
+          <w:tab w:val="num" w:pos="6480"/>
+        </w:tabs>
+        <w:ind w:left="6480" w:hanging="360"/>
+      </w:pPr>
+      <w:rPr>
+        <w:rFonts w:ascii="Wingdings" w:hAnsi="Wingdings" w:hint="default"/>
+        <w:sz w:val="20"/>
+      </w:rPr>
+    </w:lvl>
+  </w:abstractNum>
+  <w:abstractNum w:abstractNumId="4" w15:restartNumberingAfterBreak="0">
     <w:nsid w:val="52722A4C"/>
     <w:multiLevelType w:val="multilevel"/>
     <w:tmpl w:val="6E54F87E"/>
@@ -8079,7 +9837,7 @@
       </w:pPr>
     </w:lvl>
   </w:abstractNum>
-  <w:abstractNum w:abstractNumId="3" w15:restartNumberingAfterBreak="0">
+  <w:abstractNum w:abstractNumId="5" w15:restartNumberingAfterBreak="0">
     <w:nsid w:val="6AD002F4"/>
     <w:multiLevelType w:val="hybridMultilevel"/>
     <w:tmpl w:val="17DA8B20"/>
@@ -8192,7 +9950,7 @@
       </w:rPr>
     </w:lvl>
   </w:abstractNum>
-  <w:abstractNum w:abstractNumId="4" w15:restartNumberingAfterBreak="0">
+  <w:abstractNum w:abstractNumId="6" w15:restartNumberingAfterBreak="0">
     <w:nsid w:val="73BF2FDB"/>
     <w:multiLevelType w:val="hybridMultilevel"/>
     <w:tmpl w:val="4C249776"/>
@@ -8279,7 +10037,7 @@
       </w:pPr>
     </w:lvl>
   </w:abstractNum>
-  <w:abstractNum w:abstractNumId="5" w15:restartNumberingAfterBreak="0">
+  <w:abstractNum w:abstractNumId="7" w15:restartNumberingAfterBreak="0">
     <w:nsid w:val="7B925688"/>
     <w:multiLevelType w:val="multilevel"/>
     <w:tmpl w:val="CC383196"/>
@@ -8428,7 +10186,7 @@
       </w:rPr>
     </w:lvl>
   </w:abstractNum>
-  <w:abstractNum w:abstractNumId="6" w15:restartNumberingAfterBreak="0">
+  <w:abstractNum w:abstractNumId="8" w15:restartNumberingAfterBreak="0">
     <w:nsid w:val="7D8B003B"/>
     <w:multiLevelType w:val="multilevel"/>
     <w:tmpl w:val="155A8E60"/>
@@ -8581,22 +10339,28 @@
     <w:abstractNumId w:val="0"/>
   </w:num>
   <w:num w:numId="2" w16cid:durableId="1008020004">
+    <w:abstractNumId w:val="5"/>
+  </w:num>
+  <w:num w:numId="3" w16cid:durableId="2058430444">
+    <w:abstractNumId w:val="4"/>
+  </w:num>
+  <w:num w:numId="4" w16cid:durableId="1045637779">
+    <w:abstractNumId w:val="6"/>
+  </w:num>
+  <w:num w:numId="5" w16cid:durableId="1758211369">
+    <w:abstractNumId w:val="7"/>
+  </w:num>
+  <w:num w:numId="6" w16cid:durableId="851988434">
+    <w:abstractNumId w:val="2"/>
+  </w:num>
+  <w:num w:numId="7" w16cid:durableId="848449241">
+    <w:abstractNumId w:val="8"/>
+  </w:num>
+  <w:num w:numId="8" w16cid:durableId="768429706">
     <w:abstractNumId w:val="3"/>
   </w:num>
-  <w:num w:numId="3" w16cid:durableId="2058430444">
-    <w:abstractNumId w:val="2"/>
-  </w:num>
-  <w:num w:numId="4" w16cid:durableId="1045637779">
-    <w:abstractNumId w:val="4"/>
-  </w:num>
-  <w:num w:numId="5" w16cid:durableId="1758211369">
-    <w:abstractNumId w:val="5"/>
-  </w:num>
-  <w:num w:numId="6" w16cid:durableId="851988434">
+  <w:num w:numId="9" w16cid:durableId="1052776161">
     <w:abstractNumId w:val="1"/>
-  </w:num>
-  <w:num w:numId="7" w16cid:durableId="848449241">
-    <w:abstractNumId w:val="6"/>
   </w:num>
   <w:numIdMacAtCleanup w:val="7"/>
 </w:numbering>

</xml_diff>

<commit_message>
Readme of the preparation data procedures
</commit_message>
<xml_diff>
--- a/Readme - Notebooks - Validation phase.docx
+++ b/Readme - Notebooks - Validation phase.docx
@@ -75,10 +75,259 @@
     </w:p>
     <w:p>
       <w:pPr>
-        <w:rPr>
-          <w:lang w:val="pt-BR"/>
-        </w:rPr>
-      </w:pPr>
+        <w:pStyle w:val="Heading1"/>
+        <w:rPr>
+          <w:w w:val="90"/>
+          <w:lang w:val="pt-BR"/>
+        </w:rPr>
+      </w:pPr>
+      <w:r>
+        <w:t xml:space="preserve">Base folder: </w:t>
+      </w:r>
+    </w:p>
+    <w:p>
+      <w:pPr>
+        <w:pStyle w:val="Heading1"/>
+        <w:numPr>
+          <w:ilvl w:val="0"/>
+          <w:numId w:val="0"/>
+        </w:numPr>
+        <w:ind w:left="502"/>
+      </w:pPr>
+    </w:p>
+    <w:p>
+      <w:pPr>
+        <w:rPr>
+          <w:lang w:val="pt-BR"/>
+        </w:rPr>
+      </w:pPr>
+      <w:r>
+        <w:rPr>
+          <w:lang w:val="pt-BR"/>
+        </w:rPr>
+        <w:t xml:space="preserve">Phase 3 - </w:t>
+      </w:r>
+      <w:proofErr w:type="spellStart"/>
+      <w:r>
+        <w:rPr>
+          <w:lang w:val="pt-BR"/>
+        </w:rPr>
+        <w:t>Scale</w:t>
+      </w:r>
+      <w:proofErr w:type="spellEnd"/>
+      <w:r>
+        <w:rPr>
+          <w:lang w:val="pt-BR"/>
+        </w:rPr>
+        <w:t xml:space="preserve"> </w:t>
+      </w:r>
+      <w:proofErr w:type="spellStart"/>
+      <w:r>
+        <w:rPr>
+          <w:lang w:val="pt-BR"/>
+        </w:rPr>
+        <w:t>Validation</w:t>
+      </w:r>
+      <w:proofErr w:type="spellEnd"/>
+      <w:r>
+        <w:rPr>
+          <w:lang w:val="pt-BR"/>
+        </w:rPr>
+        <w:t xml:space="preserve">: </w:t>
+      </w:r>
+      <w:proofErr w:type="spellStart"/>
+      <w:r>
+        <w:rPr>
+          <w:lang w:val="pt-BR"/>
+        </w:rPr>
+        <w:t>this</w:t>
+      </w:r>
+      <w:proofErr w:type="spellEnd"/>
+      <w:r>
+        <w:rPr>
+          <w:lang w:val="pt-BR"/>
+        </w:rPr>
+        <w:t xml:space="preserve"> folder </w:t>
+      </w:r>
+      <w:proofErr w:type="spellStart"/>
+      <w:r>
+        <w:rPr>
+          <w:lang w:val="pt-BR"/>
+        </w:rPr>
+        <w:t>was</w:t>
+      </w:r>
+      <w:proofErr w:type="spellEnd"/>
+      <w:r>
+        <w:rPr>
+          <w:lang w:val="pt-BR"/>
+        </w:rPr>
+        <w:t xml:space="preserve"> </w:t>
+      </w:r>
+      <w:proofErr w:type="spellStart"/>
+      <w:r>
+        <w:rPr>
+          <w:lang w:val="pt-BR"/>
+        </w:rPr>
+        <w:t>used</w:t>
+      </w:r>
+      <w:proofErr w:type="spellEnd"/>
+      <w:r>
+        <w:rPr>
+          <w:lang w:val="pt-BR"/>
+        </w:rPr>
+        <w:t xml:space="preserve"> </w:t>
+      </w:r>
+      <w:proofErr w:type="spellStart"/>
+      <w:r>
+        <w:rPr>
+          <w:lang w:val="pt-BR"/>
+        </w:rPr>
+        <w:t>to</w:t>
+      </w:r>
+      <w:proofErr w:type="spellEnd"/>
+      <w:r>
+        <w:rPr>
+          <w:lang w:val="pt-BR"/>
+        </w:rPr>
+        <w:t xml:space="preserve"> </w:t>
+      </w:r>
+      <w:r>
+        <w:rPr>
+          <w:lang w:val="pt-BR"/>
+        </w:rPr>
+        <w:t>store</w:t>
+      </w:r>
+      <w:r>
+        <w:rPr>
+          <w:lang w:val="pt-BR"/>
+        </w:rPr>
+        <w:t xml:space="preserve"> </w:t>
+      </w:r>
+      <w:proofErr w:type="spellStart"/>
+      <w:r>
+        <w:rPr>
+          <w:lang w:val="pt-BR"/>
+        </w:rPr>
+        <w:t>the</w:t>
+      </w:r>
+      <w:proofErr w:type="spellEnd"/>
+      <w:r>
+        <w:rPr>
+          <w:lang w:val="pt-BR"/>
+        </w:rPr>
+        <w:t xml:space="preserve"> </w:t>
+      </w:r>
+      <w:proofErr w:type="spellStart"/>
+      <w:r>
+        <w:rPr>
+          <w:lang w:val="pt-BR"/>
+        </w:rPr>
+        <w:t>validation</w:t>
+      </w:r>
+      <w:proofErr w:type="spellEnd"/>
+      <w:r>
+        <w:rPr>
+          <w:lang w:val="pt-BR"/>
+        </w:rPr>
+        <w:t xml:space="preserve"> scripts</w:t>
+      </w:r>
+      <w:r>
+        <w:rPr>
+          <w:lang w:val="pt-BR"/>
+        </w:rPr>
+        <w:t xml:space="preserve"> </w:t>
+      </w:r>
+      <w:proofErr w:type="spellStart"/>
+      <w:r>
+        <w:rPr>
+          <w:lang w:val="pt-BR"/>
+        </w:rPr>
+        <w:t>subfolders</w:t>
+      </w:r>
+      <w:proofErr w:type="spellEnd"/>
+      <w:r>
+        <w:rPr>
+          <w:lang w:val="pt-BR"/>
+        </w:rPr>
+        <w:t>.</w:t>
+      </w:r>
+    </w:p>
+    <w:p>
+      <w:pPr>
+        <w:pStyle w:val="Heading1"/>
+        <w:numPr>
+          <w:ilvl w:val="0"/>
+          <w:numId w:val="0"/>
+        </w:numPr>
+        <w:ind w:left="862"/>
+        <w:rPr>
+          <w:w w:val="90"/>
+          <w:lang w:val="pt-BR"/>
+        </w:rPr>
+      </w:pPr>
+    </w:p>
+    <w:p>
+      <w:pPr>
+        <w:pStyle w:val="Heading1"/>
+        <w:rPr>
+          <w:w w:val="90"/>
+          <w:lang w:val="pt-BR"/>
+        </w:rPr>
+      </w:pPr>
+      <w:r>
+        <w:rPr>
+          <w:w w:val="90"/>
+          <w:lang w:val="pt-BR"/>
+        </w:rPr>
+        <w:t xml:space="preserve">Data </w:t>
+      </w:r>
+      <w:proofErr w:type="spellStart"/>
+      <w:r>
+        <w:rPr>
+          <w:w w:val="90"/>
+          <w:lang w:val="pt-BR"/>
+        </w:rPr>
+        <w:t>preparation</w:t>
+      </w:r>
+      <w:proofErr w:type="spellEnd"/>
+    </w:p>
+    <w:p>
+      <w:pPr>
+        <w:pStyle w:val="Heading3"/>
+        <w:ind w:left="0" w:firstLine="0"/>
+        <w:rPr>
+          <w:w w:val="90"/>
+          <w:lang w:val="pt-BR"/>
+        </w:rPr>
+      </w:pPr>
+    </w:p>
+    <w:p>
+      <w:pPr>
+        <w:pStyle w:val="Heading3"/>
+        <w:ind w:left="0" w:firstLine="0"/>
+        <w:rPr>
+          <w:w w:val="90"/>
+          <w:lang w:val="pt-BR"/>
+        </w:rPr>
+      </w:pPr>
+      <w:proofErr w:type="spellStart"/>
+      <w:r>
+        <w:rPr>
+          <w:w w:val="90"/>
+          <w:lang w:val="pt-BR"/>
+        </w:rPr>
+        <w:t>Description</w:t>
+      </w:r>
+      <w:proofErr w:type="spellEnd"/>
+      <w:r>
+        <w:rPr>
+          <w:w w:val="90"/>
+          <w:lang w:val="pt-BR"/>
+        </w:rPr>
+        <w:t xml:space="preserve">: </w:t>
+      </w:r>
+    </w:p>
+    <w:p>
       <w:proofErr w:type="spellStart"/>
       <w:r>
         <w:rPr>
@@ -93,25 +342,25 @@
         </w:rPr>
         <w:t xml:space="preserve"> Data</w:t>
       </w:r>
-    </w:p>
-    <w:p>
-      <w:pPr>
-        <w:rPr>
-          <w:lang w:val="pt-BR"/>
-        </w:rPr>
-      </w:pPr>
-    </w:p>
-    <w:p>
-      <w:pPr>
-        <w:rPr>
-          <w:lang w:val="pt-BR"/>
-        </w:rPr>
-      </w:pPr>
-      <w:r>
-        <w:rPr>
-          <w:lang w:val="pt-BR"/>
-        </w:rPr>
-        <w:t xml:space="preserve">Data </w:t>
+      <w:r>
+        <w:rPr>
+          <w:lang w:val="pt-BR"/>
+        </w:rPr>
+        <w:t xml:space="preserve"> </w:t>
+      </w:r>
+      <w:proofErr w:type="spellStart"/>
+      <w:r>
+        <w:rPr>
+          <w:lang w:val="pt-BR"/>
+        </w:rPr>
+        <w:t>was</w:t>
+      </w:r>
+      <w:proofErr w:type="spellEnd"/>
+      <w:r>
+        <w:rPr>
+          <w:lang w:val="pt-BR"/>
+        </w:rPr>
+        <w:t xml:space="preserve"> </w:t>
       </w:r>
       <w:proofErr w:type="spellStart"/>
       <w:r>
@@ -153,21 +402,203 @@
         <w:rPr>
           <w:lang w:val="pt-BR"/>
         </w:rPr>
-        <w:t xml:space="preserve"> </w:t>
-      </w:r>
-    </w:p>
-    <w:p>
-      <w:pPr>
-        <w:rPr>
-          <w:lang w:val="pt-BR"/>
-        </w:rPr>
-      </w:pPr>
-      <w:r>
-        <w:rPr>
-          <w:lang w:val="pt-BR"/>
-        </w:rPr>
-        <w:t xml:space="preserve">- Options: </w:t>
-      </w:r>
+        <w:t xml:space="preserve">, </w:t>
+      </w:r>
+      <w:proofErr w:type="spellStart"/>
+      <w:r>
+        <w:rPr>
+          <w:lang w:val="pt-BR"/>
+        </w:rPr>
+        <w:t>transformed</w:t>
+      </w:r>
+      <w:proofErr w:type="spellEnd"/>
+      <w:r>
+        <w:rPr>
+          <w:lang w:val="pt-BR"/>
+        </w:rPr>
+        <w:t xml:space="preserve">, </w:t>
+      </w:r>
+      <w:proofErr w:type="spellStart"/>
+      <w:r>
+        <w:rPr>
+          <w:lang w:val="pt-BR"/>
+        </w:rPr>
+        <w:t>and</w:t>
+      </w:r>
+      <w:proofErr w:type="spellEnd"/>
+      <w:r>
+        <w:rPr>
+          <w:lang w:val="pt-BR"/>
+        </w:rPr>
+        <w:t xml:space="preserve"> </w:t>
+      </w:r>
+      <w:proofErr w:type="spellStart"/>
+      <w:r>
+        <w:rPr>
+          <w:lang w:val="pt-BR"/>
+        </w:rPr>
+        <w:t>consolidated</w:t>
+      </w:r>
+      <w:proofErr w:type="spellEnd"/>
+      <w:r>
+        <w:rPr>
+          <w:lang w:val="pt-BR"/>
+        </w:rPr>
+        <w:t xml:space="preserve"> </w:t>
+      </w:r>
+      <w:proofErr w:type="spellStart"/>
+      <w:r>
+        <w:rPr>
+          <w:lang w:val="pt-BR"/>
+        </w:rPr>
+        <w:t>generating</w:t>
+      </w:r>
+      <w:proofErr w:type="spellEnd"/>
+      <w:r>
+        <w:rPr>
+          <w:lang w:val="pt-BR"/>
+        </w:rPr>
+        <w:t xml:space="preserve"> </w:t>
+      </w:r>
+      <w:proofErr w:type="spellStart"/>
+      <w:r>
+        <w:rPr>
+          <w:lang w:val="pt-BR"/>
+        </w:rPr>
+        <w:t>the</w:t>
+      </w:r>
+      <w:proofErr w:type="spellEnd"/>
+      <w:r>
+        <w:rPr>
+          <w:lang w:val="pt-BR"/>
+        </w:rPr>
+        <w:t xml:space="preserve"> input files for </w:t>
+      </w:r>
+      <w:proofErr w:type="spellStart"/>
+      <w:r>
+        <w:rPr>
+          <w:lang w:val="pt-BR"/>
+        </w:rPr>
+        <w:t>the</w:t>
+      </w:r>
+      <w:proofErr w:type="spellEnd"/>
+      <w:r>
+        <w:rPr>
+          <w:lang w:val="pt-BR"/>
+        </w:rPr>
+        <w:t xml:space="preserve"> </w:t>
+      </w:r>
+      <w:proofErr w:type="spellStart"/>
+      <w:r>
+        <w:rPr>
+          <w:lang w:val="pt-BR"/>
+        </w:rPr>
+        <w:t>validation</w:t>
+      </w:r>
+      <w:proofErr w:type="spellEnd"/>
+      <w:r>
+        <w:rPr>
+          <w:lang w:val="pt-BR"/>
+        </w:rPr>
+        <w:t xml:space="preserve"> scripts.</w:t>
+      </w:r>
+      <w:r>
+        <w:t xml:space="preserve"> </w:t>
+      </w:r>
+    </w:p>
+    <w:p/>
+    <w:p>
+      <w:pPr>
+        <w:pStyle w:val="Heading3"/>
+        <w:rPr>
+          <w:w w:val="90"/>
+          <w:lang w:val="pt-BR"/>
+        </w:rPr>
+      </w:pPr>
+      <w:proofErr w:type="gramStart"/>
+      <w:r>
+        <w:rPr>
+          <w:w w:val="90"/>
+          <w:lang w:val="pt-BR"/>
+        </w:rPr>
+        <w:t>  Input</w:t>
+      </w:r>
+      <w:proofErr w:type="gramEnd"/>
+      <w:r>
+        <w:rPr>
+          <w:w w:val="90"/>
+          <w:lang w:val="pt-BR"/>
+        </w:rPr>
+        <w:t xml:space="preserve"> File:</w:t>
+      </w:r>
+      <w:r>
+        <w:rPr>
+          <w:w w:val="90"/>
+          <w:lang w:val="pt-BR"/>
+        </w:rPr>
+        <w:t xml:space="preserve"> (</w:t>
+      </w:r>
+      <w:proofErr w:type="spellStart"/>
+      <w:r>
+        <w:rPr>
+          <w:w w:val="90"/>
+          <w:lang w:val="pt-BR"/>
+        </w:rPr>
+        <w:t>stored</w:t>
+      </w:r>
+      <w:proofErr w:type="spellEnd"/>
+      <w:r>
+        <w:rPr>
+          <w:w w:val="90"/>
+          <w:lang w:val="pt-BR"/>
+        </w:rPr>
+        <w:t xml:space="preserve"> in:</w:t>
+      </w:r>
+      <w:r>
+        <w:t xml:space="preserve"> </w:t>
+      </w:r>
+      <w:r>
+        <w:t>\</w:t>
+      </w:r>
+      <w:proofErr w:type="spellStart"/>
+      <w:r>
+        <w:t>RawData</w:t>
+      </w:r>
+      <w:proofErr w:type="spellEnd"/>
+      <w:r>
+        <w:t>\Data)</w:t>
+      </w:r>
+    </w:p>
+    <w:p>
+      <w:pPr>
+        <w:tabs>
+          <w:tab w:val="left" w:pos="687"/>
+        </w:tabs>
+        <w:spacing w:before="216" w:line="304" w:lineRule="auto"/>
+        <w:ind w:left="511" w:right="106"/>
+        <w:jc w:val="both"/>
+      </w:pPr>
+      <w:r>
+        <w:t xml:space="preserve">Content: Raw dataset containing main scale responses, metadata (id, seed, stimulus), and external instrument items (sus, </w:t>
+      </w:r>
+      <w:proofErr w:type="spellStart"/>
+      <w:r>
+        <w:t>ueq</w:t>
+      </w:r>
+      <w:proofErr w:type="spellEnd"/>
+      <w:r>
+        <w:t>)</w:t>
+      </w:r>
+    </w:p>
+    <w:p>
+      <w:pPr>
+        <w:tabs>
+          <w:tab w:val="left" w:pos="687"/>
+        </w:tabs>
+        <w:spacing w:before="216" w:line="304" w:lineRule="auto"/>
+        <w:ind w:left="511" w:right="106"/>
+        <w:jc w:val="both"/>
+      </w:pPr>
     </w:p>
     <w:p>
       <w:pPr>
@@ -187,6 +618,383 @@
         <w:rPr>
           <w:lang w:val="pt-BR"/>
         </w:rPr>
+        <w:t xml:space="preserve"> data </w:t>
+      </w:r>
+      <w:proofErr w:type="spellStart"/>
+      <w:r>
+        <w:rPr>
+          <w:lang w:val="pt-BR"/>
+        </w:rPr>
+        <w:t>from</w:t>
+      </w:r>
+      <w:proofErr w:type="spellEnd"/>
+      <w:r>
+        <w:rPr>
+          <w:lang w:val="pt-BR"/>
+        </w:rPr>
+        <w:t xml:space="preserve"> </w:t>
+      </w:r>
+      <w:proofErr w:type="spellStart"/>
+      <w:r>
+        <w:rPr>
+          <w:lang w:val="pt-BR"/>
+        </w:rPr>
+        <w:t>Limesurvey</w:t>
+      </w:r>
+      <w:proofErr w:type="spellEnd"/>
+      <w:r>
+        <w:rPr>
+          <w:lang w:val="pt-BR"/>
+        </w:rPr>
+        <w:t xml:space="preserve"> </w:t>
+      </w:r>
+      <w:proofErr w:type="spellStart"/>
+      <w:r>
+        <w:rPr>
+          <w:lang w:val="pt-BR"/>
+        </w:rPr>
+        <w:t>using</w:t>
+      </w:r>
+      <w:proofErr w:type="spellEnd"/>
+      <w:r>
+        <w:rPr>
+          <w:lang w:val="pt-BR"/>
+        </w:rPr>
+        <w:t xml:space="preserve"> </w:t>
+      </w:r>
+      <w:proofErr w:type="spellStart"/>
+      <w:r>
+        <w:rPr>
+          <w:lang w:val="pt-BR"/>
+        </w:rPr>
+        <w:t>the</w:t>
+      </w:r>
+      <w:proofErr w:type="spellEnd"/>
+      <w:r>
+        <w:rPr>
+          <w:lang w:val="pt-BR"/>
+        </w:rPr>
+        <w:t xml:space="preserve"> </w:t>
+      </w:r>
+      <w:proofErr w:type="spellStart"/>
+      <w:r>
+        <w:rPr>
+          <w:lang w:val="pt-BR"/>
+        </w:rPr>
+        <w:t>following</w:t>
+      </w:r>
+      <w:proofErr w:type="spellEnd"/>
+      <w:r>
+        <w:rPr>
+          <w:lang w:val="pt-BR"/>
+        </w:rPr>
+        <w:t xml:space="preserve"> </w:t>
+      </w:r>
+      <w:proofErr w:type="spellStart"/>
+      <w:r>
+        <w:rPr>
+          <w:lang w:val="pt-BR"/>
+        </w:rPr>
+        <w:t>options</w:t>
+      </w:r>
+      <w:proofErr w:type="spellEnd"/>
+      <w:r>
+        <w:rPr>
+          <w:lang w:val="pt-BR"/>
+        </w:rPr>
+        <w:t xml:space="preserve">: </w:t>
+      </w:r>
+    </w:p>
+    <w:p>
+      <w:pPr>
+        <w:rPr>
+          <w:lang w:val="pt-BR"/>
+        </w:rPr>
+      </w:pPr>
+      <w:proofErr w:type="spellStart"/>
+      <w:r>
+        <w:rPr>
+          <w:lang w:val="pt-BR"/>
+        </w:rPr>
+        <w:t>Survey</w:t>
+      </w:r>
+      <w:proofErr w:type="spellEnd"/>
+      <w:r>
+        <w:rPr>
+          <w:lang w:val="pt-BR"/>
+        </w:rPr>
+        <w:t xml:space="preserve"> </w:t>
+      </w:r>
+      <w:proofErr w:type="spellStart"/>
+      <w:r>
+        <w:rPr>
+          <w:lang w:val="pt-BR"/>
+        </w:rPr>
+        <w:t>names</w:t>
+      </w:r>
+      <w:proofErr w:type="spellEnd"/>
+      <w:r>
+        <w:rPr>
+          <w:lang w:val="pt-BR"/>
+        </w:rPr>
+        <w:t xml:space="preserve">: </w:t>
+      </w:r>
+      <w:proofErr w:type="spellStart"/>
+      <w:r>
+        <w:rPr>
+          <w:lang w:val="pt-BR"/>
+        </w:rPr>
+        <w:t>User</w:t>
+      </w:r>
+      <w:proofErr w:type="spellEnd"/>
+      <w:r>
+        <w:rPr>
+          <w:lang w:val="pt-BR"/>
+        </w:rPr>
+        <w:t xml:space="preserve"> Experience </w:t>
+      </w:r>
+      <w:proofErr w:type="spellStart"/>
+      <w:r>
+        <w:rPr>
+          <w:lang w:val="pt-BR"/>
+        </w:rPr>
+        <w:t>with</w:t>
+      </w:r>
+      <w:proofErr w:type="spellEnd"/>
+      <w:r>
+        <w:rPr>
+          <w:lang w:val="pt-BR"/>
+        </w:rPr>
+        <w:t xml:space="preserve"> Visual </w:t>
+      </w:r>
+      <w:proofErr w:type="spellStart"/>
+      <w:r>
+        <w:rPr>
+          <w:lang w:val="pt-BR"/>
+        </w:rPr>
+        <w:t>Analytics</w:t>
+      </w:r>
+      <w:proofErr w:type="spellEnd"/>
+      <w:r>
+        <w:rPr>
+          <w:lang w:val="pt-BR"/>
+        </w:rPr>
+        <w:t xml:space="preserve"> - </w:t>
+      </w:r>
+      <w:proofErr w:type="spellStart"/>
+      <w:r>
+        <w:rPr>
+          <w:lang w:val="pt-BR"/>
+        </w:rPr>
+        <w:t>Validation</w:t>
+      </w:r>
+      <w:proofErr w:type="spellEnd"/>
+      <w:r>
+        <w:rPr>
+          <w:lang w:val="pt-BR"/>
+        </w:rPr>
+        <w:t xml:space="preserve"> </w:t>
+      </w:r>
+      <w:proofErr w:type="spellStart"/>
+      <w:r>
+        <w:rPr>
+          <w:lang w:val="pt-BR"/>
+        </w:rPr>
+        <w:t>Survey</w:t>
+      </w:r>
+      <w:proofErr w:type="spellEnd"/>
+      <w:r>
+        <w:rPr>
+          <w:lang w:val="pt-BR"/>
+        </w:rPr>
+        <w:t xml:space="preserve">, </w:t>
+      </w:r>
+      <w:proofErr w:type="spellStart"/>
+      <w:r>
+        <w:rPr>
+          <w:lang w:val="pt-BR"/>
+        </w:rPr>
+        <w:t>User</w:t>
+      </w:r>
+      <w:proofErr w:type="spellEnd"/>
+      <w:r>
+        <w:rPr>
+          <w:lang w:val="pt-BR"/>
+        </w:rPr>
+        <w:t xml:space="preserve"> Experience </w:t>
+      </w:r>
+      <w:proofErr w:type="spellStart"/>
+      <w:r>
+        <w:rPr>
+          <w:lang w:val="pt-BR"/>
+        </w:rPr>
+        <w:t>with</w:t>
+      </w:r>
+      <w:proofErr w:type="spellEnd"/>
+      <w:r>
+        <w:rPr>
+          <w:lang w:val="pt-BR"/>
+        </w:rPr>
+        <w:t xml:space="preserve"> Visual </w:t>
+      </w:r>
+      <w:proofErr w:type="spellStart"/>
+      <w:r>
+        <w:rPr>
+          <w:lang w:val="pt-BR"/>
+        </w:rPr>
+        <w:t>Analytics</w:t>
+      </w:r>
+      <w:proofErr w:type="spellEnd"/>
+      <w:r>
+        <w:rPr>
+          <w:lang w:val="pt-BR"/>
+        </w:rPr>
+        <w:t xml:space="preserve"> - </w:t>
+      </w:r>
+      <w:proofErr w:type="spellStart"/>
+      <w:r>
+        <w:rPr>
+          <w:lang w:val="pt-BR"/>
+        </w:rPr>
+        <w:t>Validation</w:t>
+      </w:r>
+      <w:proofErr w:type="spellEnd"/>
+      <w:r>
+        <w:rPr>
+          <w:lang w:val="pt-BR"/>
+        </w:rPr>
+        <w:t xml:space="preserve"> </w:t>
+      </w:r>
+      <w:proofErr w:type="spellStart"/>
+      <w:r>
+        <w:rPr>
+          <w:lang w:val="pt-BR"/>
+        </w:rPr>
+        <w:t>Survey</w:t>
+      </w:r>
+      <w:proofErr w:type="spellEnd"/>
+      <w:r>
+        <w:rPr>
+          <w:lang w:val="pt-BR"/>
+        </w:rPr>
+        <w:t xml:space="preserve"> (</w:t>
+      </w:r>
+      <w:proofErr w:type="spellStart"/>
+      <w:r>
+        <w:rPr>
+          <w:lang w:val="pt-BR"/>
+        </w:rPr>
+        <w:t>User</w:t>
+      </w:r>
+      <w:proofErr w:type="spellEnd"/>
+      <w:r>
+        <w:rPr>
+          <w:lang w:val="pt-BR"/>
+        </w:rPr>
+        <w:t xml:space="preserve"> </w:t>
+      </w:r>
+      <w:proofErr w:type="spellStart"/>
+      <w:r>
+        <w:rPr>
+          <w:lang w:val="pt-BR"/>
+        </w:rPr>
+        <w:t>Forums</w:t>
+      </w:r>
+      <w:proofErr w:type="spellEnd"/>
+      <w:r>
+        <w:rPr>
+          <w:lang w:val="pt-BR"/>
+        </w:rPr>
+        <w:t xml:space="preserve">), </w:t>
+      </w:r>
+      <w:proofErr w:type="spellStart"/>
+      <w:r>
+        <w:rPr>
+          <w:lang w:val="pt-BR"/>
+        </w:rPr>
+        <w:t>User</w:t>
+      </w:r>
+      <w:proofErr w:type="spellEnd"/>
+      <w:r>
+        <w:rPr>
+          <w:lang w:val="pt-BR"/>
+        </w:rPr>
+        <w:t xml:space="preserve"> Experience </w:t>
+      </w:r>
+      <w:proofErr w:type="spellStart"/>
+      <w:r>
+        <w:rPr>
+          <w:lang w:val="pt-BR"/>
+        </w:rPr>
+        <w:t>with</w:t>
+      </w:r>
+      <w:proofErr w:type="spellEnd"/>
+      <w:r>
+        <w:rPr>
+          <w:lang w:val="pt-BR"/>
+        </w:rPr>
+        <w:t xml:space="preserve"> Visual Data </w:t>
+      </w:r>
+      <w:proofErr w:type="spellStart"/>
+      <w:r>
+        <w:rPr>
+          <w:lang w:val="pt-BR"/>
+        </w:rPr>
+        <w:t>Analysis</w:t>
+      </w:r>
+      <w:proofErr w:type="spellEnd"/>
+      <w:r>
+        <w:rPr>
+          <w:lang w:val="pt-BR"/>
+        </w:rPr>
+        <w:t xml:space="preserve"> Tools</w:t>
+      </w:r>
+      <w:r>
+        <w:rPr>
+          <w:lang w:val="pt-BR"/>
+        </w:rPr>
+        <w:t xml:space="preserve"> (</w:t>
+      </w:r>
+      <w:proofErr w:type="spellStart"/>
+      <w:r>
+        <w:rPr>
+          <w:lang w:val="pt-BR"/>
+        </w:rPr>
+        <w:t>Prolific</w:t>
+      </w:r>
+      <w:proofErr w:type="spellEnd"/>
+      <w:r>
+        <w:rPr>
+          <w:lang w:val="pt-BR"/>
+        </w:rPr>
+        <w:t>)</w:t>
+      </w:r>
+    </w:p>
+    <w:p>
+      <w:pPr>
+        <w:rPr>
+          <w:lang w:val="pt-BR"/>
+        </w:rPr>
+      </w:pPr>
+    </w:p>
+    <w:p>
+      <w:pPr>
+        <w:rPr>
+          <w:lang w:val="pt-BR"/>
+        </w:rPr>
+      </w:pPr>
+      <w:proofErr w:type="spellStart"/>
+      <w:r>
+        <w:rPr>
+          <w:lang w:val="pt-BR"/>
+        </w:rPr>
+        <w:t>Export</w:t>
+      </w:r>
+      <w:proofErr w:type="spellEnd"/>
+      <w:r>
+        <w:rPr>
+          <w:lang w:val="pt-BR"/>
+        </w:rPr>
         <w:t xml:space="preserve"> </w:t>
       </w:r>
       <w:proofErr w:type="spellStart"/>
@@ -256,144 +1064,291 @@
       </w:r>
     </w:p>
     <w:p/>
-    <w:p>
-      <w:r>
-        <w:t xml:space="preserve">Base folder: </w:t>
-      </w:r>
-      <w:r>
-        <w:t>Phase 3 - Scale Validation\</w:t>
-      </w:r>
-      <w:proofErr w:type="spellStart"/>
-      <w:r>
+    <w:p/>
+    <w:p>
+      <w:r>
+        <w:t>Dataset files:</w:t>
+      </w:r>
+    </w:p>
+    <w:p>
+      <w:r>
+        <w:rPr>
+          <w:lang w:val="pt-BR"/>
+        </w:rPr>
+        <w:t>results-survey349675</w:t>
+      </w:r>
+      <w:r>
+        <w:t xml:space="preserve"> </w:t>
+      </w:r>
+    </w:p>
+    <w:p>
+      <w:pPr>
+        <w:rPr>
+          <w:lang w:val="pt-BR"/>
+        </w:rPr>
+      </w:pPr>
+      <w:r>
+        <w:rPr>
+          <w:lang w:val="pt-BR"/>
+        </w:rPr>
+        <w:t>results-survey372164</w:t>
+      </w:r>
+    </w:p>
+    <w:p>
+      <w:pPr>
+        <w:rPr>
+          <w:lang w:val="pt-BR"/>
+        </w:rPr>
+      </w:pPr>
+      <w:r>
+        <w:rPr>
+          <w:lang w:val="pt-BR"/>
+        </w:rPr>
+        <w:t>results-survey127653</w:t>
+      </w:r>
+    </w:p>
+    <w:p>
+      <w:pPr>
+        <w:tabs>
+          <w:tab w:val="left" w:pos="687"/>
+        </w:tabs>
+        <w:spacing w:before="216" w:line="304" w:lineRule="auto"/>
+        <w:ind w:left="511" w:right="106"/>
+        <w:jc w:val="both"/>
+      </w:pPr>
+    </w:p>
+    <w:p>
+      <w:pPr>
+        <w:pStyle w:val="Heading3"/>
+        <w:rPr>
+          <w:w w:val="90"/>
+          <w:lang w:val="pt-BR"/>
+        </w:rPr>
+      </w:pPr>
+      <w:r>
+        <w:rPr>
+          <w:w w:val="90"/>
+          <w:lang w:val="pt-BR"/>
+        </w:rPr>
+        <w:t>Output Files (</w:t>
+      </w:r>
+      <w:proofErr w:type="spellStart"/>
+      <w:r>
+        <w:rPr>
+          <w:w w:val="90"/>
+          <w:lang w:val="pt-BR"/>
+        </w:rPr>
+        <w:t>stored</w:t>
+      </w:r>
+      <w:proofErr w:type="spellEnd"/>
+      <w:r>
+        <w:rPr>
+          <w:w w:val="90"/>
+          <w:lang w:val="pt-BR"/>
+        </w:rPr>
+        <w:t xml:space="preserve"> in </w:t>
+      </w:r>
+      <w:proofErr w:type="spellStart"/>
+      <w:r>
+        <w:rPr>
+          <w:w w:val="90"/>
+          <w:lang w:val="pt-BR"/>
+        </w:rPr>
         <w:t>RawData</w:t>
       </w:r>
       <w:proofErr w:type="spellEnd"/>
+      <w:r>
+        <w:rPr>
+          <w:w w:val="90"/>
+          <w:lang w:val="pt-BR"/>
+        </w:rPr>
+        <w:t>/</w:t>
+      </w:r>
+      <w:proofErr w:type="spellStart"/>
+      <w:r>
+        <w:rPr>
+          <w:w w:val="90"/>
+          <w:lang w:val="pt-BR"/>
+        </w:rPr>
+        <w:t>PreparedData</w:t>
+      </w:r>
+      <w:proofErr w:type="spellEnd"/>
+      <w:r>
+        <w:rPr>
+          <w:w w:val="90"/>
+          <w:lang w:val="pt-BR"/>
+        </w:rPr>
+        <w:t>):</w:t>
+      </w:r>
     </w:p>
     <w:p/>
     <w:p>
-      <w:r>
-        <w:t>Dataset files:</w:t>
-      </w:r>
-    </w:p>
-    <w:p>
-      <w:r>
-        <w:rPr>
-          <w:lang w:val="pt-BR"/>
-        </w:rPr>
-        <w:t>results-survey349675</w:t>
-      </w:r>
-      <w:r>
-        <w:t xml:space="preserve"> </w:t>
-      </w:r>
-    </w:p>
-    <w:p>
-      <w:pPr>
-        <w:rPr>
-          <w:lang w:val="pt-BR"/>
-        </w:rPr>
-      </w:pPr>
-      <w:r>
-        <w:rPr>
-          <w:lang w:val="pt-BR"/>
-        </w:rPr>
-        <w:t>results-survey372164</w:t>
-      </w:r>
-    </w:p>
-    <w:p>
-      <w:pPr>
-        <w:rPr>
-          <w:lang w:val="pt-BR"/>
-        </w:rPr>
-      </w:pPr>
-      <w:r>
-        <w:rPr>
-          <w:lang w:val="pt-BR"/>
-        </w:rPr>
-        <w:t>results-survey127653</w:t>
-      </w:r>
-    </w:p>
-    <w:p>
-      <w:pPr>
-        <w:rPr>
-          <w:lang w:val="pt-BR"/>
-        </w:rPr>
-      </w:pPr>
-    </w:p>
-    <w:p>
-      <w:pPr>
-        <w:rPr>
-          <w:lang w:val="pt-BR"/>
-        </w:rPr>
-      </w:pPr>
-    </w:p>
-    <w:p>
-      <w:pPr>
-        <w:rPr>
-          <w:lang w:val="pt-BR"/>
-        </w:rPr>
-      </w:pPr>
-      <w:r>
-        <w:rPr>
-          <w:lang w:val="pt-BR"/>
-        </w:rPr>
-        <w:t xml:space="preserve">Data </w:t>
-      </w:r>
-      <w:proofErr w:type="spellStart"/>
-      <w:r>
-        <w:rPr>
-          <w:lang w:val="pt-BR"/>
-        </w:rPr>
-        <w:t>preparation</w:t>
-      </w:r>
-      <w:proofErr w:type="spellEnd"/>
-      <w:r>
-        <w:rPr>
-          <w:lang w:val="pt-BR"/>
-        </w:rPr>
-        <w:t>:</w:t>
-      </w:r>
-    </w:p>
-    <w:p>
-      <w:pPr>
-        <w:rPr>
-          <w:lang w:val="pt-BR"/>
-        </w:rPr>
-      </w:pPr>
-    </w:p>
-    <w:p>
-      <w:pPr>
-        <w:rPr>
-          <w:lang w:val="pt-BR"/>
-        </w:rPr>
-      </w:pPr>
-    </w:p>
-    <w:p>
-      <w:pPr>
-        <w:rPr>
-          <w:lang w:val="pt-BR"/>
-        </w:rPr>
-      </w:pPr>
-      <w:proofErr w:type="spellStart"/>
-      <w:r>
-        <w:rPr>
-          <w:lang w:val="pt-BR"/>
-        </w:rPr>
-        <w:t>Cleaning</w:t>
-      </w:r>
-      <w:proofErr w:type="spellEnd"/>
-      <w:r>
-        <w:rPr>
-          <w:lang w:val="pt-BR"/>
-        </w:rPr>
-        <w:t xml:space="preserve"> Procedures:</w:t>
-      </w:r>
-    </w:p>
-    <w:p>
-      <w:pPr>
-        <w:rPr>
-          <w:lang w:val="pt-BR"/>
-        </w:rPr>
-      </w:pPr>
+      <w:pPr>
+        <w:rPr>
+          <w:lang w:val="pt-BR"/>
+        </w:rPr>
+      </w:pPr>
+      <w:r>
+        <w:rPr>
+          <w:lang w:val="pt-BR"/>
+        </w:rPr>
+        <w:t xml:space="preserve">ratings – complete.csv </w:t>
+      </w:r>
+    </w:p>
+    <w:p>
+      <w:pPr>
+        <w:rPr>
+          <w:lang w:val="pt-BR"/>
+        </w:rPr>
+      </w:pPr>
+      <w:r>
+        <w:rPr>
+          <w:lang w:val="pt-BR"/>
+        </w:rPr>
+        <w:t>ratings – grades.csv</w:t>
+      </w:r>
+    </w:p>
+    <w:p>
+      <w:pPr>
+        <w:widowControl/>
+        <w:autoSpaceDE/>
+        <w:autoSpaceDN/>
+        <w:rPr>
+          <w:rFonts w:ascii="Arial" w:eastAsia="Times New Roman" w:hAnsi="Arial" w:cs="Arial"/>
+          <w:sz w:val="20"/>
+          <w:szCs w:val="20"/>
+          <w:lang w:val="pt-BR" w:eastAsia="pt-BR"/>
+        </w:rPr>
+      </w:pPr>
+      <w:r>
+        <w:rPr>
+          <w:rFonts w:ascii="Arial" w:eastAsia="Times New Roman" w:hAnsi="Arial" w:cs="Arial"/>
+          <w:sz w:val="20"/>
+          <w:szCs w:val="20"/>
+          <w:lang w:val="pt-BR" w:eastAsia="pt-BR"/>
+        </w:rPr>
+        <w:t>sus_ratings.csv</w:t>
+      </w:r>
+    </w:p>
+    <w:p>
+      <w:pPr>
+        <w:rPr>
+          <w:rFonts w:ascii="Arial" w:eastAsia="Times New Roman" w:hAnsi="Arial" w:cs="Arial"/>
+          <w:sz w:val="20"/>
+          <w:szCs w:val="20"/>
+          <w:lang w:val="pt-BR" w:eastAsia="pt-BR"/>
+        </w:rPr>
+      </w:pPr>
+      <w:r>
+        <w:rPr>
+          <w:rFonts w:ascii="Arial" w:eastAsia="Times New Roman" w:hAnsi="Arial" w:cs="Arial"/>
+          <w:sz w:val="20"/>
+          <w:szCs w:val="20"/>
+          <w:lang w:val="pt-BR" w:eastAsia="pt-BR"/>
+        </w:rPr>
+        <w:t>ueqs_ratings.csv</w:t>
+      </w:r>
+    </w:p>
+    <w:p>
+      <w:pPr>
+        <w:rPr>
+          <w:lang w:val="pt-BR"/>
+        </w:rPr>
+      </w:pPr>
+      <w:r>
+        <w:rPr>
+          <w:rFonts w:ascii="Arial" w:eastAsia="Times New Roman" w:hAnsi="Arial" w:cs="Arial"/>
+          <w:sz w:val="20"/>
+          <w:szCs w:val="20"/>
+          <w:lang w:val="pt-BR" w:eastAsia="pt-BR"/>
+        </w:rPr>
+        <w:t>ux_ratings.csv</w:t>
+      </w:r>
+    </w:p>
+    <w:p>
+      <w:pPr>
+        <w:rPr>
+          <w:lang w:val="pt-BR"/>
+        </w:rPr>
+      </w:pPr>
+    </w:p>
+    <w:p>
+      <w:pPr>
+        <w:tabs>
+          <w:tab w:val="left" w:pos="687"/>
+        </w:tabs>
+        <w:spacing w:before="216" w:line="304" w:lineRule="auto"/>
+        <w:ind w:left="511" w:right="106"/>
+        <w:jc w:val="both"/>
+      </w:pPr>
+    </w:p>
+    <w:p>
+      <w:pPr>
+        <w:tabs>
+          <w:tab w:val="left" w:pos="687"/>
+        </w:tabs>
+        <w:spacing w:before="216" w:line="304" w:lineRule="auto"/>
+        <w:ind w:left="511" w:right="106"/>
+        <w:jc w:val="both"/>
+      </w:pPr>
+    </w:p>
+    <w:p>
+      <w:pPr>
+        <w:tabs>
+          <w:tab w:val="left" w:pos="687"/>
+        </w:tabs>
+        <w:spacing w:before="216" w:line="304" w:lineRule="auto"/>
+        <w:ind w:left="511" w:right="106"/>
+        <w:jc w:val="both"/>
+      </w:pPr>
+    </w:p>
+    <w:p>
+      <w:pPr>
+        <w:pStyle w:val="Heading3"/>
+        <w:rPr>
+          <w:w w:val="90"/>
+          <w:lang w:val="pt-BR"/>
+        </w:rPr>
+      </w:pPr>
+      <w:proofErr w:type="gramStart"/>
+      <w:r>
+        <w:rPr>
+          <w:w w:val="90"/>
+          <w:lang w:val="pt-BR"/>
+        </w:rPr>
+        <w:t xml:space="preserve">  </w:t>
+      </w:r>
+      <w:r>
+        <w:rPr>
+          <w:w w:val="90"/>
+          <w:lang w:val="pt-BR"/>
+        </w:rPr>
+        <w:t>Data</w:t>
+      </w:r>
+      <w:proofErr w:type="gramEnd"/>
+      <w:r>
+        <w:rPr>
+          <w:w w:val="90"/>
+          <w:lang w:val="pt-BR"/>
+        </w:rPr>
+        <w:t xml:space="preserve"> </w:t>
+      </w:r>
+      <w:proofErr w:type="spellStart"/>
+      <w:r>
+        <w:rPr>
+          <w:w w:val="90"/>
+          <w:lang w:val="pt-BR"/>
+        </w:rPr>
+        <w:t>Preparation</w:t>
+      </w:r>
+      <w:proofErr w:type="spellEnd"/>
+      <w:r>
+        <w:rPr>
+          <w:w w:val="90"/>
+          <w:lang w:val="pt-BR"/>
+        </w:rPr>
+        <w:t xml:space="preserve"> Procedures</w:t>
+      </w:r>
     </w:p>
     <w:p>
       <w:pPr>
@@ -786,13 +1741,7 @@
         <w:rPr>
           <w:lang w:val="pt-BR"/>
         </w:rPr>
-        <w:t>C1LYP9HZ</w:t>
-      </w:r>
-      <w:r>
-        <w:rPr>
-          <w:lang w:val="pt-BR"/>
-        </w:rPr>
-        <w:t xml:space="preserve"> </w:t>
+        <w:t xml:space="preserve">C1LYP9HZ </w:t>
       </w:r>
       <w:proofErr w:type="spellStart"/>
       <w:r>
@@ -806,13 +1755,7 @@
         <w:rPr>
           <w:lang w:val="pt-BR"/>
         </w:rPr>
-        <w:t xml:space="preserve"> </w:t>
-      </w:r>
-      <w:r>
-        <w:rPr>
-          <w:lang w:val="pt-BR"/>
-        </w:rPr>
-        <w:t>C15VDVOL</w:t>
+        <w:t xml:space="preserve"> C15VDVOL</w:t>
       </w:r>
     </w:p>
     <w:p>
@@ -1225,13 +2168,7 @@
         <w:rPr>
           <w:lang w:val="pt-BR"/>
         </w:rPr>
-        <w:t xml:space="preserve"> id = </w:t>
-      </w:r>
-      <w:r>
-        <w:rPr>
-          <w:lang w:val="pt-BR"/>
-        </w:rPr>
-        <w:t xml:space="preserve">352 </w:t>
+        <w:t xml:space="preserve"> id = 352 </w:t>
       </w:r>
       <w:proofErr w:type="spellStart"/>
       <w:r>
@@ -1331,19 +2268,7 @@
         <w:rPr>
           <w:lang w:val="pt-BR"/>
         </w:rPr>
-        <w:t xml:space="preserve">: </w:t>
-      </w:r>
-      <w:r>
-        <w:rPr>
-          <w:lang w:val="pt-BR"/>
-        </w:rPr>
-        <w:t>S10</w:t>
-      </w:r>
-      <w:r>
-        <w:rPr>
-          <w:lang w:val="pt-BR"/>
-        </w:rPr>
-        <w:t xml:space="preserve"> </w:t>
+        <w:t xml:space="preserve">: S10 </w:t>
       </w:r>
       <w:proofErr w:type="spellStart"/>
       <w:r>
@@ -1357,13 +2282,7 @@
         <w:rPr>
           <w:lang w:val="pt-BR"/>
         </w:rPr>
-        <w:t xml:space="preserve"> </w:t>
-      </w:r>
-      <w:r>
-        <w:rPr>
-          <w:lang w:val="pt-BR"/>
-        </w:rPr>
-        <w:t>-</w:t>
+        <w:t xml:space="preserve"> -</w:t>
       </w:r>
       <w:proofErr w:type="spellStart"/>
       <w:r>
@@ -1625,7 +2544,6 @@
         <w:rPr>
           <w:lang w:val="pt-BR"/>
         </w:rPr>
-        <w:lastRenderedPageBreak/>
         <w:t>Select</w:t>
       </w:r>
       <w:proofErr w:type="spellEnd"/>
@@ -2351,13 +3269,235 @@
         <w:rPr>
           <w:lang w:val="pt-BR"/>
         </w:rPr>
+        <w:t xml:space="preserve">: “S09”, </w:t>
+      </w:r>
+      <w:proofErr w:type="spellStart"/>
+      <w:r>
+        <w:rPr>
+          <w:rFonts w:ascii="Arial" w:eastAsia="Times New Roman" w:hAnsi="Arial" w:cs="Arial"/>
+          <w:sz w:val="20"/>
+          <w:szCs w:val="20"/>
+          <w:lang w:val="pt-BR" w:eastAsia="pt-BR"/>
+        </w:rPr>
+        <w:t>VASys</w:t>
+      </w:r>
+      <w:proofErr w:type="spellEnd"/>
+      <w:r>
+        <w:rPr>
+          <w:rFonts w:ascii="Arial" w:eastAsia="Times New Roman" w:hAnsi="Arial" w:cs="Arial"/>
+          <w:sz w:val="20"/>
+          <w:szCs w:val="20"/>
+          <w:lang w:val="pt-BR" w:eastAsia="pt-BR"/>
+        </w:rPr>
+        <w:t>[</w:t>
+      </w:r>
+      <w:proofErr w:type="spellStart"/>
+      <w:r>
+        <w:rPr>
+          <w:rFonts w:ascii="Arial" w:eastAsia="Times New Roman" w:hAnsi="Arial" w:cs="Arial"/>
+          <w:sz w:val="20"/>
+          <w:szCs w:val="20"/>
+          <w:lang w:val="pt-BR" w:eastAsia="pt-BR"/>
+        </w:rPr>
+        <w:t>other</w:t>
+      </w:r>
+      <w:proofErr w:type="spellEnd"/>
+      <w:r>
+        <w:rPr>
+          <w:rFonts w:ascii="Arial" w:eastAsia="Times New Roman" w:hAnsi="Arial" w:cs="Arial"/>
+          <w:sz w:val="20"/>
+          <w:szCs w:val="20"/>
+          <w:lang w:val="pt-BR" w:eastAsia="pt-BR"/>
+        </w:rPr>
+        <w:t>]</w:t>
+      </w:r>
+      <w:r>
+        <w:rPr>
+          <w:rFonts w:ascii="Arial" w:eastAsia="Times New Roman" w:hAnsi="Arial" w:cs="Arial"/>
+          <w:sz w:val="20"/>
+          <w:szCs w:val="20"/>
+          <w:lang w:val="pt-BR" w:eastAsia="pt-BR"/>
+        </w:rPr>
+        <w:t xml:space="preserve">: “”, </w:t>
+      </w:r>
+      <w:proofErr w:type="spellStart"/>
+      <w:r>
+        <w:rPr>
+          <w:rFonts w:ascii="Arial" w:eastAsia="Times New Roman" w:hAnsi="Arial" w:cs="Arial"/>
+          <w:sz w:val="20"/>
+          <w:szCs w:val="20"/>
+          <w:lang w:val="pt-BR" w:eastAsia="pt-BR"/>
+        </w:rPr>
+        <w:t>and</w:t>
+      </w:r>
+      <w:proofErr w:type="spellEnd"/>
+      <w:r>
+        <w:rPr>
+          <w:rFonts w:ascii="Arial" w:eastAsia="Times New Roman" w:hAnsi="Arial" w:cs="Arial"/>
+          <w:sz w:val="20"/>
+          <w:szCs w:val="20"/>
+          <w:lang w:val="pt-BR" w:eastAsia="pt-BR"/>
+        </w:rPr>
+        <w:t xml:space="preserve"> SYSTEM: “</w:t>
+      </w:r>
+      <w:proofErr w:type="spellStart"/>
+      <w:r>
+        <w:rPr>
+          <w:lang w:val="pt-BR"/>
+        </w:rPr>
+        <w:t>QuickSight</w:t>
+      </w:r>
+      <w:proofErr w:type="spellEnd"/>
+      <w:r>
+        <w:rPr>
+          <w:lang w:val="pt-BR"/>
+        </w:rPr>
+        <w:t>”</w:t>
+      </w:r>
+    </w:p>
+    <w:p>
+      <w:pPr>
+        <w:rPr>
+          <w:lang w:val="pt-BR"/>
+        </w:rPr>
+      </w:pPr>
+    </w:p>
+    <w:p>
+      <w:pPr>
+        <w:rPr>
+          <w:lang w:val="pt-BR"/>
+        </w:rPr>
+      </w:pPr>
+      <w:r>
+        <w:rPr>
+          <w:lang w:val="pt-BR"/>
+        </w:rPr>
+        <w:t xml:space="preserve">In file </w:t>
+      </w:r>
+      <w:r>
+        <w:rPr>
+          <w:lang w:val="pt-BR"/>
+        </w:rPr>
+        <w:t>Results-survey</w:t>
+      </w:r>
+      <w:r>
+        <w:rPr>
+          <w:lang w:val="pt-BR"/>
+        </w:rPr>
+        <w:t>127653</w:t>
+      </w:r>
+    </w:p>
+    <w:p>
+      <w:pPr>
+        <w:rPr>
+          <w:lang w:val="pt-BR"/>
+        </w:rPr>
+      </w:pPr>
+      <w:r>
+        <w:rPr>
+          <w:lang w:val="pt-BR"/>
+        </w:rPr>
+        <w:t>SYSTEM</w:t>
+      </w:r>
+      <w:r>
+        <w:rPr>
+          <w:lang w:val="pt-BR"/>
+        </w:rPr>
+        <w:t xml:space="preserve"> </w:t>
+      </w:r>
+      <w:proofErr w:type="spellStart"/>
+      <w:r>
+        <w:rPr>
+          <w:lang w:val="pt-BR"/>
+        </w:rPr>
+        <w:t>equal</w:t>
+      </w:r>
+      <w:proofErr w:type="spellEnd"/>
+      <w:r>
+        <w:rPr>
+          <w:lang w:val="pt-BR"/>
+        </w:rPr>
+        <w:t xml:space="preserve"> </w:t>
+      </w:r>
+      <w:proofErr w:type="spellStart"/>
+      <w:r>
+        <w:rPr>
+          <w:lang w:val="pt-BR"/>
+        </w:rPr>
+        <w:t>to</w:t>
+      </w:r>
+      <w:proofErr w:type="spellEnd"/>
+      <w:r>
+        <w:rPr>
+          <w:lang w:val="pt-BR"/>
+        </w:rPr>
         <w:t>:</w:t>
       </w:r>
-      <w:r>
-        <w:rPr>
-          <w:lang w:val="pt-BR"/>
-        </w:rPr>
-        <w:t xml:space="preserve"> “S09</w:t>
+    </w:p>
+    <w:p>
+      <w:pPr>
+        <w:rPr>
+          <w:lang w:val="pt-BR"/>
+        </w:rPr>
+      </w:pPr>
+      <w:r>
+        <w:rPr>
+          <w:lang w:val="pt-BR"/>
+        </w:rPr>
+        <w:t>- “</w:t>
+      </w:r>
+      <w:proofErr w:type="spellStart"/>
+      <w:r>
+        <w:rPr>
+          <w:lang w:val="pt-BR"/>
+        </w:rPr>
+        <w:t>Looker</w:t>
+      </w:r>
+      <w:proofErr w:type="spellEnd"/>
+      <w:r>
+        <w:rPr>
+          <w:lang w:val="pt-BR"/>
+        </w:rPr>
+        <w:t>”</w:t>
+      </w:r>
+      <w:r>
+        <w:rPr>
+          <w:lang w:val="pt-BR"/>
+        </w:rPr>
+        <w:t xml:space="preserve">: </w:t>
+      </w:r>
+    </w:p>
+    <w:p>
+      <w:pPr>
+        <w:rPr>
+          <w:lang w:val="pt-BR"/>
+        </w:rPr>
+      </w:pPr>
+      <w:r>
+        <w:rPr>
+          <w:lang w:val="pt-BR"/>
+        </w:rPr>
+        <w:t xml:space="preserve">update </w:t>
+      </w:r>
+      <w:proofErr w:type="spellStart"/>
+      <w:r>
+        <w:rPr>
+          <w:lang w:val="pt-BR"/>
+        </w:rPr>
+        <w:t>VASys</w:t>
+      </w:r>
+      <w:proofErr w:type="spellEnd"/>
+      <w:r>
+        <w:rPr>
+          <w:lang w:val="pt-BR"/>
+        </w:rPr>
+        <w:t>: “S0</w:t>
+      </w:r>
+      <w:r>
+        <w:rPr>
+          <w:lang w:val="pt-BR"/>
+        </w:rPr>
+        <w:t>8</w:t>
       </w:r>
       <w:r>
         <w:rPr>
@@ -2432,25 +3572,14 @@
           <w:szCs w:val="20"/>
           <w:lang w:val="pt-BR" w:eastAsia="pt-BR"/>
         </w:rPr>
-        <w:t xml:space="preserve"> SYSTEM</w:t>
-      </w:r>
-      <w:r>
-        <w:rPr>
-          <w:rFonts w:ascii="Arial" w:eastAsia="Times New Roman" w:hAnsi="Arial" w:cs="Arial"/>
-          <w:sz w:val="20"/>
-          <w:szCs w:val="20"/>
-          <w:lang w:val="pt-BR" w:eastAsia="pt-BR"/>
-        </w:rPr>
-        <w:t>: “</w:t>
-      </w:r>
-      <w:proofErr w:type="spellStart"/>
-      <w:r>
-        <w:rPr>
-          <w:lang w:val="pt-BR"/>
-        </w:rPr>
-        <w:t>QuickSight</w:t>
-      </w:r>
-      <w:proofErr w:type="spellEnd"/>
+        <w:t xml:space="preserve"> SYSTEM: “</w:t>
+      </w:r>
+      <w:r>
+        <w:rPr>
+          <w:lang w:val="pt-BR"/>
+        </w:rPr>
+        <w:t>Data Studio</w:t>
+      </w:r>
       <w:r>
         <w:rPr>
           <w:lang w:val="pt-BR"/>
@@ -2481,26 +3610,98 @@
         <w:rPr>
           <w:lang w:val="pt-BR"/>
         </w:rPr>
-        <w:t>Results-survey</w:t>
-      </w:r>
-      <w:r>
-        <w:rPr>
-          <w:lang w:val="pt-BR"/>
-        </w:rPr>
-        <w:t>127653</w:t>
-      </w:r>
-    </w:p>
-    <w:p>
-      <w:pPr>
-        <w:rPr>
-          <w:lang w:val="pt-BR"/>
-        </w:rPr>
-      </w:pPr>
-      <w:r>
-        <w:rPr>
-          <w:lang w:val="pt-BR"/>
-        </w:rPr>
-        <w:t>SYSTEM</w:t>
+        <w:t>Results-survey372164</w:t>
+      </w:r>
+    </w:p>
+    <w:p>
+      <w:pPr>
+        <w:rPr>
+          <w:lang w:val="pt-BR"/>
+        </w:rPr>
+      </w:pPr>
+      <w:proofErr w:type="spellStart"/>
+      <w:r>
+        <w:rPr>
+          <w:lang w:val="pt-BR"/>
+        </w:rPr>
+        <w:t>Select</w:t>
+      </w:r>
+      <w:proofErr w:type="spellEnd"/>
+      <w:r>
+        <w:rPr>
+          <w:lang w:val="pt-BR"/>
+        </w:rPr>
+        <w:t xml:space="preserve"> </w:t>
+      </w:r>
+      <w:proofErr w:type="spellStart"/>
+      <w:r>
+        <w:rPr>
+          <w:lang w:val="pt-BR"/>
+        </w:rPr>
+        <w:t>entries</w:t>
+      </w:r>
+      <w:proofErr w:type="spellEnd"/>
+      <w:r>
+        <w:rPr>
+          <w:lang w:val="pt-BR"/>
+        </w:rPr>
+        <w:t xml:space="preserve"> </w:t>
+      </w:r>
+      <w:proofErr w:type="spellStart"/>
+      <w:r>
+        <w:rPr>
+          <w:lang w:val="pt-BR"/>
+        </w:rPr>
+        <w:t>with</w:t>
+      </w:r>
+      <w:proofErr w:type="spellEnd"/>
+      <w:r>
+        <w:rPr>
+          <w:lang w:val="pt-BR"/>
+        </w:rPr>
+        <w:t xml:space="preserve"> </w:t>
+      </w:r>
+      <w:proofErr w:type="spellStart"/>
+      <w:r>
+        <w:rPr>
+          <w:lang w:val="pt-BR"/>
+        </w:rPr>
+        <w:t>column</w:t>
+      </w:r>
+      <w:proofErr w:type="spellEnd"/>
+      <w:r>
+        <w:rPr>
+          <w:lang w:val="pt-BR"/>
+        </w:rPr>
+        <w:t xml:space="preserve"> </w:t>
+      </w:r>
+      <w:proofErr w:type="spellStart"/>
+      <w:r>
+        <w:rPr>
+          <w:lang w:val="pt-BR"/>
+        </w:rPr>
+        <w:t>VASys</w:t>
+      </w:r>
+      <w:proofErr w:type="spellEnd"/>
+      <w:r>
+        <w:rPr>
+          <w:lang w:val="pt-BR"/>
+        </w:rPr>
+        <w:t>[</w:t>
+      </w:r>
+      <w:proofErr w:type="spellStart"/>
+      <w:r>
+        <w:rPr>
+          <w:lang w:val="pt-BR"/>
+        </w:rPr>
+        <w:t>other</w:t>
+      </w:r>
+      <w:proofErr w:type="spellEnd"/>
+      <w:r>
+        <w:rPr>
+          <w:lang w:val="pt-BR"/>
+        </w:rPr>
+        <w:t>]</w:t>
       </w:r>
       <w:r>
         <w:rPr>
@@ -2520,34 +3721,26 @@
         <w:rPr>
           <w:lang w:val="pt-BR"/>
         </w:rPr>
-        <w:t xml:space="preserve"> </w:t>
-      </w:r>
-      <w:proofErr w:type="spellStart"/>
-      <w:r>
-        <w:rPr>
-          <w:lang w:val="pt-BR"/>
-        </w:rPr>
-        <w:t>to</w:t>
-      </w:r>
-      <w:proofErr w:type="spellEnd"/>
-      <w:r>
-        <w:rPr>
-          <w:lang w:val="pt-BR"/>
-        </w:rPr>
-        <w:t>:</w:t>
-      </w:r>
-    </w:p>
-    <w:p>
-      <w:pPr>
-        <w:rPr>
-          <w:lang w:val="pt-BR"/>
-        </w:rPr>
-      </w:pPr>
-      <w:r>
-        <w:rPr>
-          <w:lang w:val="pt-BR"/>
-        </w:rPr>
-        <w:t>- “</w:t>
+        <w:t xml:space="preserve">: </w:t>
+      </w:r>
+    </w:p>
+    <w:p>
+      <w:pPr>
+        <w:rPr>
+          <w:lang w:val="pt-BR"/>
+        </w:rPr>
+      </w:pPr>
+      <w:r>
+        <w:rPr>
+          <w:lang w:val="pt-BR"/>
+        </w:rPr>
+        <w:t xml:space="preserve">- </w:t>
+      </w:r>
+      <w:r>
+        <w:rPr>
+          <w:lang w:val="pt-BR"/>
+        </w:rPr>
+        <w:t>Data Studio (</w:t>
       </w:r>
       <w:proofErr w:type="spellStart"/>
       <w:r>
@@ -2561,8 +3754,241 @@
         <w:rPr>
           <w:lang w:val="pt-BR"/>
         </w:rPr>
-        <w:t>”</w:t>
-      </w:r>
+        <w:t>)</w:t>
+      </w:r>
+    </w:p>
+    <w:p>
+      <w:pPr>
+        <w:rPr>
+          <w:lang w:val="pt-BR"/>
+        </w:rPr>
+      </w:pPr>
+      <w:r>
+        <w:rPr>
+          <w:lang w:val="pt-BR"/>
+        </w:rPr>
+        <w:t xml:space="preserve">update </w:t>
+      </w:r>
+      <w:proofErr w:type="spellStart"/>
+      <w:r>
+        <w:rPr>
+          <w:lang w:val="pt-BR"/>
+        </w:rPr>
+        <w:t>VASys</w:t>
+      </w:r>
+      <w:proofErr w:type="spellEnd"/>
+      <w:r>
+        <w:rPr>
+          <w:lang w:val="pt-BR"/>
+        </w:rPr>
+        <w:t xml:space="preserve">: “S08”, </w:t>
+      </w:r>
+      <w:proofErr w:type="spellStart"/>
+      <w:r>
+        <w:rPr>
+          <w:rFonts w:ascii="Arial" w:eastAsia="Times New Roman" w:hAnsi="Arial" w:cs="Arial"/>
+          <w:sz w:val="20"/>
+          <w:szCs w:val="20"/>
+          <w:lang w:val="pt-BR" w:eastAsia="pt-BR"/>
+        </w:rPr>
+        <w:t>VASys</w:t>
+      </w:r>
+      <w:proofErr w:type="spellEnd"/>
+      <w:r>
+        <w:rPr>
+          <w:rFonts w:ascii="Arial" w:eastAsia="Times New Roman" w:hAnsi="Arial" w:cs="Arial"/>
+          <w:sz w:val="20"/>
+          <w:szCs w:val="20"/>
+          <w:lang w:val="pt-BR" w:eastAsia="pt-BR"/>
+        </w:rPr>
+        <w:t>[</w:t>
+      </w:r>
+      <w:proofErr w:type="spellStart"/>
+      <w:r>
+        <w:rPr>
+          <w:rFonts w:ascii="Arial" w:eastAsia="Times New Roman" w:hAnsi="Arial" w:cs="Arial"/>
+          <w:sz w:val="20"/>
+          <w:szCs w:val="20"/>
+          <w:lang w:val="pt-BR" w:eastAsia="pt-BR"/>
+        </w:rPr>
+        <w:t>other</w:t>
+      </w:r>
+      <w:proofErr w:type="spellEnd"/>
+      <w:r>
+        <w:rPr>
+          <w:rFonts w:ascii="Arial" w:eastAsia="Times New Roman" w:hAnsi="Arial" w:cs="Arial"/>
+          <w:sz w:val="20"/>
+          <w:szCs w:val="20"/>
+          <w:lang w:val="pt-BR" w:eastAsia="pt-BR"/>
+        </w:rPr>
+        <w:t>]</w:t>
+      </w:r>
+      <w:r>
+        <w:rPr>
+          <w:rFonts w:ascii="Arial" w:eastAsia="Times New Roman" w:hAnsi="Arial" w:cs="Arial"/>
+          <w:sz w:val="20"/>
+          <w:szCs w:val="20"/>
+          <w:lang w:val="pt-BR" w:eastAsia="pt-BR"/>
+        </w:rPr>
+        <w:t xml:space="preserve">: “”, </w:t>
+      </w:r>
+      <w:proofErr w:type="spellStart"/>
+      <w:r>
+        <w:rPr>
+          <w:rFonts w:ascii="Arial" w:eastAsia="Times New Roman" w:hAnsi="Arial" w:cs="Arial"/>
+          <w:sz w:val="20"/>
+          <w:szCs w:val="20"/>
+          <w:lang w:val="pt-BR" w:eastAsia="pt-BR"/>
+        </w:rPr>
+        <w:t>and</w:t>
+      </w:r>
+      <w:proofErr w:type="spellEnd"/>
+      <w:r>
+        <w:rPr>
+          <w:rFonts w:ascii="Arial" w:eastAsia="Times New Roman" w:hAnsi="Arial" w:cs="Arial"/>
+          <w:sz w:val="20"/>
+          <w:szCs w:val="20"/>
+          <w:lang w:val="pt-BR" w:eastAsia="pt-BR"/>
+        </w:rPr>
+        <w:t xml:space="preserve"> SYSTEM: “</w:t>
+      </w:r>
+      <w:r>
+        <w:rPr>
+          <w:lang w:val="pt-BR"/>
+        </w:rPr>
+        <w:t>Data Studio”</w:t>
+      </w:r>
+    </w:p>
+    <w:p>
+      <w:pPr>
+        <w:rPr>
+          <w:lang w:val="pt-BR"/>
+        </w:rPr>
+      </w:pPr>
+    </w:p>
+    <w:p>
+      <w:pPr>
+        <w:rPr>
+          <w:lang w:val="pt-BR"/>
+        </w:rPr>
+      </w:pPr>
+      <w:r>
+        <w:rPr>
+          <w:lang w:val="pt-BR"/>
+        </w:rPr>
+        <w:t xml:space="preserve">In file: </w:t>
+      </w:r>
+      <w:r>
+        <w:rPr>
+          <w:lang w:val="pt-BR"/>
+        </w:rPr>
+        <w:t>results-survey127653</w:t>
+      </w:r>
+    </w:p>
+    <w:p>
+      <w:pPr>
+        <w:rPr>
+          <w:lang w:val="pt-BR"/>
+        </w:rPr>
+      </w:pPr>
+      <w:proofErr w:type="spellStart"/>
+      <w:r>
+        <w:rPr>
+          <w:lang w:val="pt-BR"/>
+        </w:rPr>
+        <w:t>Select</w:t>
+      </w:r>
+      <w:proofErr w:type="spellEnd"/>
+      <w:r>
+        <w:rPr>
+          <w:lang w:val="pt-BR"/>
+        </w:rPr>
+        <w:t xml:space="preserve"> </w:t>
+      </w:r>
+      <w:proofErr w:type="spellStart"/>
+      <w:r>
+        <w:rPr>
+          <w:lang w:val="pt-BR"/>
+        </w:rPr>
+        <w:t>entries</w:t>
+      </w:r>
+      <w:proofErr w:type="spellEnd"/>
+      <w:r>
+        <w:rPr>
+          <w:lang w:val="pt-BR"/>
+        </w:rPr>
+        <w:t xml:space="preserve"> </w:t>
+      </w:r>
+      <w:proofErr w:type="spellStart"/>
+      <w:r>
+        <w:rPr>
+          <w:lang w:val="pt-BR"/>
+        </w:rPr>
+        <w:t>with</w:t>
+      </w:r>
+      <w:proofErr w:type="spellEnd"/>
+      <w:r>
+        <w:rPr>
+          <w:lang w:val="pt-BR"/>
+        </w:rPr>
+        <w:t xml:space="preserve"> </w:t>
+      </w:r>
+      <w:proofErr w:type="spellStart"/>
+      <w:r>
+        <w:rPr>
+          <w:lang w:val="pt-BR"/>
+        </w:rPr>
+        <w:t>column</w:t>
+      </w:r>
+      <w:proofErr w:type="spellEnd"/>
+      <w:r>
+        <w:rPr>
+          <w:lang w:val="pt-BR"/>
+        </w:rPr>
+        <w:t xml:space="preserve"> </w:t>
+      </w:r>
+      <w:proofErr w:type="spellStart"/>
+      <w:r>
+        <w:rPr>
+          <w:lang w:val="pt-BR"/>
+        </w:rPr>
+        <w:t>VASys</w:t>
+      </w:r>
+      <w:proofErr w:type="spellEnd"/>
+      <w:r>
+        <w:rPr>
+          <w:lang w:val="pt-BR"/>
+        </w:rPr>
+        <w:t>[</w:t>
+      </w:r>
+      <w:proofErr w:type="spellStart"/>
+      <w:r>
+        <w:rPr>
+          <w:lang w:val="pt-BR"/>
+        </w:rPr>
+        <w:t>other</w:t>
+      </w:r>
+      <w:proofErr w:type="spellEnd"/>
+      <w:r>
+        <w:rPr>
+          <w:lang w:val="pt-BR"/>
+        </w:rPr>
+        <w:t>]</w:t>
+      </w:r>
+      <w:r>
+        <w:rPr>
+          <w:lang w:val="pt-BR"/>
+        </w:rPr>
+        <w:t xml:space="preserve"> </w:t>
+      </w:r>
+      <w:proofErr w:type="spellStart"/>
+      <w:r>
+        <w:rPr>
+          <w:lang w:val="pt-BR"/>
+        </w:rPr>
+        <w:t>equal</w:t>
+      </w:r>
+      <w:proofErr w:type="spellEnd"/>
       <w:r>
         <w:rPr>
           <w:lang w:val="pt-BR"/>
@@ -2576,6 +4002,35 @@
           <w:lang w:val="pt-BR"/>
         </w:rPr>
       </w:pPr>
+      <w:proofErr w:type="spellStart"/>
+      <w:r>
+        <w:rPr>
+          <w:lang w:val="pt-BR"/>
+        </w:rPr>
+        <w:t>PowerBI</w:t>
+      </w:r>
+      <w:proofErr w:type="spellEnd"/>
+      <w:r>
+        <w:rPr>
+          <w:lang w:val="pt-BR"/>
+        </w:rPr>
+        <w:t xml:space="preserve">, </w:t>
+      </w:r>
+      <w:proofErr w:type="spellStart"/>
+      <w:r>
+        <w:rPr>
+          <w:lang w:val="pt-BR"/>
+        </w:rPr>
+        <w:t>QlikView</w:t>
+      </w:r>
+      <w:proofErr w:type="spellEnd"/>
+    </w:p>
+    <w:p>
+      <w:pPr>
+        <w:rPr>
+          <w:lang w:val="pt-BR"/>
+        </w:rPr>
+      </w:pPr>
       <w:r>
         <w:rPr>
           <w:lang w:val="pt-BR"/>
@@ -2594,19 +4049,7 @@
         <w:rPr>
           <w:lang w:val="pt-BR"/>
         </w:rPr>
-        <w:t>: “S0</w:t>
-      </w:r>
-      <w:r>
-        <w:rPr>
-          <w:lang w:val="pt-BR"/>
-        </w:rPr>
-        <w:t>8</w:t>
-      </w:r>
-      <w:r>
-        <w:rPr>
-          <w:lang w:val="pt-BR"/>
-        </w:rPr>
-        <w:t xml:space="preserve">”, </w:t>
+        <w:t xml:space="preserve">: “S01”, </w:t>
       </w:r>
       <w:proofErr w:type="spellStart"/>
       <w:r>
@@ -2681,583 +4124,7 @@
         <w:rPr>
           <w:lang w:val="pt-BR"/>
         </w:rPr>
-        <w:t>Data Studio</w:t>
-      </w:r>
-      <w:r>
-        <w:rPr>
-          <w:lang w:val="pt-BR"/>
-        </w:rPr>
-        <w:t>”</w:t>
-      </w:r>
-    </w:p>
-    <w:p>
-      <w:pPr>
-        <w:rPr>
-          <w:lang w:val="pt-BR"/>
-        </w:rPr>
-      </w:pPr>
-    </w:p>
-    <w:p>
-      <w:pPr>
-        <w:rPr>
-          <w:lang w:val="pt-BR"/>
-        </w:rPr>
-      </w:pPr>
-      <w:r>
-        <w:rPr>
-          <w:lang w:val="pt-BR"/>
-        </w:rPr>
-        <w:t xml:space="preserve">In file </w:t>
-      </w:r>
-      <w:r>
-        <w:rPr>
-          <w:lang w:val="pt-BR"/>
-        </w:rPr>
-        <w:t>Re</w:t>
-      </w:r>
-      <w:r>
-        <w:rPr>
-          <w:lang w:val="pt-BR"/>
-        </w:rPr>
-        <w:t>s</w:t>
-      </w:r>
-      <w:r>
-        <w:rPr>
-          <w:lang w:val="pt-BR"/>
-        </w:rPr>
-        <w:t>ults-survey372164</w:t>
-      </w:r>
-    </w:p>
-    <w:p>
-      <w:pPr>
-        <w:rPr>
-          <w:lang w:val="pt-BR"/>
-        </w:rPr>
-      </w:pPr>
-      <w:proofErr w:type="spellStart"/>
-      <w:r>
-        <w:rPr>
-          <w:lang w:val="pt-BR"/>
-        </w:rPr>
-        <w:t>Select</w:t>
-      </w:r>
-      <w:proofErr w:type="spellEnd"/>
-      <w:r>
-        <w:rPr>
-          <w:lang w:val="pt-BR"/>
-        </w:rPr>
-        <w:t xml:space="preserve"> </w:t>
-      </w:r>
-      <w:proofErr w:type="spellStart"/>
-      <w:r>
-        <w:rPr>
-          <w:lang w:val="pt-BR"/>
-        </w:rPr>
-        <w:t>entries</w:t>
-      </w:r>
-      <w:proofErr w:type="spellEnd"/>
-      <w:r>
-        <w:rPr>
-          <w:lang w:val="pt-BR"/>
-        </w:rPr>
-        <w:t xml:space="preserve"> </w:t>
-      </w:r>
-      <w:proofErr w:type="spellStart"/>
-      <w:r>
-        <w:rPr>
-          <w:lang w:val="pt-BR"/>
-        </w:rPr>
-        <w:t>with</w:t>
-      </w:r>
-      <w:proofErr w:type="spellEnd"/>
-      <w:r>
-        <w:rPr>
-          <w:lang w:val="pt-BR"/>
-        </w:rPr>
-        <w:t xml:space="preserve"> </w:t>
-      </w:r>
-      <w:proofErr w:type="spellStart"/>
-      <w:r>
-        <w:rPr>
-          <w:lang w:val="pt-BR"/>
-        </w:rPr>
-        <w:t>column</w:t>
-      </w:r>
-      <w:proofErr w:type="spellEnd"/>
-      <w:r>
-        <w:rPr>
-          <w:lang w:val="pt-BR"/>
-        </w:rPr>
-        <w:t xml:space="preserve"> </w:t>
-      </w:r>
-      <w:proofErr w:type="spellStart"/>
-      <w:r>
-        <w:rPr>
-          <w:lang w:val="pt-BR"/>
-        </w:rPr>
-        <w:t>VASys</w:t>
-      </w:r>
-      <w:proofErr w:type="spellEnd"/>
-      <w:r>
-        <w:rPr>
-          <w:lang w:val="pt-BR"/>
-        </w:rPr>
-        <w:t>[</w:t>
-      </w:r>
-      <w:proofErr w:type="spellStart"/>
-      <w:r>
-        <w:rPr>
-          <w:lang w:val="pt-BR"/>
-        </w:rPr>
-        <w:t>other</w:t>
-      </w:r>
-      <w:proofErr w:type="spellEnd"/>
-      <w:r>
-        <w:rPr>
-          <w:lang w:val="pt-BR"/>
-        </w:rPr>
-        <w:t>]</w:t>
-      </w:r>
-      <w:r>
-        <w:rPr>
-          <w:lang w:val="pt-BR"/>
-        </w:rPr>
-        <w:t xml:space="preserve"> </w:t>
-      </w:r>
-      <w:proofErr w:type="spellStart"/>
-      <w:r>
-        <w:rPr>
-          <w:lang w:val="pt-BR"/>
-        </w:rPr>
-        <w:t>equal</w:t>
-      </w:r>
-      <w:proofErr w:type="spellEnd"/>
-      <w:r>
-        <w:rPr>
-          <w:lang w:val="pt-BR"/>
-        </w:rPr>
-        <w:t xml:space="preserve">: </w:t>
-      </w:r>
-    </w:p>
-    <w:p>
-      <w:pPr>
-        <w:rPr>
-          <w:lang w:val="pt-BR"/>
-        </w:rPr>
-      </w:pPr>
-      <w:r>
-        <w:rPr>
-          <w:lang w:val="pt-BR"/>
-        </w:rPr>
-        <w:t xml:space="preserve">- </w:t>
-      </w:r>
-      <w:r>
-        <w:rPr>
-          <w:lang w:val="pt-BR"/>
-        </w:rPr>
-        <w:t>Data Studio (</w:t>
-      </w:r>
-      <w:proofErr w:type="spellStart"/>
-      <w:r>
-        <w:rPr>
-          <w:lang w:val="pt-BR"/>
-        </w:rPr>
-        <w:t>Looker</w:t>
-      </w:r>
-      <w:proofErr w:type="spellEnd"/>
-      <w:r>
-        <w:rPr>
-          <w:lang w:val="pt-BR"/>
-        </w:rPr>
-        <w:t>)</w:t>
-      </w:r>
-    </w:p>
-    <w:p>
-      <w:pPr>
-        <w:rPr>
-          <w:lang w:val="pt-BR"/>
-        </w:rPr>
-      </w:pPr>
-      <w:r>
-        <w:rPr>
-          <w:lang w:val="pt-BR"/>
-        </w:rPr>
-        <w:t xml:space="preserve">update </w:t>
-      </w:r>
-      <w:proofErr w:type="spellStart"/>
-      <w:r>
-        <w:rPr>
-          <w:lang w:val="pt-BR"/>
-        </w:rPr>
-        <w:t>VASys</w:t>
-      </w:r>
-      <w:proofErr w:type="spellEnd"/>
-      <w:r>
-        <w:rPr>
-          <w:lang w:val="pt-BR"/>
-        </w:rPr>
-        <w:t xml:space="preserve">: “S08”, </w:t>
-      </w:r>
-      <w:proofErr w:type="spellStart"/>
-      <w:r>
-        <w:rPr>
-          <w:rFonts w:ascii="Arial" w:eastAsia="Times New Roman" w:hAnsi="Arial" w:cs="Arial"/>
-          <w:sz w:val="20"/>
-          <w:szCs w:val="20"/>
-          <w:lang w:val="pt-BR" w:eastAsia="pt-BR"/>
-        </w:rPr>
-        <w:t>VASys</w:t>
-      </w:r>
-      <w:proofErr w:type="spellEnd"/>
-      <w:r>
-        <w:rPr>
-          <w:rFonts w:ascii="Arial" w:eastAsia="Times New Roman" w:hAnsi="Arial" w:cs="Arial"/>
-          <w:sz w:val="20"/>
-          <w:szCs w:val="20"/>
-          <w:lang w:val="pt-BR" w:eastAsia="pt-BR"/>
-        </w:rPr>
-        <w:t>[</w:t>
-      </w:r>
-      <w:proofErr w:type="spellStart"/>
-      <w:r>
-        <w:rPr>
-          <w:rFonts w:ascii="Arial" w:eastAsia="Times New Roman" w:hAnsi="Arial" w:cs="Arial"/>
-          <w:sz w:val="20"/>
-          <w:szCs w:val="20"/>
-          <w:lang w:val="pt-BR" w:eastAsia="pt-BR"/>
-        </w:rPr>
-        <w:t>other</w:t>
-      </w:r>
-      <w:proofErr w:type="spellEnd"/>
-      <w:r>
-        <w:rPr>
-          <w:rFonts w:ascii="Arial" w:eastAsia="Times New Roman" w:hAnsi="Arial" w:cs="Arial"/>
-          <w:sz w:val="20"/>
-          <w:szCs w:val="20"/>
-          <w:lang w:val="pt-BR" w:eastAsia="pt-BR"/>
-        </w:rPr>
-        <w:t>]</w:t>
-      </w:r>
-      <w:r>
-        <w:rPr>
-          <w:rFonts w:ascii="Arial" w:eastAsia="Times New Roman" w:hAnsi="Arial" w:cs="Arial"/>
-          <w:sz w:val="20"/>
-          <w:szCs w:val="20"/>
-          <w:lang w:val="pt-BR" w:eastAsia="pt-BR"/>
-        </w:rPr>
-        <w:t xml:space="preserve">: “”, </w:t>
-      </w:r>
-      <w:proofErr w:type="spellStart"/>
-      <w:r>
-        <w:rPr>
-          <w:rFonts w:ascii="Arial" w:eastAsia="Times New Roman" w:hAnsi="Arial" w:cs="Arial"/>
-          <w:sz w:val="20"/>
-          <w:szCs w:val="20"/>
-          <w:lang w:val="pt-BR" w:eastAsia="pt-BR"/>
-        </w:rPr>
-        <w:t>and</w:t>
-      </w:r>
-      <w:proofErr w:type="spellEnd"/>
-      <w:r>
-        <w:rPr>
-          <w:rFonts w:ascii="Arial" w:eastAsia="Times New Roman" w:hAnsi="Arial" w:cs="Arial"/>
-          <w:sz w:val="20"/>
-          <w:szCs w:val="20"/>
-          <w:lang w:val="pt-BR" w:eastAsia="pt-BR"/>
-        </w:rPr>
-        <w:t xml:space="preserve"> SYSTEM: “</w:t>
-      </w:r>
-      <w:r>
-        <w:rPr>
-          <w:lang w:val="pt-BR"/>
-        </w:rPr>
-        <w:t>Data Studio”</w:t>
-      </w:r>
-    </w:p>
-    <w:p>
-      <w:pPr>
-        <w:rPr>
-          <w:lang w:val="pt-BR"/>
-        </w:rPr>
-      </w:pPr>
-    </w:p>
-    <w:p>
-      <w:pPr>
-        <w:rPr>
-          <w:lang w:val="pt-BR"/>
-        </w:rPr>
-      </w:pPr>
-      <w:r>
-        <w:rPr>
-          <w:lang w:val="pt-BR"/>
-        </w:rPr>
-        <w:t xml:space="preserve">In file: </w:t>
-      </w:r>
-      <w:r>
-        <w:rPr>
-          <w:lang w:val="pt-BR"/>
-        </w:rPr>
-        <w:t>results-survey127653</w:t>
-      </w:r>
-    </w:p>
-    <w:p>
-      <w:pPr>
-        <w:rPr>
-          <w:lang w:val="pt-BR"/>
-        </w:rPr>
-      </w:pPr>
-      <w:proofErr w:type="spellStart"/>
-      <w:r>
-        <w:rPr>
-          <w:lang w:val="pt-BR"/>
-        </w:rPr>
-        <w:t>Select</w:t>
-      </w:r>
-      <w:proofErr w:type="spellEnd"/>
-      <w:r>
-        <w:rPr>
-          <w:lang w:val="pt-BR"/>
-        </w:rPr>
-        <w:t xml:space="preserve"> </w:t>
-      </w:r>
-      <w:proofErr w:type="spellStart"/>
-      <w:r>
-        <w:rPr>
-          <w:lang w:val="pt-BR"/>
-        </w:rPr>
-        <w:t>entries</w:t>
-      </w:r>
-      <w:proofErr w:type="spellEnd"/>
-      <w:r>
-        <w:rPr>
-          <w:lang w:val="pt-BR"/>
-        </w:rPr>
-        <w:t xml:space="preserve"> </w:t>
-      </w:r>
-      <w:proofErr w:type="spellStart"/>
-      <w:r>
-        <w:rPr>
-          <w:lang w:val="pt-BR"/>
-        </w:rPr>
-        <w:t>with</w:t>
-      </w:r>
-      <w:proofErr w:type="spellEnd"/>
-      <w:r>
-        <w:rPr>
-          <w:lang w:val="pt-BR"/>
-        </w:rPr>
-        <w:t xml:space="preserve"> </w:t>
-      </w:r>
-      <w:proofErr w:type="spellStart"/>
-      <w:r>
-        <w:rPr>
-          <w:lang w:val="pt-BR"/>
-        </w:rPr>
-        <w:t>column</w:t>
-      </w:r>
-      <w:proofErr w:type="spellEnd"/>
-      <w:r>
-        <w:rPr>
-          <w:lang w:val="pt-BR"/>
-        </w:rPr>
-        <w:t xml:space="preserve"> </w:t>
-      </w:r>
-      <w:proofErr w:type="spellStart"/>
-      <w:r>
-        <w:rPr>
-          <w:lang w:val="pt-BR"/>
-        </w:rPr>
-        <w:t>VASys</w:t>
-      </w:r>
-      <w:proofErr w:type="spellEnd"/>
-      <w:r>
-        <w:rPr>
-          <w:lang w:val="pt-BR"/>
-        </w:rPr>
-        <w:t>[</w:t>
-      </w:r>
-      <w:proofErr w:type="spellStart"/>
-      <w:r>
-        <w:rPr>
-          <w:lang w:val="pt-BR"/>
-        </w:rPr>
-        <w:t>other</w:t>
-      </w:r>
-      <w:proofErr w:type="spellEnd"/>
-      <w:r>
-        <w:rPr>
-          <w:lang w:val="pt-BR"/>
-        </w:rPr>
-        <w:t>]</w:t>
-      </w:r>
-      <w:r>
-        <w:rPr>
-          <w:lang w:val="pt-BR"/>
-        </w:rPr>
-        <w:t xml:space="preserve"> </w:t>
-      </w:r>
-      <w:proofErr w:type="spellStart"/>
-      <w:r>
-        <w:rPr>
-          <w:lang w:val="pt-BR"/>
-        </w:rPr>
-        <w:t>equal</w:t>
-      </w:r>
-      <w:proofErr w:type="spellEnd"/>
-      <w:r>
-        <w:rPr>
-          <w:lang w:val="pt-BR"/>
-        </w:rPr>
-        <w:t xml:space="preserve">: </w:t>
-      </w:r>
-    </w:p>
-    <w:p>
-      <w:pPr>
-        <w:rPr>
-          <w:lang w:val="pt-BR"/>
-        </w:rPr>
-      </w:pPr>
-      <w:proofErr w:type="spellStart"/>
-      <w:r>
-        <w:rPr>
-          <w:lang w:val="pt-BR"/>
-        </w:rPr>
-        <w:t>PowerBI</w:t>
-      </w:r>
-      <w:proofErr w:type="spellEnd"/>
-      <w:r>
-        <w:rPr>
-          <w:lang w:val="pt-BR"/>
-        </w:rPr>
-        <w:t xml:space="preserve">, </w:t>
-      </w:r>
-      <w:proofErr w:type="spellStart"/>
-      <w:r>
-        <w:rPr>
-          <w:lang w:val="pt-BR"/>
-        </w:rPr>
-        <w:t>QlikView</w:t>
-      </w:r>
-      <w:proofErr w:type="spellEnd"/>
-    </w:p>
-    <w:p>
-      <w:pPr>
-        <w:rPr>
-          <w:lang w:val="pt-BR"/>
-        </w:rPr>
-      </w:pPr>
-      <w:r>
-        <w:rPr>
-          <w:lang w:val="pt-BR"/>
-        </w:rPr>
-        <w:t xml:space="preserve">update </w:t>
-      </w:r>
-      <w:proofErr w:type="spellStart"/>
-      <w:r>
-        <w:rPr>
-          <w:lang w:val="pt-BR"/>
-        </w:rPr>
-        <w:t>VASys</w:t>
-      </w:r>
-      <w:proofErr w:type="spellEnd"/>
-      <w:r>
-        <w:rPr>
-          <w:lang w:val="pt-BR"/>
-        </w:rPr>
-        <w:t>: “S0</w:t>
-      </w:r>
-      <w:r>
-        <w:rPr>
-          <w:lang w:val="pt-BR"/>
-        </w:rPr>
-        <w:t>1</w:t>
-      </w:r>
-      <w:r>
-        <w:rPr>
-          <w:lang w:val="pt-BR"/>
-        </w:rPr>
-        <w:t xml:space="preserve">”, </w:t>
-      </w:r>
-      <w:proofErr w:type="spellStart"/>
-      <w:r>
-        <w:rPr>
-          <w:rFonts w:ascii="Arial" w:eastAsia="Times New Roman" w:hAnsi="Arial" w:cs="Arial"/>
-          <w:sz w:val="20"/>
-          <w:szCs w:val="20"/>
-          <w:lang w:val="pt-BR" w:eastAsia="pt-BR"/>
-        </w:rPr>
-        <w:t>VASys</w:t>
-      </w:r>
-      <w:proofErr w:type="spellEnd"/>
-      <w:r>
-        <w:rPr>
-          <w:rFonts w:ascii="Arial" w:eastAsia="Times New Roman" w:hAnsi="Arial" w:cs="Arial"/>
-          <w:sz w:val="20"/>
-          <w:szCs w:val="20"/>
-          <w:lang w:val="pt-BR" w:eastAsia="pt-BR"/>
-        </w:rPr>
-        <w:t>[</w:t>
-      </w:r>
-      <w:proofErr w:type="spellStart"/>
-      <w:r>
-        <w:rPr>
-          <w:rFonts w:ascii="Arial" w:eastAsia="Times New Roman" w:hAnsi="Arial" w:cs="Arial"/>
-          <w:sz w:val="20"/>
-          <w:szCs w:val="20"/>
-          <w:lang w:val="pt-BR" w:eastAsia="pt-BR"/>
-        </w:rPr>
-        <w:t>other</w:t>
-      </w:r>
-      <w:proofErr w:type="spellEnd"/>
-      <w:r>
-        <w:rPr>
-          <w:rFonts w:ascii="Arial" w:eastAsia="Times New Roman" w:hAnsi="Arial" w:cs="Arial"/>
-          <w:sz w:val="20"/>
-          <w:szCs w:val="20"/>
-          <w:lang w:val="pt-BR" w:eastAsia="pt-BR"/>
-        </w:rPr>
-        <w:t>]</w:t>
-      </w:r>
-      <w:r>
-        <w:rPr>
-          <w:rFonts w:ascii="Arial" w:eastAsia="Times New Roman" w:hAnsi="Arial" w:cs="Arial"/>
-          <w:sz w:val="20"/>
-          <w:szCs w:val="20"/>
-          <w:lang w:val="pt-BR" w:eastAsia="pt-BR"/>
-        </w:rPr>
-        <w:t xml:space="preserve">: “”, </w:t>
-      </w:r>
-      <w:proofErr w:type="spellStart"/>
-      <w:r>
-        <w:rPr>
-          <w:rFonts w:ascii="Arial" w:eastAsia="Times New Roman" w:hAnsi="Arial" w:cs="Arial"/>
-          <w:sz w:val="20"/>
-          <w:szCs w:val="20"/>
-          <w:lang w:val="pt-BR" w:eastAsia="pt-BR"/>
-        </w:rPr>
-        <w:t>and</w:t>
-      </w:r>
-      <w:proofErr w:type="spellEnd"/>
-      <w:r>
-        <w:rPr>
-          <w:rFonts w:ascii="Arial" w:eastAsia="Times New Roman" w:hAnsi="Arial" w:cs="Arial"/>
-          <w:sz w:val="20"/>
-          <w:szCs w:val="20"/>
-          <w:lang w:val="pt-BR" w:eastAsia="pt-BR"/>
-        </w:rPr>
-        <w:t xml:space="preserve"> SYSTEM: “</w:t>
-      </w:r>
-      <w:r>
-        <w:rPr>
-          <w:lang w:val="pt-BR"/>
-        </w:rPr>
-        <w:t>Power BI</w:t>
-      </w:r>
-      <w:r>
-        <w:rPr>
-          <w:lang w:val="pt-BR"/>
-        </w:rPr>
-        <w:t>”</w:t>
+        <w:t>Power BI”</w:t>
       </w:r>
     </w:p>
     <w:p>
@@ -3594,13 +4461,7 @@
         <w:rPr>
           <w:lang w:val="pt-BR"/>
         </w:rPr>
-        <w:t xml:space="preserve"> </w:t>
-      </w:r>
-      <w:r>
-        <w:rPr>
-          <w:lang w:val="pt-BR"/>
-        </w:rPr>
-        <w:t>UEQS1[SQ004]</w:t>
+        <w:t xml:space="preserve"> UEQS1[SQ004]</w:t>
       </w:r>
       <w:r>
         <w:rPr>
@@ -3723,19 +4584,7 @@
         <w:rPr>
           <w:lang w:val="pt-BR"/>
         </w:rPr>
-        <w:t>: AO0</w:t>
-      </w:r>
-      <w:r>
-        <w:rPr>
-          <w:lang w:val="pt-BR"/>
-        </w:rPr>
-        <w:t>2</w:t>
-      </w:r>
-      <w:r>
-        <w:rPr>
-          <w:lang w:val="pt-BR"/>
-        </w:rPr>
-        <w:t xml:space="preserve"> </w:t>
+        <w:t xml:space="preserve">: AO02 </w:t>
       </w:r>
       <w:proofErr w:type="spellStart"/>
       <w:r>
@@ -3761,13 +4610,7 @@
         <w:rPr>
           <w:lang w:val="pt-BR"/>
         </w:rPr>
-        <w:t>O0</w:t>
-      </w:r>
-      <w:r>
-        <w:rPr>
-          <w:lang w:val="pt-BR"/>
-        </w:rPr>
-        <w:t>2</w:t>
+        <w:t>O02</w:t>
       </w:r>
     </w:p>
     <w:p>
@@ -3788,19 +4631,7 @@
         <w:rPr>
           <w:lang w:val="pt-BR"/>
         </w:rPr>
-        <w:t>: AO0</w:t>
-      </w:r>
-      <w:r>
-        <w:rPr>
-          <w:lang w:val="pt-BR"/>
-        </w:rPr>
-        <w:t>3</w:t>
-      </w:r>
-      <w:r>
-        <w:rPr>
-          <w:lang w:val="pt-BR"/>
-        </w:rPr>
-        <w:t xml:space="preserve"> </w:t>
+        <w:t xml:space="preserve">: AO03 </w:t>
       </w:r>
       <w:proofErr w:type="spellStart"/>
       <w:r>
@@ -3826,13 +4657,7 @@
         <w:rPr>
           <w:lang w:val="pt-BR"/>
         </w:rPr>
-        <w:t>O0</w:t>
-      </w:r>
-      <w:r>
-        <w:rPr>
-          <w:lang w:val="pt-BR"/>
-        </w:rPr>
-        <w:t>3</w:t>
+        <w:t>O03</w:t>
       </w:r>
     </w:p>
     <w:p>
@@ -3860,19 +4685,7 @@
         <w:rPr>
           <w:lang w:val="pt-BR"/>
         </w:rPr>
-        <w:t>: AO0</w:t>
-      </w:r>
-      <w:r>
-        <w:rPr>
-          <w:lang w:val="pt-BR"/>
-        </w:rPr>
-        <w:t>5</w:t>
-      </w:r>
-      <w:r>
-        <w:rPr>
-          <w:lang w:val="pt-BR"/>
-        </w:rPr>
-        <w:t xml:space="preserve"> </w:t>
+        <w:t xml:space="preserve">: AO05 </w:t>
       </w:r>
       <w:proofErr w:type="spellStart"/>
       <w:r>
@@ -3886,13 +4699,7 @@
         <w:rPr>
           <w:lang w:val="pt-BR"/>
         </w:rPr>
-        <w:t>: AO0</w:t>
-      </w:r>
-      <w:r>
-        <w:rPr>
-          <w:lang w:val="pt-BR"/>
-        </w:rPr>
-        <w:t>3</w:t>
+        <w:t>: AO03</w:t>
       </w:r>
     </w:p>
     <w:p>
@@ -3913,19 +4720,7 @@
         <w:rPr>
           <w:lang w:val="pt-BR"/>
         </w:rPr>
-        <w:t>: AO0</w:t>
-      </w:r>
-      <w:r>
-        <w:rPr>
-          <w:lang w:val="pt-BR"/>
-        </w:rPr>
-        <w:t>6</w:t>
-      </w:r>
-      <w:r>
-        <w:rPr>
-          <w:lang w:val="pt-BR"/>
-        </w:rPr>
-        <w:t xml:space="preserve"> </w:t>
+        <w:t xml:space="preserve">: AO06 </w:t>
       </w:r>
       <w:proofErr w:type="spellStart"/>
       <w:r>
@@ -3939,13 +4734,7 @@
         <w:rPr>
           <w:lang w:val="pt-BR"/>
         </w:rPr>
-        <w:t>: AO0</w:t>
-      </w:r>
-      <w:r>
-        <w:rPr>
-          <w:lang w:val="pt-BR"/>
-        </w:rPr>
-        <w:t>2</w:t>
+        <w:t>: AO02</w:t>
       </w:r>
     </w:p>
     <w:p>
@@ -3966,19 +4755,7 @@
         <w:rPr>
           <w:lang w:val="pt-BR"/>
         </w:rPr>
-        <w:t>: AO0</w:t>
-      </w:r>
-      <w:r>
-        <w:rPr>
-          <w:lang w:val="pt-BR"/>
-        </w:rPr>
-        <w:t>7</w:t>
-      </w:r>
-      <w:r>
-        <w:rPr>
-          <w:lang w:val="pt-BR"/>
-        </w:rPr>
-        <w:t xml:space="preserve"> </w:t>
+        <w:t xml:space="preserve">: AO07 </w:t>
       </w:r>
       <w:proofErr w:type="spellStart"/>
       <w:r>
@@ -4066,13 +4843,7 @@
         <w:rPr>
           <w:lang w:val="pt-BR"/>
         </w:rPr>
-        <w:t>BO0</w:t>
-      </w:r>
-      <w:r>
-        <w:rPr>
-          <w:lang w:val="pt-BR"/>
-        </w:rPr>
-        <w:t>2</w:t>
+        <w:t>BO02</w:t>
       </w:r>
       <w:r>
         <w:rPr>
@@ -4119,19 +4890,27 @@
         <w:rPr>
           <w:lang w:val="pt-BR"/>
         </w:rPr>
-        <w:t>BO0</w:t>
-      </w:r>
-      <w:r>
-        <w:rPr>
-          <w:lang w:val="pt-BR"/>
-        </w:rPr>
-        <w:t>3</w:t>
-      </w:r>
-      <w:r>
-        <w:rPr>
-          <w:lang w:val="pt-BR"/>
-        </w:rPr>
-        <w:t xml:space="preserve"> To: AO05</w:t>
+        <w:t>BO03</w:t>
+      </w:r>
+      <w:r>
+        <w:rPr>
+          <w:lang w:val="pt-BR"/>
+        </w:rPr>
+        <w:t xml:space="preserve"> </w:t>
+      </w:r>
+      <w:proofErr w:type="spellStart"/>
+      <w:r>
+        <w:rPr>
+          <w:lang w:val="pt-BR"/>
+        </w:rPr>
+        <w:t>To</w:t>
+      </w:r>
+      <w:proofErr w:type="spellEnd"/>
+      <w:r>
+        <w:rPr>
+          <w:lang w:val="pt-BR"/>
+        </w:rPr>
+        <w:t>: AO05</w:t>
       </w:r>
     </w:p>
     <w:p>
@@ -4748,19 +5527,7 @@
         <w:rPr>
           <w:lang w:val="pt-BR"/>
         </w:rPr>
-        <w:t xml:space="preserve"> </w:t>
-      </w:r>
-      <w:r>
-        <w:rPr>
-          <w:lang w:val="pt-BR"/>
-        </w:rPr>
-        <w:t>2nd</w:t>
-      </w:r>
-      <w:r>
-        <w:rPr>
-          <w:lang w:val="pt-BR"/>
-        </w:rPr>
-        <w:t xml:space="preserve"> </w:t>
+        <w:t xml:space="preserve"> 2nd </w:t>
       </w:r>
       <w:proofErr w:type="spellStart"/>
       <w:r>
@@ -5189,6 +5956,7 @@
         <w:rPr>
           <w:lang w:val="pt-BR"/>
         </w:rPr>
+        <w:lastRenderedPageBreak/>
         <w:t>EVisualization</w:t>
       </w:r>
       <w:proofErr w:type="spellEnd"/>
@@ -6712,7 +7480,6 @@
         <w:rPr>
           <w:lang w:val="pt-BR"/>
         </w:rPr>
-        <w:lastRenderedPageBreak/>
         <w:t>results-survey372164</w:t>
       </w:r>
       <w:r>
@@ -6748,13 +7515,7 @@
         <w:rPr>
           <w:lang w:val="pt-BR"/>
         </w:rPr>
-        <w:t>ratings – complete.csv</w:t>
-      </w:r>
-      <w:r>
-        <w:rPr>
-          <w:lang w:val="pt-BR"/>
-        </w:rPr>
-        <w:t xml:space="preserve"> </w:t>
+        <w:t xml:space="preserve">ratings – complete.csv </w:t>
       </w:r>
       <w:proofErr w:type="spellStart"/>
       <w:r>
@@ -6969,16 +7730,7 @@
           <w:szCs w:val="20"/>
           <w:lang w:val="pt-BR" w:eastAsia="pt-BR"/>
         </w:rPr>
-        <w:t>w</w:t>
-      </w:r>
-      <w:r>
-        <w:rPr>
-          <w:rFonts w:ascii="Arial" w:eastAsia="Times New Roman" w:hAnsi="Arial" w:cs="Arial"/>
-          <w:sz w:val="20"/>
-          <w:szCs w:val="20"/>
-          <w:lang w:val="pt-BR" w:eastAsia="pt-BR"/>
-        </w:rPr>
-        <w:t>here</w:t>
+        <w:t>where</w:t>
       </w:r>
       <w:proofErr w:type="spellEnd"/>
       <w:r>
@@ -7792,25 +8544,7 @@
           <w:szCs w:val="20"/>
           <w:lang w:val="pt-BR" w:eastAsia="pt-BR"/>
         </w:rPr>
-        <w:t xml:space="preserve">2 </w:t>
-      </w:r>
-      <w:r>
-        <w:rPr>
-          <w:rFonts w:ascii="Arial" w:eastAsia="Times New Roman" w:hAnsi="Arial" w:cs="Arial"/>
-          <w:sz w:val="20"/>
-          <w:szCs w:val="20"/>
-          <w:lang w:val="pt-BR" w:eastAsia="pt-BR"/>
-        </w:rPr>
-        <w:t xml:space="preserve">=&gt; </w:t>
-      </w:r>
-      <w:r>
-        <w:rPr>
-          <w:rFonts w:ascii="Arial" w:eastAsia="Times New Roman" w:hAnsi="Arial" w:cs="Arial"/>
-          <w:sz w:val="20"/>
-          <w:szCs w:val="20"/>
-          <w:lang w:val="pt-BR" w:eastAsia="pt-BR"/>
-        </w:rPr>
-        <w:t>2</w:t>
+        <w:t>2 =&gt; 2</w:t>
       </w:r>
     </w:p>
     <w:p>
@@ -7841,25 +8575,7 @@
           <w:szCs w:val="20"/>
           <w:lang w:val="pt-BR" w:eastAsia="pt-BR"/>
         </w:rPr>
-        <w:t>3</w:t>
-      </w:r>
-      <w:r>
-        <w:rPr>
-          <w:rFonts w:ascii="Arial" w:eastAsia="Times New Roman" w:hAnsi="Arial" w:cs="Arial"/>
-          <w:sz w:val="20"/>
-          <w:szCs w:val="20"/>
-          <w:lang w:val="pt-BR" w:eastAsia="pt-BR"/>
-        </w:rPr>
-        <w:t xml:space="preserve"> =&gt; </w:t>
-      </w:r>
-      <w:r>
-        <w:rPr>
-          <w:rFonts w:ascii="Arial" w:eastAsia="Times New Roman" w:hAnsi="Arial" w:cs="Arial"/>
-          <w:sz w:val="20"/>
-          <w:szCs w:val="20"/>
-          <w:lang w:val="pt-BR" w:eastAsia="pt-BR"/>
-        </w:rPr>
-        <w:t>3</w:t>
+        <w:t>3 =&gt; 3</w:t>
       </w:r>
     </w:p>
     <w:p>
@@ -7890,25 +8606,7 @@
           <w:szCs w:val="20"/>
           <w:lang w:val="pt-BR" w:eastAsia="pt-BR"/>
         </w:rPr>
-        <w:t>4</w:t>
-      </w:r>
-      <w:r>
-        <w:rPr>
-          <w:rFonts w:ascii="Arial" w:eastAsia="Times New Roman" w:hAnsi="Arial" w:cs="Arial"/>
-          <w:sz w:val="20"/>
-          <w:szCs w:val="20"/>
-          <w:lang w:val="pt-BR" w:eastAsia="pt-BR"/>
-        </w:rPr>
-        <w:t xml:space="preserve"> =&gt; </w:t>
-      </w:r>
-      <w:r>
-        <w:rPr>
-          <w:rFonts w:ascii="Arial" w:eastAsia="Times New Roman" w:hAnsi="Arial" w:cs="Arial"/>
-          <w:sz w:val="20"/>
-          <w:szCs w:val="20"/>
-          <w:lang w:val="pt-BR" w:eastAsia="pt-BR"/>
-        </w:rPr>
-        <w:t>4</w:t>
+        <w:t>4 =&gt; 4</w:t>
       </w:r>
     </w:p>
     <w:p>
@@ -7939,25 +8637,7 @@
           <w:szCs w:val="20"/>
           <w:lang w:val="pt-BR" w:eastAsia="pt-BR"/>
         </w:rPr>
-        <w:t>5</w:t>
-      </w:r>
-      <w:r>
-        <w:rPr>
-          <w:rFonts w:ascii="Arial" w:eastAsia="Times New Roman" w:hAnsi="Arial" w:cs="Arial"/>
-          <w:sz w:val="20"/>
-          <w:szCs w:val="20"/>
-          <w:lang w:val="pt-BR" w:eastAsia="pt-BR"/>
-        </w:rPr>
-        <w:t xml:space="preserve"> =&gt; </w:t>
-      </w:r>
-      <w:r>
-        <w:rPr>
-          <w:rFonts w:ascii="Arial" w:eastAsia="Times New Roman" w:hAnsi="Arial" w:cs="Arial"/>
-          <w:sz w:val="20"/>
-          <w:szCs w:val="20"/>
-          <w:lang w:val="pt-BR" w:eastAsia="pt-BR"/>
-        </w:rPr>
-        <w:t>5</w:t>
+        <w:t>5 =&gt; 5</w:t>
       </w:r>
     </w:p>
     <w:p>
@@ -7988,25 +8668,7 @@
           <w:szCs w:val="20"/>
           <w:lang w:val="pt-BR" w:eastAsia="pt-BR"/>
         </w:rPr>
-        <w:t xml:space="preserve">6 </w:t>
-      </w:r>
-      <w:r>
-        <w:rPr>
-          <w:rFonts w:ascii="Arial" w:eastAsia="Times New Roman" w:hAnsi="Arial" w:cs="Arial"/>
-          <w:sz w:val="20"/>
-          <w:szCs w:val="20"/>
-          <w:lang w:val="pt-BR" w:eastAsia="pt-BR"/>
-        </w:rPr>
-        <w:t xml:space="preserve">=&gt; </w:t>
-      </w:r>
-      <w:r>
-        <w:rPr>
-          <w:rFonts w:ascii="Arial" w:eastAsia="Times New Roman" w:hAnsi="Arial" w:cs="Arial"/>
-          <w:sz w:val="20"/>
-          <w:szCs w:val="20"/>
-          <w:lang w:val="pt-BR" w:eastAsia="pt-BR"/>
-        </w:rPr>
-        <w:t>6</w:t>
+        <w:t>6 =&gt; 6</w:t>
       </w:r>
     </w:p>
     <w:p>
@@ -8028,6 +8690,7 @@
           <w:szCs w:val="20"/>
           <w:lang w:val="pt-BR" w:eastAsia="pt-BR"/>
         </w:rPr>
+        <w:lastRenderedPageBreak/>
         <w:t>AO0</w:t>
       </w:r>
       <w:r>
@@ -8037,25 +8700,7 @@
           <w:szCs w:val="20"/>
           <w:lang w:val="pt-BR" w:eastAsia="pt-BR"/>
         </w:rPr>
-        <w:t xml:space="preserve">7 </w:t>
-      </w:r>
-      <w:r>
-        <w:rPr>
-          <w:rFonts w:ascii="Arial" w:eastAsia="Times New Roman" w:hAnsi="Arial" w:cs="Arial"/>
-          <w:sz w:val="20"/>
-          <w:szCs w:val="20"/>
-          <w:lang w:val="pt-BR" w:eastAsia="pt-BR"/>
-        </w:rPr>
-        <w:t xml:space="preserve">=&gt; </w:t>
-      </w:r>
-      <w:r>
-        <w:rPr>
-          <w:rFonts w:ascii="Arial" w:eastAsia="Times New Roman" w:hAnsi="Arial" w:cs="Arial"/>
-          <w:sz w:val="20"/>
-          <w:szCs w:val="20"/>
-          <w:lang w:val="pt-BR" w:eastAsia="pt-BR"/>
-        </w:rPr>
-        <w:t>7</w:t>
+        <w:t>7 =&gt; 7</w:t>
       </w:r>
     </w:p>
     <w:p>
@@ -8179,25 +8824,7 @@
           <w:szCs w:val="20"/>
           <w:lang w:val="pt-BR" w:eastAsia="pt-BR"/>
         </w:rPr>
-        <w:t xml:space="preserve">8 </w:t>
-      </w:r>
-      <w:r>
-        <w:rPr>
-          <w:rFonts w:ascii="Arial" w:eastAsia="Times New Roman" w:hAnsi="Arial" w:cs="Arial"/>
-          <w:sz w:val="20"/>
-          <w:szCs w:val="20"/>
-          <w:lang w:val="pt-BR" w:eastAsia="pt-BR"/>
-        </w:rPr>
-        <w:t xml:space="preserve">=&gt; </w:t>
-      </w:r>
-      <w:r>
-        <w:rPr>
-          <w:rFonts w:ascii="Arial" w:eastAsia="Times New Roman" w:hAnsi="Arial" w:cs="Arial"/>
-          <w:sz w:val="20"/>
-          <w:szCs w:val="20"/>
-          <w:lang w:val="pt-BR" w:eastAsia="pt-BR"/>
-        </w:rPr>
-        <w:t>NA</w:t>
+        <w:t>8 =&gt; NA</w:t>
       </w:r>
     </w:p>
     <w:p>
@@ -8226,31 +8853,97 @@
           <w:lang w:val="pt-BR"/>
         </w:rPr>
       </w:pPr>
-      <w:proofErr w:type="spellStart"/>
-      <w:r>
-        <w:rPr>
-          <w:lang w:val="pt-BR"/>
-        </w:rPr>
-        <w:t>Create</w:t>
-      </w:r>
-      <w:proofErr w:type="spellEnd"/>
-      <w:r>
-        <w:rPr>
-          <w:lang w:val="pt-BR"/>
-        </w:rPr>
-        <w:t xml:space="preserve"> </w:t>
-      </w:r>
-      <w:r>
-        <w:rPr>
-          <w:lang w:val="pt-BR"/>
-        </w:rPr>
-        <w:t>2</w:t>
-      </w:r>
-      <w:r>
-        <w:rPr>
-          <w:lang w:val="pt-BR"/>
-        </w:rPr>
-        <w:t xml:space="preserve"> files </w:t>
+      <w:r>
+        <w:rPr>
+          <w:lang w:val="pt-BR"/>
+        </w:rPr>
+        <w:t xml:space="preserve">Copy </w:t>
+      </w:r>
+      <w:proofErr w:type="spellStart"/>
+      <w:r>
+        <w:rPr>
+          <w:lang w:val="pt-BR"/>
+        </w:rPr>
+        <w:t>PreparedData</w:t>
+      </w:r>
+      <w:proofErr w:type="spellEnd"/>
+      <w:r>
+        <w:rPr>
+          <w:lang w:val="pt-BR"/>
+        </w:rPr>
+        <w:t>/</w:t>
+      </w:r>
+      <w:r>
+        <w:rPr>
+          <w:lang w:val="pt-BR"/>
+        </w:rPr>
+        <w:t xml:space="preserve">ratings – </w:t>
+      </w:r>
+      <w:r>
+        <w:rPr>
+          <w:lang w:val="pt-BR"/>
+        </w:rPr>
+        <w:t xml:space="preserve">grades.csv </w:t>
+      </w:r>
+      <w:proofErr w:type="spellStart"/>
+      <w:r>
+        <w:rPr>
+          <w:lang w:val="pt-BR"/>
+        </w:rPr>
+        <w:t>and</w:t>
+      </w:r>
+      <w:proofErr w:type="spellEnd"/>
+      <w:r>
+        <w:rPr>
+          <w:lang w:val="pt-BR"/>
+        </w:rPr>
+        <w:t xml:space="preserve"> </w:t>
+      </w:r>
+      <w:proofErr w:type="spellStart"/>
+      <w:r>
+        <w:rPr>
+          <w:lang w:val="pt-BR"/>
+        </w:rPr>
+        <w:t>create</w:t>
+      </w:r>
+      <w:proofErr w:type="spellEnd"/>
+      <w:r>
+        <w:rPr>
+          <w:lang w:val="pt-BR"/>
+        </w:rPr>
+        <w:t xml:space="preserve"> </w:t>
+      </w:r>
+      <w:r>
+        <w:rPr>
+          <w:lang w:val="pt-BR"/>
+        </w:rPr>
+        <w:t>3</w:t>
+      </w:r>
+      <w:r>
+        <w:rPr>
+          <w:lang w:val="pt-BR"/>
+        </w:rPr>
+        <w:t xml:space="preserve"> </w:t>
+      </w:r>
+      <w:proofErr w:type="spellStart"/>
+      <w:r>
+        <w:rPr>
+          <w:lang w:val="pt-BR"/>
+        </w:rPr>
+        <w:t>separed</w:t>
+      </w:r>
+      <w:proofErr w:type="spellEnd"/>
+      <w:r>
+        <w:rPr>
+          <w:lang w:val="pt-BR"/>
+        </w:rPr>
+        <w:t xml:space="preserve"> </w:t>
+      </w:r>
+      <w:r>
+        <w:rPr>
+          <w:lang w:val="pt-BR"/>
+        </w:rPr>
+        <w:t xml:space="preserve">files </w:t>
       </w:r>
       <w:proofErr w:type="spellStart"/>
       <w:r>
@@ -8288,6 +8981,40 @@
         <w:t>of</w:t>
       </w:r>
       <w:proofErr w:type="spellEnd"/>
+      <w:r>
+        <w:rPr>
+          <w:lang w:val="pt-BR"/>
+        </w:rPr>
+        <w:t xml:space="preserve">: </w:t>
+      </w:r>
+      <w:proofErr w:type="spellStart"/>
+      <w:r>
+        <w:rPr>
+          <w:lang w:val="pt-BR"/>
+        </w:rPr>
+        <w:t>main</w:t>
+      </w:r>
+      <w:proofErr w:type="spellEnd"/>
+      <w:r>
+        <w:rPr>
+          <w:lang w:val="pt-BR"/>
+        </w:rPr>
+        <w:t xml:space="preserve"> </w:t>
+      </w:r>
+      <w:proofErr w:type="spellStart"/>
+      <w:r>
+        <w:rPr>
+          <w:lang w:val="pt-BR"/>
+        </w:rPr>
+        <w:t>scale</w:t>
+      </w:r>
+      <w:proofErr w:type="spellEnd"/>
+      <w:r>
+        <w:rPr>
+          <w:lang w:val="pt-BR"/>
+        </w:rPr>
+        <w:t>,</w:t>
+      </w:r>
       <w:r>
         <w:rPr>
           <w:lang w:val="pt-BR"/>
@@ -8339,6 +9066,23 @@
       <w:proofErr w:type="spellStart"/>
       <w:r>
         <w:rPr>
+          <w:lang w:val="pt-BR"/>
+        </w:rPr>
+        <w:t>PreparedData</w:t>
+      </w:r>
+      <w:proofErr w:type="spellEnd"/>
+      <w:r>
+        <w:rPr>
+          <w:rFonts w:ascii="Arial" w:eastAsia="Times New Roman" w:hAnsi="Arial" w:cs="Arial"/>
+          <w:sz w:val="20"/>
+          <w:szCs w:val="20"/>
+          <w:lang w:val="pt-BR" w:eastAsia="pt-BR"/>
+        </w:rPr>
+        <w:t>/</w:t>
+      </w:r>
+      <w:proofErr w:type="spellStart"/>
+      <w:r>
+        <w:rPr>
           <w:rFonts w:ascii="Arial" w:eastAsia="Times New Roman" w:hAnsi="Arial" w:cs="Arial"/>
           <w:sz w:val="20"/>
           <w:szCs w:val="20"/>
@@ -8354,25 +9098,7 @@
           <w:szCs w:val="20"/>
           <w:lang w:val="pt-BR" w:eastAsia="pt-BR"/>
         </w:rPr>
-        <w:t xml:space="preserve"> </w:t>
-      </w:r>
-      <w:r>
-        <w:rPr>
-          <w:rFonts w:ascii="Arial" w:eastAsia="Times New Roman" w:hAnsi="Arial" w:cs="Arial"/>
-          <w:sz w:val="20"/>
-          <w:szCs w:val="20"/>
-          <w:lang w:val="pt-BR" w:eastAsia="pt-BR"/>
-        </w:rPr>
-        <w:t xml:space="preserve">=&gt; </w:t>
-      </w:r>
-      <w:r>
-        <w:rPr>
-          <w:rFonts w:ascii="Arial" w:eastAsia="Times New Roman" w:hAnsi="Arial" w:cs="Arial"/>
-          <w:sz w:val="20"/>
-          <w:szCs w:val="20"/>
-          <w:lang w:val="pt-BR" w:eastAsia="pt-BR"/>
-        </w:rPr>
-        <w:t xml:space="preserve">Only </w:t>
+        <w:t xml:space="preserve"> =&gt; Only </w:t>
       </w:r>
       <w:proofErr w:type="spellStart"/>
       <w:r>
@@ -8392,25 +9118,7 @@
           <w:szCs w:val="20"/>
           <w:lang w:val="pt-BR" w:eastAsia="pt-BR"/>
         </w:rPr>
-        <w:t xml:space="preserve"> SUS_</w:t>
-      </w:r>
-      <w:r>
-        <w:rPr>
-          <w:rFonts w:ascii="Arial" w:eastAsia="Times New Roman" w:hAnsi="Arial" w:cs="Arial"/>
-          <w:sz w:val="20"/>
-          <w:szCs w:val="20"/>
-          <w:lang w:val="pt-BR" w:eastAsia="pt-BR"/>
-        </w:rPr>
-        <w:t>1</w:t>
-      </w:r>
-      <w:r>
-        <w:rPr>
-          <w:rFonts w:ascii="Arial" w:eastAsia="Times New Roman" w:hAnsi="Arial" w:cs="Arial"/>
-          <w:sz w:val="20"/>
-          <w:szCs w:val="20"/>
-          <w:lang w:val="pt-BR" w:eastAsia="pt-BR"/>
-        </w:rPr>
-        <w:t xml:space="preserve"> </w:t>
+        <w:t xml:space="preserve"> SUS_1 </w:t>
       </w:r>
       <w:proofErr w:type="spellStart"/>
       <w:r>
@@ -8449,6 +9157,23 @@
       <w:proofErr w:type="spellStart"/>
       <w:r>
         <w:rPr>
+          <w:lang w:val="pt-BR"/>
+        </w:rPr>
+        <w:t>PreparedData</w:t>
+      </w:r>
+      <w:proofErr w:type="spellEnd"/>
+      <w:r>
+        <w:rPr>
+          <w:rFonts w:ascii="Arial" w:eastAsia="Times New Roman" w:hAnsi="Arial" w:cs="Arial"/>
+          <w:sz w:val="20"/>
+          <w:szCs w:val="20"/>
+          <w:lang w:val="pt-BR" w:eastAsia="pt-BR"/>
+        </w:rPr>
+        <w:t>/</w:t>
+      </w:r>
+      <w:proofErr w:type="spellStart"/>
+      <w:r>
+        <w:rPr>
           <w:rFonts w:ascii="Arial" w:eastAsia="Times New Roman" w:hAnsi="Arial" w:cs="Arial"/>
           <w:sz w:val="20"/>
           <w:szCs w:val="20"/>
@@ -8464,25 +9189,7 @@
           <w:szCs w:val="20"/>
           <w:lang w:val="pt-BR" w:eastAsia="pt-BR"/>
         </w:rPr>
-        <w:t xml:space="preserve"> </w:t>
-      </w:r>
-      <w:r>
-        <w:rPr>
-          <w:rFonts w:ascii="Arial" w:eastAsia="Times New Roman" w:hAnsi="Arial" w:cs="Arial"/>
-          <w:sz w:val="20"/>
-          <w:szCs w:val="20"/>
-          <w:lang w:val="pt-BR" w:eastAsia="pt-BR"/>
-        </w:rPr>
-        <w:t xml:space="preserve">=&gt; </w:t>
-      </w:r>
-      <w:r>
-        <w:rPr>
-          <w:rFonts w:ascii="Arial" w:eastAsia="Times New Roman" w:hAnsi="Arial" w:cs="Arial"/>
-          <w:sz w:val="20"/>
-          <w:szCs w:val="20"/>
-          <w:lang w:val="pt-BR" w:eastAsia="pt-BR"/>
-        </w:rPr>
-        <w:t xml:space="preserve">Only </w:t>
+        <w:t xml:space="preserve"> =&gt; Only </w:t>
       </w:r>
       <w:proofErr w:type="spellStart"/>
       <w:r>
@@ -8502,16 +9209,7 @@
           <w:szCs w:val="20"/>
           <w:lang w:val="pt-BR" w:eastAsia="pt-BR"/>
         </w:rPr>
-        <w:t xml:space="preserve"> UEQ_1</w:t>
-      </w:r>
-      <w:r>
-        <w:rPr>
-          <w:rFonts w:ascii="Arial" w:eastAsia="Times New Roman" w:hAnsi="Arial" w:cs="Arial"/>
-          <w:sz w:val="20"/>
-          <w:szCs w:val="20"/>
-          <w:lang w:val="pt-BR" w:eastAsia="pt-BR"/>
-        </w:rPr>
-        <w:t xml:space="preserve"> </w:t>
+        <w:t xml:space="preserve"> UEQ_1 </w:t>
       </w:r>
       <w:proofErr w:type="spellStart"/>
       <w:r>
@@ -8536,82 +9234,205 @@
     </w:p>
     <w:p>
       <w:pPr>
-        <w:rPr>
-          <w:lang w:val="pt-BR"/>
-        </w:rPr>
-      </w:pPr>
-      <w:r>
-        <w:rPr>
-          <w:lang w:val="pt-BR"/>
-        </w:rPr>
-        <w:t xml:space="preserve">... </w:t>
-      </w:r>
-    </w:p>
-    <w:p>
-      <w:pPr>
-        <w:rPr>
-          <w:lang w:val="pt-BR"/>
-        </w:rPr>
-      </w:pPr>
-    </w:p>
-    <w:p>
-      <w:pPr>
-        <w:rPr>
-          <w:lang w:val="pt-BR"/>
-        </w:rPr>
-      </w:pPr>
-    </w:p>
-    <w:p>
-      <w:pPr>
-        <w:rPr>
-          <w:lang w:val="pt-BR"/>
-        </w:rPr>
-      </w:pPr>
-    </w:p>
-    <w:p>
-      <w:pPr>
-        <w:rPr>
-          <w:lang w:val="pt-BR"/>
-        </w:rPr>
-      </w:pPr>
-    </w:p>
-    <w:p>
-      <w:pPr>
-        <w:pStyle w:val="Heading4"/>
-        <w:rPr>
-          <w:w w:val="90"/>
-          <w:lang w:val="pt-BR"/>
-        </w:rPr>
-      </w:pPr>
-    </w:p>
-    <w:p>
-      <w:pPr>
-        <w:pStyle w:val="Heading1"/>
-        <w:rPr>
-          <w:w w:val="90"/>
-          <w:lang w:val="pt-BR"/>
-        </w:rPr>
-      </w:pPr>
-      <w:r>
-        <w:rPr>
-          <w:w w:val="90"/>
-          <w:lang w:val="pt-BR"/>
-        </w:rPr>
-        <w:t>Reproduce0 - Colapse input data</w:t>
-      </w:r>
-      <w:r>
-        <w:rPr>
-          <w:w w:val="90"/>
-          <w:lang w:val="pt-BR"/>
-        </w:rPr>
-        <w:t>/</w:t>
-      </w:r>
-      <w:r>
-        <w:rPr>
-          <w:w w:val="90"/>
-          <w:lang w:val="pt-BR"/>
-        </w:rPr>
-        <w:t>Val_0_Colapsing_Low-Frequency_Categories-toMoreFrequent</w:t>
+        <w:widowControl/>
+        <w:autoSpaceDE/>
+        <w:autoSpaceDN/>
+        <w:rPr>
+          <w:rFonts w:ascii="Arial" w:eastAsia="Times New Roman" w:hAnsi="Arial" w:cs="Arial"/>
+          <w:sz w:val="20"/>
+          <w:szCs w:val="20"/>
+          <w:lang w:val="pt-BR" w:eastAsia="pt-BR"/>
+        </w:rPr>
+      </w:pPr>
+      <w:proofErr w:type="spellStart"/>
+      <w:r>
+        <w:rPr>
+          <w:rFonts w:ascii="Arial" w:eastAsia="Times New Roman" w:hAnsi="Arial" w:cs="Arial"/>
+          <w:sz w:val="20"/>
+          <w:szCs w:val="20"/>
+          <w:lang w:val="pt-BR" w:eastAsia="pt-BR"/>
+        </w:rPr>
+        <w:t>ux_ratings</w:t>
+      </w:r>
+      <w:proofErr w:type="spellEnd"/>
+      <w:r>
+        <w:rPr>
+          <w:rFonts w:ascii="Arial" w:eastAsia="Times New Roman" w:hAnsi="Arial" w:cs="Arial"/>
+          <w:sz w:val="20"/>
+          <w:szCs w:val="20"/>
+          <w:lang w:val="pt-BR" w:eastAsia="pt-BR"/>
+        </w:rPr>
+        <w:t xml:space="preserve"> =&gt; id</w:t>
+      </w:r>
+      <w:r>
+        <w:rPr>
+          <w:rFonts w:ascii="Arial" w:eastAsia="Times New Roman" w:hAnsi="Arial" w:cs="Arial"/>
+          <w:sz w:val="20"/>
+          <w:szCs w:val="20"/>
+          <w:lang w:val="pt-BR" w:eastAsia="pt-BR"/>
+        </w:rPr>
+        <w:tab/>
+        <w:t xml:space="preserve">, </w:t>
+      </w:r>
+      <w:proofErr w:type="spellStart"/>
+      <w:r>
+        <w:rPr>
+          <w:rFonts w:ascii="Arial" w:eastAsia="Times New Roman" w:hAnsi="Arial" w:cs="Arial"/>
+          <w:sz w:val="20"/>
+          <w:szCs w:val="20"/>
+          <w:lang w:val="pt-BR" w:eastAsia="pt-BR"/>
+        </w:rPr>
+        <w:t>seed</w:t>
+      </w:r>
+      <w:proofErr w:type="spellEnd"/>
+      <w:r>
+        <w:rPr>
+          <w:rFonts w:ascii="Arial" w:eastAsia="Times New Roman" w:hAnsi="Arial" w:cs="Arial"/>
+          <w:sz w:val="20"/>
+          <w:szCs w:val="20"/>
+          <w:lang w:val="pt-BR" w:eastAsia="pt-BR"/>
+        </w:rPr>
+        <w:t xml:space="preserve">, </w:t>
+      </w:r>
+      <w:proofErr w:type="spellStart"/>
+      <w:r>
+        <w:rPr>
+          <w:rFonts w:ascii="Arial" w:eastAsia="Times New Roman" w:hAnsi="Arial" w:cs="Arial"/>
+          <w:sz w:val="20"/>
+          <w:szCs w:val="20"/>
+          <w:lang w:val="pt-BR" w:eastAsia="pt-BR"/>
+        </w:rPr>
+        <w:t>stimulus</w:t>
+      </w:r>
+      <w:proofErr w:type="spellEnd"/>
+      <w:r>
+        <w:rPr>
+          <w:rFonts w:ascii="Arial" w:eastAsia="Times New Roman" w:hAnsi="Arial" w:cs="Arial"/>
+          <w:sz w:val="20"/>
+          <w:szCs w:val="20"/>
+          <w:lang w:val="pt-BR" w:eastAsia="pt-BR"/>
+        </w:rPr>
+        <w:t xml:space="preserve"> </w:t>
+      </w:r>
+      <w:proofErr w:type="spellStart"/>
+      <w:r>
+        <w:rPr>
+          <w:rFonts w:ascii="Arial" w:eastAsia="Times New Roman" w:hAnsi="Arial" w:cs="Arial"/>
+          <w:sz w:val="20"/>
+          <w:szCs w:val="20"/>
+          <w:lang w:val="pt-BR" w:eastAsia="pt-BR"/>
+        </w:rPr>
+        <w:t>and</w:t>
+      </w:r>
+      <w:proofErr w:type="spellEnd"/>
+      <w:r>
+        <w:rPr>
+          <w:rFonts w:ascii="Arial" w:eastAsia="Times New Roman" w:hAnsi="Arial" w:cs="Arial"/>
+          <w:sz w:val="20"/>
+          <w:szCs w:val="20"/>
+          <w:lang w:val="pt-BR" w:eastAsia="pt-BR"/>
+        </w:rPr>
+        <w:t xml:space="preserve"> </w:t>
+      </w:r>
+      <w:proofErr w:type="spellStart"/>
+      <w:r>
+        <w:rPr>
+          <w:rFonts w:ascii="Arial" w:eastAsia="Times New Roman" w:hAnsi="Arial" w:cs="Arial"/>
+          <w:sz w:val="20"/>
+          <w:szCs w:val="20"/>
+          <w:lang w:val="pt-BR" w:eastAsia="pt-BR"/>
+        </w:rPr>
+        <w:t>columns</w:t>
+      </w:r>
+      <w:proofErr w:type="spellEnd"/>
+      <w:r>
+        <w:rPr>
+          <w:rFonts w:ascii="Arial" w:eastAsia="Times New Roman" w:hAnsi="Arial" w:cs="Arial"/>
+          <w:sz w:val="20"/>
+          <w:szCs w:val="20"/>
+          <w:lang w:val="pt-BR" w:eastAsia="pt-BR"/>
+        </w:rPr>
+        <w:t xml:space="preserve"> </w:t>
+      </w:r>
+      <w:proofErr w:type="spellStart"/>
+      <w:r>
+        <w:rPr>
+          <w:rFonts w:ascii="Arial" w:eastAsia="Times New Roman" w:hAnsi="Arial" w:cs="Arial"/>
+          <w:sz w:val="20"/>
+          <w:szCs w:val="20"/>
+          <w:lang w:val="pt-BR" w:eastAsia="pt-BR"/>
+        </w:rPr>
+        <w:t>with</w:t>
+      </w:r>
+      <w:proofErr w:type="spellEnd"/>
+      <w:r>
+        <w:rPr>
+          <w:rFonts w:ascii="Arial" w:eastAsia="Times New Roman" w:hAnsi="Arial" w:cs="Arial"/>
+          <w:sz w:val="20"/>
+          <w:szCs w:val="20"/>
+          <w:lang w:val="pt-BR" w:eastAsia="pt-BR"/>
+        </w:rPr>
+        <w:t xml:space="preserve"> </w:t>
+      </w:r>
+      <w:proofErr w:type="spellStart"/>
+      <w:r>
+        <w:rPr>
+          <w:rFonts w:ascii="Arial" w:eastAsia="Times New Roman" w:hAnsi="Arial" w:cs="Arial"/>
+          <w:sz w:val="20"/>
+          <w:szCs w:val="20"/>
+          <w:lang w:val="pt-BR" w:eastAsia="pt-BR"/>
+        </w:rPr>
+        <w:t>names</w:t>
+      </w:r>
+      <w:proofErr w:type="spellEnd"/>
+      <w:r>
+        <w:rPr>
+          <w:rFonts w:ascii="Arial" w:eastAsia="Times New Roman" w:hAnsi="Arial" w:cs="Arial"/>
+          <w:sz w:val="20"/>
+          <w:szCs w:val="20"/>
+          <w:lang w:val="pt-BR" w:eastAsia="pt-BR"/>
+        </w:rPr>
+        <w:t xml:space="preserve"> </w:t>
+      </w:r>
+      <w:proofErr w:type="spellStart"/>
+      <w:r>
+        <w:rPr>
+          <w:rFonts w:ascii="Arial" w:eastAsia="Times New Roman" w:hAnsi="Arial" w:cs="Arial"/>
+          <w:sz w:val="20"/>
+          <w:szCs w:val="20"/>
+          <w:lang w:val="pt-BR" w:eastAsia="pt-BR"/>
+        </w:rPr>
+        <w:t>starting</w:t>
+      </w:r>
+      <w:proofErr w:type="spellEnd"/>
+      <w:r>
+        <w:rPr>
+          <w:rFonts w:ascii="Arial" w:eastAsia="Times New Roman" w:hAnsi="Arial" w:cs="Arial"/>
+          <w:sz w:val="20"/>
+          <w:szCs w:val="20"/>
+          <w:lang w:val="pt-BR" w:eastAsia="pt-BR"/>
+        </w:rPr>
+        <w:t xml:space="preserve"> </w:t>
+      </w:r>
+      <w:proofErr w:type="spellStart"/>
+      <w:r>
+        <w:rPr>
+          <w:rFonts w:ascii="Arial" w:eastAsia="Times New Roman" w:hAnsi="Arial" w:cs="Arial"/>
+          <w:sz w:val="20"/>
+          <w:szCs w:val="20"/>
+          <w:lang w:val="pt-BR" w:eastAsia="pt-BR"/>
+        </w:rPr>
+        <w:t>with</w:t>
+      </w:r>
+      <w:proofErr w:type="spellEnd"/>
+      <w:r>
+        <w:rPr>
+          <w:rFonts w:ascii="Arial" w:eastAsia="Times New Roman" w:hAnsi="Arial" w:cs="Arial"/>
+          <w:sz w:val="20"/>
+          <w:szCs w:val="20"/>
+          <w:lang w:val="pt-BR" w:eastAsia="pt-BR"/>
+        </w:rPr>
+        <w:t xml:space="preserve"> P</w:t>
       </w:r>
     </w:p>
     <w:p>
@@ -8621,37 +9442,43 @@
           <w:ilvl w:val="0"/>
           <w:numId w:val="0"/>
         </w:numPr>
-        <w:ind w:left="862" w:hanging="360"/>
-        <w:rPr>
-          <w:w w:val="90"/>
-          <w:lang w:val="pt-BR"/>
-        </w:rPr>
-      </w:pPr>
-    </w:p>
-    <w:p>
-      <w:pPr>
-        <w:pStyle w:val="Heading3"/>
-        <w:ind w:left="0" w:firstLine="0"/>
-        <w:rPr>
-          <w:w w:val="90"/>
-          <w:lang w:val="pt-BR"/>
-        </w:rPr>
-      </w:pPr>
-      <w:proofErr w:type="spellStart"/>
-      <w:r>
-        <w:rPr>
-          <w:w w:val="90"/>
-          <w:lang w:val="pt-BR"/>
-        </w:rPr>
-        <w:t>Description</w:t>
-      </w:r>
-      <w:proofErr w:type="spellEnd"/>
-      <w:r>
-        <w:rPr>
-          <w:w w:val="90"/>
-          <w:lang w:val="pt-BR"/>
-        </w:rPr>
-        <w:t xml:space="preserve">: </w:t>
+        <w:rPr>
+          <w:w w:val="90"/>
+          <w:lang w:val="pt-BR"/>
+        </w:rPr>
+      </w:pPr>
+    </w:p>
+    <w:p>
+      <w:pPr>
+        <w:rPr>
+          <w:lang w:val="pt-BR"/>
+        </w:rPr>
+      </w:pPr>
+    </w:p>
+    <w:p>
+      <w:pPr>
+        <w:pStyle w:val="Heading4"/>
+        <w:rPr>
+          <w:w w:val="90"/>
+          <w:lang w:val="pt-BR"/>
+        </w:rPr>
+      </w:pPr>
+    </w:p>
+    <w:p>
+      <w:pPr>
+        <w:pStyle w:val="Heading1"/>
+        <w:ind w:left="862"/>
+        <w:rPr>
+          <w:w w:val="90"/>
+          <w:lang w:val="pt-BR"/>
+        </w:rPr>
+      </w:pPr>
+      <w:r>
+        <w:rPr>
+          <w:w w:val="90"/>
+          <w:lang w:val="pt-BR"/>
+        </w:rPr>
+        <w:t>Reproduce0 - Colapse input data</w:t>
       </w:r>
     </w:p>
     <w:p>
@@ -8661,7 +9488,47 @@
           <w:ilvl w:val="0"/>
           <w:numId w:val="0"/>
         </w:numPr>
-        <w:ind w:left="862" w:hanging="360"/>
+        <w:ind w:left="862"/>
+        <w:rPr>
+          <w:w w:val="90"/>
+          <w:lang w:val="pt-BR"/>
+        </w:rPr>
+      </w:pPr>
+    </w:p>
+    <w:p>
+      <w:pPr>
+        <w:pStyle w:val="Heading3"/>
+        <w:ind w:left="0" w:firstLine="0"/>
+        <w:rPr>
+          <w:w w:val="90"/>
+          <w:lang w:val="pt-BR"/>
+        </w:rPr>
+      </w:pPr>
+      <w:proofErr w:type="spellStart"/>
+      <w:r>
+        <w:rPr>
+          <w:w w:val="90"/>
+          <w:lang w:val="pt-BR"/>
+        </w:rPr>
+        <w:t>Description</w:t>
+      </w:r>
+      <w:proofErr w:type="spellEnd"/>
+      <w:r>
+        <w:rPr>
+          <w:w w:val="90"/>
+          <w:lang w:val="pt-BR"/>
+        </w:rPr>
+        <w:t xml:space="preserve">: </w:t>
+      </w:r>
+    </w:p>
+    <w:p>
+      <w:pPr>
+        <w:pStyle w:val="Heading1"/>
+        <w:numPr>
+          <w:ilvl w:val="0"/>
+          <w:numId w:val="0"/>
+        </w:numPr>
+        <w:ind w:left="862"/>
         <w:rPr>
           <w:w w:val="90"/>
           <w:lang w:val="pt-BR"/>
@@ -9352,7 +10219,21 @@
           <w:w w:val="90"/>
           <w:lang w:val="pt-BR"/>
         </w:rPr>
-        <w:t xml:space="preserve"> File:</w:t>
+        <w:t xml:space="preserve"> File</w:t>
+      </w:r>
+      <w:r>
+        <w:rPr>
+          <w:w w:val="90"/>
+          <w:lang w:val="pt-BR"/>
+        </w:rPr>
+        <w:t xml:space="preserve"> (folder Data)</w:t>
+      </w:r>
+      <w:r>
+        <w:rPr>
+          <w:w w:val="90"/>
+          <w:lang w:val="pt-BR"/>
+        </w:rPr>
+        <w:t>:</w:t>
       </w:r>
     </w:p>
     <w:p>
@@ -9365,14 +10246,13 @@
         <w:jc w:val="both"/>
       </w:pPr>
       <w:r>
-        <w:lastRenderedPageBreak/>
         <w:t xml:space="preserve">Name: </w:t>
       </w:r>
       <w:r>
-        <w:t>Data/</w:t>
-      </w:r>
-      <w:r>
-        <w:t>multigroup_ratings-withNAs-withoutAttFails.csv</w:t>
+        <w:t>ux_ratings</w:t>
+      </w:r>
+      <w:r>
+        <w:t>.csv</w:t>
       </w:r>
     </w:p>
     <w:p>
@@ -9385,15 +10265,13 @@
         <w:jc w:val="both"/>
       </w:pPr>
       <w:r>
-        <w:t xml:space="preserve">Content: Raw dataset containing main scale responses, metadata (id, seed, stimulus), and external instrument items (sus, </w:t>
-      </w:r>
-      <w:proofErr w:type="spellStart"/>
-      <w:r>
-        <w:t>ueq</w:t>
-      </w:r>
-      <w:proofErr w:type="spellEnd"/>
-      <w:r>
-        <w:t>).</w:t>
+        <w:t xml:space="preserve">Content: Raw dataset containing main scale </w:t>
+      </w:r>
+      <w:r>
+        <w:t>grades and</w:t>
+      </w:r>
+      <w:r>
+        <w:t xml:space="preserve"> metadata (id, seed, stimulus).</w:t>
       </w:r>
     </w:p>
     <w:p>
@@ -9420,53 +10298,12 @@
         </w:rPr>
         <w:t xml:space="preserve"> Files (</w:t>
       </w:r>
-      <w:proofErr w:type="spellStart"/>
-      <w:r>
-        <w:rPr>
-          <w:w w:val="90"/>
-          <w:lang w:val="pt-BR"/>
-        </w:rPr>
-        <w:t>saved</w:t>
-      </w:r>
-      <w:proofErr w:type="spellEnd"/>
-      <w:r>
-        <w:rPr>
-          <w:w w:val="90"/>
-          <w:lang w:val="pt-BR"/>
-        </w:rPr>
-        <w:t xml:space="preserve"> </w:t>
-      </w:r>
-      <w:proofErr w:type="spellStart"/>
-      <w:r>
-        <w:rPr>
-          <w:w w:val="90"/>
-          <w:lang w:val="pt-BR"/>
-        </w:rPr>
-        <w:t>to</w:t>
-      </w:r>
-      <w:proofErr w:type="spellEnd"/>
-      <w:r>
-        <w:rPr>
-          <w:w w:val="90"/>
-          <w:lang w:val="pt-BR"/>
-        </w:rPr>
-        <w:t xml:space="preserve"> Reproduce0 - </w:t>
-      </w:r>
-      <w:proofErr w:type="spellStart"/>
-      <w:r>
-        <w:rPr>
-          <w:w w:val="90"/>
-          <w:lang w:val="pt-BR"/>
-        </w:rPr>
-        <w:t>Collapse</w:t>
-      </w:r>
-      <w:proofErr w:type="spellEnd"/>
-      <w:r>
-        <w:rPr>
-          <w:w w:val="90"/>
-          <w:lang w:val="pt-BR"/>
-        </w:rPr>
-        <w:t xml:space="preserve"> input data/</w:t>
+      <w:r>
+        <w:rPr>
+          <w:w w:val="90"/>
+          <w:lang w:val="pt-BR"/>
+        </w:rPr>
+        <w:t xml:space="preserve">folder </w:t>
       </w:r>
       <w:proofErr w:type="spellStart"/>
       <w:r>
@@ -9495,7 +10332,15 @@
         <w:jc w:val="both"/>
       </w:pPr>
       <w:r>
-        <w:t>multigroup_ratings-withNAs-withoutAttFails_lowfreqcollapsed.csv</w:t>
+        <w:t xml:space="preserve">Name: </w:t>
+      </w:r>
+      <w:proofErr w:type="spellStart"/>
+      <w:r>
+        <w:t>ux_ratings</w:t>
+      </w:r>
+      <w:proofErr w:type="spellEnd"/>
+      <w:r>
+        <w:t xml:space="preserve"> _lowfreqcollapsed.csv</w:t>
       </w:r>
     </w:p>
     <w:p>
@@ -9508,7 +10353,15 @@
         <w:jc w:val="both"/>
       </w:pPr>
       <w:r>
-        <w:t>Content: Complete dataset with sparse categories merged for the main scale items, keeping all other variables intact.</w:t>
+        <w:t xml:space="preserve">Content: Complete dataset with sparse categories merged </w:t>
+      </w:r>
+      <w:proofErr w:type="gramStart"/>
+      <w:r>
+        <w:t>for</w:t>
+      </w:r>
+      <w:proofErr w:type="gramEnd"/>
+      <w:r>
+        <w:t xml:space="preserve"> the main scale items.</w:t>
       </w:r>
     </w:p>
     <w:p>
@@ -9521,7 +10374,15 @@
         <w:jc w:val="both"/>
       </w:pPr>
       <w:r>
-        <w:t>multigroup_ratings-withNAs-withoutAttFails_changes_made.csv</w:t>
+        <w:t xml:space="preserve">Name: </w:t>
+      </w:r>
+      <w:proofErr w:type="spellStart"/>
+      <w:r>
+        <w:t>ux_ratings</w:t>
+      </w:r>
+      <w:proofErr w:type="spellEnd"/>
+      <w:r>
+        <w:t xml:space="preserve"> _changes_made.csv</w:t>
       </w:r>
     </w:p>
     <w:p>
@@ -9534,64 +10395,34 @@
         <w:jc w:val="both"/>
       </w:pPr>
       <w:r>
-        <w:t xml:space="preserve">Content: Merger log recording each change (item, </w:t>
-      </w:r>
-      <w:proofErr w:type="spellStart"/>
-      <w:r>
-        <w:t>origem</w:t>
-      </w:r>
-      <w:proofErr w:type="spellEnd"/>
-      <w:r>
-        <w:t xml:space="preserve"> [source], </w:t>
-      </w:r>
-      <w:proofErr w:type="spellStart"/>
-      <w:r>
-        <w:t>destino</w:t>
-      </w:r>
-      <w:proofErr w:type="spellEnd"/>
-      <w:r>
-        <w:t xml:space="preserve"> [target], </w:t>
-      </w:r>
-      <w:proofErr w:type="spellStart"/>
-      <w:r>
-        <w:t>prop_original</w:t>
-      </w:r>
-      <w:proofErr w:type="spellEnd"/>
-      <w:r>
-        <w:t xml:space="preserve"> [initial proportion], and </w:t>
-      </w:r>
-      <w:proofErr w:type="spellStart"/>
-      <w:r>
-        <w:t>n_casos</w:t>
-      </w:r>
-      <w:proofErr w:type="spellEnd"/>
-      <w:r>
-        <w:t xml:space="preserve"> [number of cases affected]).</w:t>
-      </w:r>
-    </w:p>
-    <w:p>
-      <w:pPr>
-        <w:pStyle w:val="Heading3"/>
-        <w:rPr>
-          <w:b w:val="0"/>
-          <w:bCs w:val="0"/>
-          <w:w w:val="90"/>
-          <w:lang w:val="pt-BR"/>
-        </w:rPr>
-      </w:pPr>
-    </w:p>
-    <w:p>
-      <w:pPr>
-        <w:pStyle w:val="Heading1"/>
-        <w:numPr>
-          <w:ilvl w:val="0"/>
-          <w:numId w:val="0"/>
-        </w:numPr>
-        <w:rPr>
-          <w:w w:val="90"/>
-          <w:lang w:val="pt-BR"/>
-        </w:rPr>
-      </w:pPr>
+        <w:t>Content: Merger log recording each change (</w:t>
+      </w:r>
+      <w:r>
+        <w:t>item</w:t>
+      </w:r>
+      <w:r>
+        <w:tab/>
+        <w:t>from</w:t>
+      </w:r>
+      <w:r>
+        <w:tab/>
+        <w:t>to</w:t>
+      </w:r>
+      <w:r>
+        <w:tab/>
+        <w:t>prop</w:t>
+      </w:r>
+      <w:r>
+        <w:tab/>
+      </w:r>
+      <w:proofErr w:type="spellStart"/>
+      <w:r>
+        <w:t>num_cases</w:t>
+      </w:r>
+      <w:proofErr w:type="spellEnd"/>
+      <w:r>
+        <w:t>.</w:t>
+      </w:r>
     </w:p>
     <w:p>
       <w:pPr>
@@ -10422,6 +11253,7 @@
           <w:w w:val="90"/>
           <w:lang w:val="pt-BR"/>
         </w:rPr>
+        <w:lastRenderedPageBreak/>
         <w:t>T</w:t>
       </w:r>
       <w:r>
@@ -11799,7 +12631,6 @@
           <w:w w:val="90"/>
           <w:lang w:val="pt-BR"/>
         </w:rPr>
-        <w:lastRenderedPageBreak/>
         <w:t>1. Inputs</w:t>
       </w:r>
     </w:p>
@@ -14407,6 +15238,7 @@
           <w:w w:val="90"/>
           <w:lang w:val="pt-BR"/>
         </w:rPr>
+        <w:lastRenderedPageBreak/>
         <w:t>../</w:t>
       </w:r>
       <w:proofErr w:type="spellStart"/>
@@ -16016,15 +16848,15 @@
   <w:abstractNum w:abstractNumId="7" w15:restartNumberingAfterBreak="0">
     <w:nsid w:val="73BF2FDB"/>
     <w:multiLevelType w:val="hybridMultilevel"/>
-    <w:tmpl w:val="4C249776"/>
-    <w:lvl w:ilvl="0" w:tplc="D9C28CA0">
+    <w:tmpl w:val="00DA15F6"/>
+    <w:lvl w:ilvl="0" w:tplc="D2F249B6">
       <w:start w:val="1"/>
       <w:numFmt w:val="decimal"/>
       <w:pStyle w:val="Heading1"/>
       <w:lvlText w:val="%1."/>
       <w:lvlJc w:val="left"/>
       <w:pPr>
-        <w:ind w:left="862" w:hanging="360"/>
+        <w:ind w:left="360" w:hanging="360"/>
       </w:pPr>
     </w:lvl>
     <w:lvl w:ilvl="1" w:tplc="04160019" w:tentative="1">
@@ -16427,6 +17259,15 @@
   </w:num>
   <w:num w:numId="10" w16cid:durableId="570964917">
     <w:abstractNumId w:val="2"/>
+  </w:num>
+  <w:num w:numId="11" w16cid:durableId="718283920">
+    <w:abstractNumId w:val="7"/>
+    <w:lvlOverride w:ilvl="0">
+      <w:startOverride w:val="1"/>
+    </w:lvlOverride>
+  </w:num>
+  <w:num w:numId="12" w16cid:durableId="1614552364">
+    <w:abstractNumId w:val="7"/>
   </w:num>
   <w:numIdMacAtCleanup w:val="7"/>
 </w:numbering>
@@ -16832,7 +17673,7 @@
   <w:style w:type="paragraph" w:default="1" w:styleId="Normal">
     <w:name w:val="Normal"/>
     <w:qFormat/>
-    <w:rsid w:val="00C37672"/>
+    <w:rsid w:val="00EC320C"/>
     <w:rPr>
       <w:rFonts w:ascii="Trebuchet MS" w:eastAsia="Trebuchet MS" w:hAnsi="Trebuchet MS" w:cs="Trebuchet MS"/>
     </w:rPr>
@@ -16840,9 +17681,11 @@
   <w:style w:type="paragraph" w:styleId="Heading1">
     <w:name w:val="heading 1"/>
     <w:basedOn w:val="Normal"/>
+    <w:link w:val="Heading1Char"/>
     <w:autoRedefine/>
     <w:uiPriority w:val="9"/>
     <w:qFormat/>
+    <w:rsid w:val="005D3B38"/>
     <w:pPr>
       <w:numPr>
         <w:numId w:val="4"/>
@@ -16915,6 +17758,7 @@
   <w:style w:type="character" w:default="1" w:styleId="DefaultParagraphFont">
     <w:name w:val="Default Paragraph Font"/>
     <w:uiPriority w:val="1"/>
+    <w:semiHidden/>
     <w:unhideWhenUsed/>
   </w:style>
   <w:style w:type="table" w:default="1" w:styleId="TableNormal">
@@ -17077,6 +17921,20 @@
       <w:rFonts w:ascii="Trebuchet MS" w:eastAsia="Trebuchet MS" w:hAnsi="Trebuchet MS" w:cs="Trebuchet MS"/>
       <w:b/>
       <w:bCs/>
+    </w:rPr>
+  </w:style>
+  <w:style w:type="character" w:customStyle="1" w:styleId="Heading1Char">
+    <w:name w:val="Heading 1 Char"/>
+    <w:basedOn w:val="DefaultParagraphFont"/>
+    <w:link w:val="Heading1"/>
+    <w:uiPriority w:val="9"/>
+    <w:rsid w:val="005D3B38"/>
+    <w:rPr>
+      <w:rFonts w:ascii="Trebuchet MS" w:eastAsia="Trebuchet MS" w:hAnsi="Trebuchet MS" w:cs="Trebuchet MS"/>
+      <w:b/>
+      <w:bCs/>
+      <w:sz w:val="28"/>
+      <w:szCs w:val="28"/>
     </w:rPr>
   </w:style>
 </w:styles>

</xml_diff>

<commit_message>
Reproduce 1 - reliability
</commit_message>
<xml_diff>
--- a/Readme - Notebooks - Validation phase.docx
+++ b/Readme - Notebooks - Validation phase.docx
@@ -82,8 +82,21 @@
         </w:rPr>
       </w:pPr>
       <w:r>
-        <w:t xml:space="preserve">Base folder: </w:t>
-      </w:r>
+        <w:rPr>
+          <w:w w:val="90"/>
+          <w:lang w:val="pt-BR"/>
+        </w:rPr>
+        <w:t xml:space="preserve">General </w:t>
+      </w:r>
+      <w:proofErr w:type="spellStart"/>
+      <w:r>
+        <w:rPr>
+          <w:w w:val="90"/>
+          <w:lang w:val="pt-BR"/>
+        </w:rPr>
+        <w:t>Information</w:t>
+      </w:r>
+      <w:proofErr w:type="spellEnd"/>
     </w:p>
     <w:p>
       <w:pPr>
@@ -92,15 +105,42 @@
           <w:ilvl w:val="0"/>
           <w:numId w:val="0"/>
         </w:numPr>
-        <w:ind w:left="502"/>
-      </w:pPr>
-    </w:p>
-    <w:p>
-      <w:pPr>
-        <w:rPr>
-          <w:lang w:val="pt-BR"/>
-        </w:rPr>
-      </w:pPr>
+        <w:ind w:left="360" w:hanging="360"/>
+        <w:rPr>
+          <w:w w:val="90"/>
+          <w:lang w:val="pt-BR"/>
+        </w:rPr>
+      </w:pPr>
+    </w:p>
+    <w:p>
+      <w:pPr>
+        <w:pStyle w:val="Heading1"/>
+        <w:numPr>
+          <w:ilvl w:val="0"/>
+          <w:numId w:val="0"/>
+        </w:numPr>
+        <w:ind w:left="360" w:hanging="360"/>
+        <w:rPr>
+          <w:w w:val="90"/>
+          <w:lang w:val="pt-BR"/>
+        </w:rPr>
+      </w:pPr>
+    </w:p>
+    <w:p>
+      <w:pPr>
+        <w:rPr>
+          <w:lang w:val="pt-BR"/>
+        </w:rPr>
+      </w:pPr>
+      <w:r>
+        <w:rPr>
+          <w:lang w:val="pt-BR"/>
+        </w:rPr>
+        <w:t>Base</w:t>
+      </w:r>
+      <w:r>
+        <w:t xml:space="preserve"> folder: </w:t>
+      </w:r>
       <w:r>
         <w:rPr>
           <w:lang w:val="pt-BR"/>
@@ -189,19 +229,7 @@
         <w:rPr>
           <w:lang w:val="pt-BR"/>
         </w:rPr>
-        <w:t xml:space="preserve"> </w:t>
-      </w:r>
-      <w:r>
-        <w:rPr>
-          <w:lang w:val="pt-BR"/>
-        </w:rPr>
-        <w:t>store</w:t>
-      </w:r>
-      <w:r>
-        <w:rPr>
-          <w:lang w:val="pt-BR"/>
-        </w:rPr>
-        <w:t xml:space="preserve"> </w:t>
+        <w:t xml:space="preserve"> store </w:t>
       </w:r>
       <w:proofErr w:type="spellStart"/>
       <w:r>
@@ -229,13 +257,7 @@
         <w:rPr>
           <w:lang w:val="pt-BR"/>
         </w:rPr>
-        <w:t xml:space="preserve"> scripts</w:t>
-      </w:r>
-      <w:r>
-        <w:rPr>
-          <w:lang w:val="pt-BR"/>
-        </w:rPr>
-        <w:t xml:space="preserve"> </w:t>
+        <w:t xml:space="preserve"> scripts </w:t>
       </w:r>
       <w:proofErr w:type="spellStart"/>
       <w:r>
@@ -251,6 +273,190 @@
         </w:rPr>
         <w:t>.</w:t>
       </w:r>
+    </w:p>
+    <w:p>
+      <w:pPr>
+        <w:pStyle w:val="Heading1"/>
+        <w:numPr>
+          <w:ilvl w:val="0"/>
+          <w:numId w:val="0"/>
+        </w:numPr>
+        <w:ind w:left="360" w:hanging="360"/>
+        <w:rPr>
+          <w:lang w:val="pt-BR"/>
+        </w:rPr>
+      </w:pPr>
+    </w:p>
+    <w:p>
+      <w:pPr>
+        <w:rPr>
+          <w:w w:val="90"/>
+          <w:lang w:val="pt-BR"/>
+        </w:rPr>
+      </w:pPr>
+      <w:proofErr w:type="spellStart"/>
+      <w:r>
+        <w:rPr>
+          <w:w w:val="90"/>
+          <w:lang w:val="pt-BR"/>
+        </w:rPr>
+        <w:t>To</w:t>
+      </w:r>
+      <w:proofErr w:type="spellEnd"/>
+      <w:r>
+        <w:rPr>
+          <w:w w:val="90"/>
+          <w:lang w:val="pt-BR"/>
+        </w:rPr>
+        <w:t xml:space="preserve"> </w:t>
+      </w:r>
+      <w:proofErr w:type="spellStart"/>
+      <w:r>
+        <w:rPr>
+          <w:w w:val="90"/>
+          <w:lang w:val="pt-BR"/>
+        </w:rPr>
+        <w:t>run</w:t>
+      </w:r>
+      <w:proofErr w:type="spellEnd"/>
+      <w:r>
+        <w:rPr>
+          <w:w w:val="90"/>
+          <w:lang w:val="pt-BR"/>
+        </w:rPr>
+        <w:t xml:space="preserve"> </w:t>
+      </w:r>
+      <w:proofErr w:type="spellStart"/>
+      <w:r>
+        <w:rPr>
+          <w:w w:val="90"/>
+          <w:lang w:val="pt-BR"/>
+        </w:rPr>
+        <w:t>all</w:t>
+      </w:r>
+      <w:proofErr w:type="spellEnd"/>
+      <w:r>
+        <w:rPr>
+          <w:w w:val="90"/>
+          <w:lang w:val="pt-BR"/>
+        </w:rPr>
+        <w:t xml:space="preserve"> </w:t>
+      </w:r>
+      <w:proofErr w:type="spellStart"/>
+      <w:r>
+        <w:rPr>
+          <w:w w:val="90"/>
+          <w:lang w:val="pt-BR"/>
+        </w:rPr>
+        <w:t>the</w:t>
+      </w:r>
+      <w:proofErr w:type="spellEnd"/>
+      <w:r>
+        <w:rPr>
+          <w:w w:val="90"/>
+          <w:lang w:val="pt-BR"/>
+        </w:rPr>
+        <w:t xml:space="preserve"> notebooks, start </w:t>
+      </w:r>
+      <w:r>
+        <w:rPr>
+          <w:lang w:val="pt-BR"/>
+        </w:rPr>
+        <w:t>R</w:t>
+      </w:r>
+      <w:r>
+        <w:rPr>
+          <w:w w:val="90"/>
+          <w:lang w:val="pt-BR"/>
+        </w:rPr>
+        <w:t xml:space="preserve"> Studio </w:t>
+      </w:r>
+      <w:proofErr w:type="spellStart"/>
+      <w:r>
+        <w:rPr>
+          <w:w w:val="90"/>
+          <w:lang w:val="pt-BR"/>
+        </w:rPr>
+        <w:t>by</w:t>
+      </w:r>
+      <w:proofErr w:type="spellEnd"/>
+      <w:r>
+        <w:rPr>
+          <w:w w:val="90"/>
+          <w:lang w:val="pt-BR"/>
+        </w:rPr>
+        <w:t xml:space="preserve"> </w:t>
+      </w:r>
+      <w:proofErr w:type="spellStart"/>
+      <w:r>
+        <w:rPr>
+          <w:w w:val="90"/>
+          <w:lang w:val="pt-BR"/>
+        </w:rPr>
+        <w:t>selecting</w:t>
+      </w:r>
+      <w:proofErr w:type="spellEnd"/>
+      <w:r>
+        <w:rPr>
+          <w:w w:val="90"/>
+          <w:lang w:val="pt-BR"/>
+        </w:rPr>
+        <w:t xml:space="preserve"> </w:t>
+      </w:r>
+      <w:r>
+        <w:rPr>
+          <w:w w:val="90"/>
+          <w:lang w:val="pt-BR"/>
+        </w:rPr>
+        <w:t xml:space="preserve">Phase 3 - </w:t>
+      </w:r>
+      <w:proofErr w:type="spellStart"/>
+      <w:r>
+        <w:rPr>
+          <w:w w:val="90"/>
+          <w:lang w:val="pt-BR"/>
+        </w:rPr>
+        <w:t>Scale</w:t>
+      </w:r>
+      <w:proofErr w:type="spellEnd"/>
+      <w:r>
+        <w:rPr>
+          <w:w w:val="90"/>
+          <w:lang w:val="pt-BR"/>
+        </w:rPr>
+        <w:t xml:space="preserve"> </w:t>
+      </w:r>
+      <w:proofErr w:type="spellStart"/>
+      <w:r>
+        <w:rPr>
+          <w:w w:val="90"/>
+          <w:lang w:val="pt-BR"/>
+        </w:rPr>
+        <w:t>Validation</w:t>
+      </w:r>
+      <w:r>
+        <w:rPr>
+          <w:w w:val="90"/>
+          <w:lang w:val="pt-BR"/>
+        </w:rPr>
+        <w:t>.Rproj</w:t>
+      </w:r>
+      <w:proofErr w:type="spellEnd"/>
+      <w:r>
+        <w:rPr>
+          <w:w w:val="90"/>
+          <w:lang w:val="pt-BR"/>
+        </w:rPr>
+        <w:t xml:space="preserve"> in base folder. </w:t>
+      </w:r>
+    </w:p>
+    <w:p>
+      <w:pPr>
+        <w:rPr>
+          <w:w w:val="90"/>
+          <w:lang w:val="pt-BR"/>
+        </w:rPr>
+      </w:pPr>
     </w:p>
     <w:p>
       <w:pPr>
@@ -3876,6 +4082,7 @@
         <w:rPr>
           <w:lang w:val="pt-BR"/>
         </w:rPr>
+        <w:lastRenderedPageBreak/>
         <w:t xml:space="preserve">In file: </w:t>
       </w:r>
       <w:r>
@@ -5774,6 +5981,7 @@
         <w:rPr>
           <w:lang w:val="pt-BR"/>
         </w:rPr>
+        <w:lastRenderedPageBreak/>
         <w:t>From</w:t>
       </w:r>
       <w:proofErr w:type="spellEnd"/>
@@ -5956,7 +6164,6 @@
         <w:rPr>
           <w:lang w:val="pt-BR"/>
         </w:rPr>
-        <w:lastRenderedPageBreak/>
         <w:t>EVisualization</w:t>
       </w:r>
       <w:proofErr w:type="spellEnd"/>
@@ -8535,6 +8742,7 @@
           <w:szCs w:val="20"/>
           <w:lang w:val="pt-BR" w:eastAsia="pt-BR"/>
         </w:rPr>
+        <w:lastRenderedPageBreak/>
         <w:t>AO0</w:t>
       </w:r>
       <w:r>
@@ -8690,7 +8898,6 @@
           <w:szCs w:val="20"/>
           <w:lang w:val="pt-BR" w:eastAsia="pt-BR"/>
         </w:rPr>
-        <w:lastRenderedPageBreak/>
         <w:t>AO0</w:t>
       </w:r>
       <w:r>
@@ -8911,19 +9118,7 @@
         <w:rPr>
           <w:lang w:val="pt-BR"/>
         </w:rPr>
-        <w:t xml:space="preserve"> </w:t>
-      </w:r>
-      <w:r>
-        <w:rPr>
-          <w:lang w:val="pt-BR"/>
-        </w:rPr>
-        <w:t>3</w:t>
-      </w:r>
-      <w:r>
-        <w:rPr>
-          <w:lang w:val="pt-BR"/>
-        </w:rPr>
-        <w:t xml:space="preserve"> </w:t>
+        <w:t xml:space="preserve"> 3 </w:t>
       </w:r>
       <w:proofErr w:type="spellStart"/>
       <w:r>
@@ -8937,13 +9132,7 @@
         <w:rPr>
           <w:lang w:val="pt-BR"/>
         </w:rPr>
-        <w:t xml:space="preserve"> </w:t>
-      </w:r>
-      <w:r>
-        <w:rPr>
-          <w:lang w:val="pt-BR"/>
-        </w:rPr>
-        <w:t xml:space="preserve">files </w:t>
+        <w:t xml:space="preserve"> files </w:t>
       </w:r>
       <w:proofErr w:type="spellStart"/>
       <w:r>
@@ -9013,13 +9202,7 @@
         <w:rPr>
           <w:lang w:val="pt-BR"/>
         </w:rPr>
-        <w:t>,</w:t>
-      </w:r>
-      <w:r>
-        <w:rPr>
-          <w:lang w:val="pt-BR"/>
-        </w:rPr>
-        <w:t xml:space="preserve"> SUS </w:t>
+        <w:t xml:space="preserve">, SUS </w:t>
       </w:r>
       <w:proofErr w:type="spellStart"/>
       <w:r>
@@ -9479,6 +9662,40 @@
           <w:lang w:val="pt-BR"/>
         </w:rPr>
         <w:t>Reproduce0 - Colapse input data</w:t>
+      </w:r>
+    </w:p>
+    <w:p>
+      <w:pPr>
+        <w:pStyle w:val="Heading3"/>
+        <w:ind w:left="0" w:firstLine="0"/>
+        <w:rPr>
+          <w:w w:val="90"/>
+          <w:lang w:val="pt-BR"/>
+        </w:rPr>
+      </w:pPr>
+    </w:p>
+    <w:p>
+      <w:pPr>
+        <w:pStyle w:val="Heading3"/>
+        <w:ind w:left="0" w:firstLine="0"/>
+        <w:rPr>
+          <w:w w:val="90"/>
+          <w:lang w:val="pt-BR"/>
+        </w:rPr>
+      </w:pPr>
+      <w:r>
+        <w:rPr>
+          <w:w w:val="90"/>
+          <w:lang w:val="pt-BR"/>
+        </w:rPr>
+        <w:t xml:space="preserve">Notebook: </w:t>
+      </w:r>
+      <w:r>
+        <w:rPr>
+          <w:w w:val="90"/>
+          <w:lang w:val="pt-BR"/>
+        </w:rPr>
+        <w:t>Val_0_Colapsing_Low-Frequency_Categories-toMoreFrequent</w:t>
       </w:r>
     </w:p>
     <w:p>
@@ -10441,34 +10658,19 @@
     <w:p>
       <w:pPr>
         <w:pStyle w:val="Heading1"/>
-        <w:rPr>
-          <w:w w:val="90"/>
-          <w:lang w:val="pt-BR"/>
-        </w:rPr>
-      </w:pPr>
-      <w:r>
-        <w:rPr>
-          <w:w w:val="90"/>
-          <w:lang w:val="pt-BR"/>
-        </w:rPr>
-        <w:t>Val_1_Gold_standard_</w:t>
-      </w:r>
-      <w:proofErr w:type="gramStart"/>
-      <w:r>
-        <w:rPr>
-          <w:w w:val="90"/>
-          <w:lang w:val="pt-BR"/>
-        </w:rPr>
-        <w:t>reliability</w:t>
-      </w:r>
-      <w:r>
-        <w:rPr>
-          <w:w w:val="90"/>
-          <w:lang w:val="pt-BR"/>
-        </w:rPr>
-        <w:t>.Rmd</w:t>
-      </w:r>
-      <w:proofErr w:type="gramEnd"/>
+        <w:ind w:left="862"/>
+        <w:rPr>
+          <w:w w:val="90"/>
+          <w:lang w:val="pt-BR"/>
+        </w:rPr>
+      </w:pPr>
+      <w:r>
+        <w:rPr>
+          <w:w w:val="90"/>
+          <w:lang w:val="pt-BR"/>
+        </w:rPr>
+        <w:t>Reproduce1_reliabitiliy</w:t>
+      </w:r>
     </w:p>
     <w:p>
       <w:pPr>
@@ -10489,22 +10691,29 @@
           <w:lang w:val="pt-BR"/>
         </w:rPr>
       </w:pPr>
-      <w:proofErr w:type="spellStart"/>
-      <w:r>
-        <w:rPr>
-          <w:w w:val="90"/>
-          <w:lang w:val="pt-BR"/>
-        </w:rPr>
-        <w:t>Description</w:t>
-      </w:r>
-      <w:proofErr w:type="spellEnd"/>
-      <w:r>
-        <w:rPr>
-          <w:w w:val="90"/>
-          <w:lang w:val="pt-BR"/>
-        </w:rPr>
-        <w:t xml:space="preserve">: </w:t>
-      </w:r>
+      <w:r>
+        <w:rPr>
+          <w:w w:val="90"/>
+          <w:lang w:val="pt-BR"/>
+        </w:rPr>
+        <w:t xml:space="preserve">Notebook: </w:t>
+      </w:r>
+      <w:r>
+        <w:rPr>
+          <w:w w:val="90"/>
+          <w:lang w:val="pt-BR"/>
+        </w:rPr>
+        <w:t>Val_1_Gold_standard_</w:t>
+      </w:r>
+      <w:proofErr w:type="gramStart"/>
+      <w:r>
+        <w:rPr>
+          <w:w w:val="90"/>
+          <w:lang w:val="pt-BR"/>
+        </w:rPr>
+        <w:t>reliability.Rmd</w:t>
+      </w:r>
+      <w:proofErr w:type="gramEnd"/>
     </w:p>
     <w:p>
       <w:pPr>
@@ -10519,6 +10728,44 @@
     <w:p>
       <w:pPr>
         <w:pStyle w:val="Heading3"/>
+        <w:ind w:left="0" w:firstLine="0"/>
+        <w:rPr>
+          <w:w w:val="90"/>
+          <w:lang w:val="pt-BR"/>
+        </w:rPr>
+      </w:pPr>
+      <w:proofErr w:type="spellStart"/>
+      <w:r>
+        <w:rPr>
+          <w:w w:val="90"/>
+          <w:lang w:val="pt-BR"/>
+        </w:rPr>
+        <w:lastRenderedPageBreak/>
+        <w:t>Description</w:t>
+      </w:r>
+      <w:proofErr w:type="spellEnd"/>
+      <w:r>
+        <w:rPr>
+          <w:w w:val="90"/>
+          <w:lang w:val="pt-BR"/>
+        </w:rPr>
+        <w:t xml:space="preserve">: </w:t>
+      </w:r>
+    </w:p>
+    <w:p>
+      <w:pPr>
+        <w:pStyle w:val="Heading3"/>
+        <w:ind w:left="0" w:firstLine="0"/>
+        <w:rPr>
+          <w:w w:val="90"/>
+          <w:lang w:val="pt-BR"/>
+        </w:rPr>
+      </w:pPr>
+    </w:p>
+    <w:p>
+      <w:pPr>
+        <w:pStyle w:val="Heading3"/>
+        <w:ind w:left="142" w:firstLine="0"/>
         <w:rPr>
           <w:b w:val="0"/>
           <w:bCs w:val="0"/>
@@ -10526,7 +10773,7 @@
           <w:lang w:val="pt-BR"/>
         </w:rPr>
       </w:pPr>
-      <w:proofErr w:type="gramStart"/>
+      <w:proofErr w:type="spellStart"/>
       <w:r>
         <w:rPr>
           <w:b w:val="0"/>
@@ -10534,9 +10781,9 @@
           <w:w w:val="90"/>
           <w:lang w:val="pt-BR"/>
         </w:rPr>
-        <w:t xml:space="preserve">  </w:t>
-      </w:r>
-      <w:proofErr w:type="spellStart"/>
+        <w:t>Loads</w:t>
+      </w:r>
+      <w:proofErr w:type="spellEnd"/>
       <w:r>
         <w:rPr>
           <w:b w:val="0"/>
@@ -10544,10 +10791,8 @@
           <w:w w:val="90"/>
           <w:lang w:val="pt-BR"/>
         </w:rPr>
-        <w:t>Loads</w:t>
-      </w:r>
-      <w:proofErr w:type="spellEnd"/>
-      <w:proofErr w:type="gramEnd"/>
+        <w:t xml:space="preserve"> </w:t>
+      </w:r>
       <w:r>
         <w:rPr>
           <w:b w:val="0"/>
@@ -10555,8 +10800,9 @@
           <w:w w:val="90"/>
           <w:lang w:val="pt-BR"/>
         </w:rPr>
-        <w:t xml:space="preserve"> </w:t>
-      </w:r>
+        <w:t xml:space="preserve">SUS </w:t>
+      </w:r>
+      <w:proofErr w:type="spellStart"/>
       <w:r>
         <w:rPr>
           <w:b w:val="0"/>
@@ -10564,9 +10810,9 @@
           <w:w w:val="90"/>
           <w:lang w:val="pt-BR"/>
         </w:rPr>
-        <w:t xml:space="preserve">SUS </w:t>
-      </w:r>
-      <w:proofErr w:type="spellStart"/>
+        <w:t>and</w:t>
+      </w:r>
+      <w:proofErr w:type="spellEnd"/>
       <w:r>
         <w:rPr>
           <w:b w:val="0"/>
@@ -10574,9 +10820,8 @@
           <w:w w:val="90"/>
           <w:lang w:val="pt-BR"/>
         </w:rPr>
-        <w:t>and</w:t>
-      </w:r>
-      <w:proofErr w:type="spellEnd"/>
+        <w:t xml:space="preserve"> UEQ-S </w:t>
+      </w:r>
       <w:r>
         <w:rPr>
           <w:b w:val="0"/>
@@ -10584,8 +10829,9 @@
           <w:w w:val="90"/>
           <w:lang w:val="pt-BR"/>
         </w:rPr>
-        <w:t xml:space="preserve"> UEQ-S </w:t>
-      </w:r>
+        <w:t xml:space="preserve">responses </w:t>
+      </w:r>
+      <w:proofErr w:type="spellStart"/>
       <w:r>
         <w:rPr>
           <w:b w:val="0"/>
@@ -10593,9 +10839,9 @@
           <w:w w:val="90"/>
           <w:lang w:val="pt-BR"/>
         </w:rPr>
-        <w:t xml:space="preserve">responses </w:t>
-      </w:r>
-      <w:proofErr w:type="spellStart"/>
+        <w:t>from</w:t>
+      </w:r>
+      <w:proofErr w:type="spellEnd"/>
       <w:r>
         <w:rPr>
           <w:b w:val="0"/>
@@ -10603,9 +10849,9 @@
           <w:w w:val="90"/>
           <w:lang w:val="pt-BR"/>
         </w:rPr>
-        <w:t>from</w:t>
-      </w:r>
-      <w:proofErr w:type="spellEnd"/>
+        <w:t xml:space="preserve"> CSV files, </w:t>
+      </w:r>
+      <w:proofErr w:type="spellStart"/>
       <w:r>
         <w:rPr>
           <w:b w:val="0"/>
@@ -10613,9 +10859,9 @@
           <w:w w:val="90"/>
           <w:lang w:val="pt-BR"/>
         </w:rPr>
-        <w:t xml:space="preserve"> CSV files, </w:t>
-      </w:r>
-      <w:proofErr w:type="spellStart"/>
+        <w:t>standardizes</w:t>
+      </w:r>
+      <w:proofErr w:type="spellEnd"/>
       <w:r>
         <w:rPr>
           <w:b w:val="0"/>
@@ -10623,9 +10869,9 @@
           <w:w w:val="90"/>
           <w:lang w:val="pt-BR"/>
         </w:rPr>
-        <w:t>standardizes</w:t>
-      </w:r>
-      <w:proofErr w:type="spellEnd"/>
+        <w:t xml:space="preserve"> </w:t>
+      </w:r>
+      <w:proofErr w:type="spellStart"/>
       <w:r>
         <w:rPr>
           <w:b w:val="0"/>
@@ -10633,9 +10879,9 @@
           <w:w w:val="90"/>
           <w:lang w:val="pt-BR"/>
         </w:rPr>
-        <w:t xml:space="preserve"> </w:t>
-      </w:r>
-      <w:proofErr w:type="spellStart"/>
+        <w:t>column</w:t>
+      </w:r>
+      <w:proofErr w:type="spellEnd"/>
       <w:r>
         <w:rPr>
           <w:b w:val="0"/>
@@ -10643,9 +10889,9 @@
           <w:w w:val="90"/>
           <w:lang w:val="pt-BR"/>
         </w:rPr>
-        <w:t>column</w:t>
-      </w:r>
-      <w:proofErr w:type="spellEnd"/>
+        <w:t xml:space="preserve"> </w:t>
+      </w:r>
+      <w:proofErr w:type="spellStart"/>
       <w:r>
         <w:rPr>
           <w:b w:val="0"/>
@@ -10653,9 +10899,9 @@
           <w:w w:val="90"/>
           <w:lang w:val="pt-BR"/>
         </w:rPr>
-        <w:t xml:space="preserve"> </w:t>
-      </w:r>
-      <w:proofErr w:type="spellStart"/>
+        <w:t>names</w:t>
+      </w:r>
+      <w:proofErr w:type="spellEnd"/>
       <w:r>
         <w:rPr>
           <w:b w:val="0"/>
@@ -10663,104 +10909,103 @@
           <w:w w:val="90"/>
           <w:lang w:val="pt-BR"/>
         </w:rPr>
-        <w:t>names</w:t>
-      </w:r>
-      <w:proofErr w:type="spellEnd"/>
+        <w:t xml:space="preserve">, </w:t>
+      </w:r>
+      <w:proofErr w:type="spellStart"/>
       <w:r>
         <w:rPr>
           <w:b w:val="0"/>
           <w:bCs w:val="0"/>
           <w:w w:val="90"/>
-          <w:lang w:val="pt-BR"/>
-        </w:rPr>
-        <w:t xml:space="preserve">, </w:t>
-      </w:r>
-      <w:proofErr w:type="spellStart"/>
+          <w:highlight w:val="yellow"/>
+          <w:lang w:val="pt-BR"/>
+        </w:rPr>
+        <w:t>and</w:t>
+      </w:r>
+      <w:proofErr w:type="spellEnd"/>
       <w:r>
         <w:rPr>
           <w:b w:val="0"/>
           <w:bCs w:val="0"/>
           <w:w w:val="90"/>
-          <w:lang w:val="pt-BR"/>
-        </w:rPr>
-        <w:t>and</w:t>
-      </w:r>
-      <w:proofErr w:type="spellEnd"/>
+          <w:highlight w:val="yellow"/>
+          <w:lang w:val="pt-BR"/>
+        </w:rPr>
+        <w:t xml:space="preserve"> </w:t>
+      </w:r>
+      <w:proofErr w:type="spellStart"/>
       <w:r>
         <w:rPr>
           <w:b w:val="0"/>
           <w:bCs w:val="0"/>
           <w:w w:val="90"/>
-          <w:lang w:val="pt-BR"/>
-        </w:rPr>
-        <w:t xml:space="preserve"> </w:t>
-      </w:r>
-      <w:proofErr w:type="spellStart"/>
+          <w:highlight w:val="yellow"/>
+          <w:lang w:val="pt-BR"/>
+        </w:rPr>
+        <w:t>applies</w:t>
+      </w:r>
+      <w:proofErr w:type="spellEnd"/>
       <w:r>
         <w:rPr>
           <w:b w:val="0"/>
           <w:bCs w:val="0"/>
           <w:w w:val="90"/>
-          <w:lang w:val="pt-BR"/>
-        </w:rPr>
-        <w:t>applies</w:t>
-      </w:r>
-      <w:proofErr w:type="spellEnd"/>
+          <w:highlight w:val="yellow"/>
+          <w:lang w:val="pt-BR"/>
+        </w:rPr>
+        <w:t xml:space="preserve"> reverse </w:t>
+      </w:r>
+      <w:proofErr w:type="spellStart"/>
       <w:r>
         <w:rPr>
           <w:b w:val="0"/>
           <w:bCs w:val="0"/>
           <w:w w:val="90"/>
-          <w:lang w:val="pt-BR"/>
-        </w:rPr>
-        <w:t xml:space="preserve"> reverse </w:t>
-      </w:r>
-      <w:proofErr w:type="spellStart"/>
+          <w:highlight w:val="yellow"/>
+          <w:lang w:val="pt-BR"/>
+        </w:rPr>
+        <w:t>scoring</w:t>
+      </w:r>
+      <w:proofErr w:type="spellEnd"/>
       <w:r>
         <w:rPr>
           <w:b w:val="0"/>
           <w:bCs w:val="0"/>
           <w:w w:val="90"/>
-          <w:lang w:val="pt-BR"/>
-        </w:rPr>
-        <w:t>scoring</w:t>
-      </w:r>
-      <w:proofErr w:type="spellEnd"/>
+          <w:highlight w:val="yellow"/>
+          <w:lang w:val="pt-BR"/>
+        </w:rPr>
+        <w:t xml:space="preserve"> </w:t>
+      </w:r>
+      <w:proofErr w:type="spellStart"/>
       <w:r>
         <w:rPr>
           <w:b w:val="0"/>
           <w:bCs w:val="0"/>
           <w:w w:val="90"/>
-          <w:lang w:val="pt-BR"/>
-        </w:rPr>
-        <w:t xml:space="preserve"> </w:t>
-      </w:r>
-      <w:proofErr w:type="spellStart"/>
+          <w:highlight w:val="yellow"/>
+          <w:lang w:val="pt-BR"/>
+        </w:rPr>
+        <w:t>to</w:t>
+      </w:r>
+      <w:proofErr w:type="spellEnd"/>
       <w:r>
         <w:rPr>
           <w:b w:val="0"/>
           <w:bCs w:val="0"/>
           <w:w w:val="90"/>
-          <w:lang w:val="pt-BR"/>
-        </w:rPr>
-        <w:t>to</w:t>
-      </w:r>
-      <w:proofErr w:type="spellEnd"/>
+          <w:highlight w:val="yellow"/>
+          <w:lang w:val="pt-BR"/>
+        </w:rPr>
+        <w:t xml:space="preserve"> negative SUS </w:t>
+      </w:r>
+      <w:proofErr w:type="spellStart"/>
       <w:r>
         <w:rPr>
           <w:b w:val="0"/>
           <w:bCs w:val="0"/>
           <w:w w:val="90"/>
-          <w:lang w:val="pt-BR"/>
-        </w:rPr>
-        <w:t xml:space="preserve"> negative SUS </w:t>
-      </w:r>
-      <w:proofErr w:type="spellStart"/>
-      <w:r>
-        <w:rPr>
-          <w:b w:val="0"/>
-          <w:bCs w:val="0"/>
-          <w:w w:val="90"/>
+          <w:highlight w:val="yellow"/>
           <w:lang w:val="pt-BR"/>
         </w:rPr>
         <w:t>items</w:t>
@@ -11253,7 +11498,6 @@
           <w:w w:val="90"/>
           <w:lang w:val="pt-BR"/>
         </w:rPr>
-        <w:lastRenderedPageBreak/>
         <w:t>T</w:t>
       </w:r>
       <w:r>
@@ -12301,34 +12545,34 @@
     </w:p>
     <w:p>
       <w:pPr>
-        <w:pStyle w:val="BodyText"/>
-        <w:numPr>
-          <w:ilvl w:val="0"/>
-          <w:numId w:val="4"/>
-        </w:numPr>
-        <w:rPr>
-          <w:b/>
-          <w:bCs/>
-          <w:spacing w:val="-2"/>
-          <w:w w:val="90"/>
-          <w:lang w:val="pt-BR"/>
-        </w:rPr>
-      </w:pPr>
-      <w:r>
-        <w:rPr>
-          <w:b/>
-          <w:bCs/>
-          <w:spacing w:val="-2"/>
-          <w:w w:val="90"/>
-          <w:lang w:val="pt-BR"/>
-        </w:rPr>
-        <w:t xml:space="preserve">Pearson </w:t>
-      </w:r>
-      <w:proofErr w:type="spellStart"/>
-      <w:r>
-        <w:rPr>
-          <w:b/>
-          <w:bCs/>
+        <w:pStyle w:val="Heading1"/>
+        <w:ind w:left="862"/>
+        <w:rPr>
+          <w:b w:val="0"/>
+          <w:bCs w:val="0"/>
+          <w:spacing w:val="-2"/>
+          <w:w w:val="90"/>
+          <w:lang w:val="pt-BR"/>
+        </w:rPr>
+      </w:pPr>
+      <w:r>
+        <w:rPr>
+          <w:w w:val="90"/>
+          <w:lang w:val="pt-BR"/>
+        </w:rPr>
+        <w:t>Pearson</w:t>
+      </w:r>
+      <w:r>
+        <w:rPr>
+          <w:spacing w:val="-2"/>
+          <w:w w:val="90"/>
+          <w:lang w:val="pt-BR"/>
+        </w:rPr>
+        <w:t xml:space="preserve"> </w:t>
+      </w:r>
+      <w:proofErr w:type="spellStart"/>
+      <w:r>
+        <w:rPr>
           <w:spacing w:val="-2"/>
           <w:w w:val="90"/>
           <w:lang w:val="pt-BR"/>
@@ -12338,19 +12582,15 @@
       <w:proofErr w:type="spellEnd"/>
       <w:r>
         <w:rPr>
-          <w:b/>
-          <w:bCs/>
-          <w:spacing w:val="-2"/>
-          <w:w w:val="90"/>
-          <w:lang w:val="pt-BR"/>
-        </w:rPr>
-        <w:t xml:space="preserve"> </w:t>
-      </w:r>
-      <w:proofErr w:type="spellStart"/>
-      <w:r>
-        <w:rPr>
-          <w:b/>
-          <w:bCs/>
+          <w:spacing w:val="-2"/>
+          <w:w w:val="90"/>
+          <w:lang w:val="pt-BR"/>
+        </w:rPr>
+        <w:t xml:space="preserve"> </w:t>
+      </w:r>
+      <w:proofErr w:type="spellStart"/>
+      <w:r>
+        <w:rPr>
           <w:spacing w:val="-2"/>
           <w:w w:val="90"/>
           <w:lang w:val="pt-BR"/>
@@ -12360,8 +12600,6 @@
       <w:proofErr w:type="spellEnd"/>
       <w:r>
         <w:rPr>
-          <w:b/>
-          <w:bCs/>
           <w:spacing w:val="-2"/>
           <w:w w:val="90"/>
           <w:lang w:val="pt-BR"/>
@@ -12371,8 +12609,6 @@
       <w:proofErr w:type="spellStart"/>
       <w:r>
         <w:rPr>
-          <w:b/>
-          <w:bCs/>
           <w:spacing w:val="-2"/>
           <w:w w:val="90"/>
           <w:lang w:val="pt-BR"/>
@@ -12382,8 +12618,6 @@
       <w:proofErr w:type="spellEnd"/>
       <w:r>
         <w:rPr>
-          <w:b/>
-          <w:bCs/>
           <w:spacing w:val="-2"/>
           <w:w w:val="90"/>
           <w:lang w:val="pt-BR"/>
@@ -12393,8 +12627,6 @@
       <w:proofErr w:type="spellStart"/>
       <w:r>
         <w:rPr>
-          <w:b/>
-          <w:bCs/>
           <w:spacing w:val="-2"/>
           <w:w w:val="90"/>
           <w:lang w:val="pt-BR"/>
@@ -14625,6 +14857,7 @@
           <w:w w:val="90"/>
           <w:lang w:val="pt-BR"/>
         </w:rPr>
+        <w:lastRenderedPageBreak/>
         <w:t>Enforces</w:t>
       </w:r>
       <w:proofErr w:type="spellEnd"/>
@@ -15238,7 +15471,6 @@
           <w:w w:val="90"/>
           <w:lang w:val="pt-BR"/>
         </w:rPr>
-        <w:lastRenderedPageBreak/>
         <w:t>../</w:t>
       </w:r>
       <w:proofErr w:type="spellStart"/>
@@ -15574,6 +15806,243 @@
           <w:lang w:val="pt-BR"/>
         </w:rPr>
         <w:t xml:space="preserve">-values. </w:t>
+      </w:r>
+    </w:p>
+    <w:p>
+      <w:pPr>
+        <w:pStyle w:val="BodyText"/>
+        <w:rPr>
+          <w:spacing w:val="-2"/>
+          <w:w w:val="90"/>
+          <w:lang w:val="pt-BR"/>
+        </w:rPr>
+      </w:pPr>
+    </w:p>
+    <w:p>
+      <w:pPr>
+        <w:pStyle w:val="BodyText"/>
+        <w:rPr>
+          <w:spacing w:val="-2"/>
+          <w:w w:val="90"/>
+          <w:lang w:val="pt-BR"/>
+        </w:rPr>
+      </w:pPr>
+    </w:p>
+    <w:p>
+      <w:pPr>
+        <w:pStyle w:val="BodyText"/>
+        <w:rPr>
+          <w:spacing w:val="-2"/>
+          <w:w w:val="90"/>
+          <w:lang w:val="pt-BR"/>
+        </w:rPr>
+      </w:pPr>
+    </w:p>
+    <w:p>
+      <w:pPr>
+        <w:pStyle w:val="Heading1"/>
+        <w:ind w:left="862"/>
+        <w:rPr>
+          <w:spacing w:val="-2"/>
+          <w:w w:val="90"/>
+          <w:lang w:val="pt-BR"/>
+        </w:rPr>
+      </w:pPr>
+      <w:r>
+        <w:rPr>
+          <w:w w:val="90"/>
+          <w:lang w:val="pt-BR"/>
+        </w:rPr>
+        <w:t>Reproduce6</w:t>
+      </w:r>
+      <w:r>
+        <w:rPr>
+          <w:spacing w:val="-2"/>
+          <w:w w:val="90"/>
+          <w:lang w:val="pt-BR"/>
+        </w:rPr>
+        <w:t xml:space="preserve"> </w:t>
+      </w:r>
+      <w:r>
+        <w:rPr>
+          <w:spacing w:val="-2"/>
+          <w:w w:val="90"/>
+          <w:lang w:val="pt-BR"/>
+        </w:rPr>
+        <w:t>–</w:t>
+      </w:r>
+      <w:r>
+        <w:rPr>
+          <w:spacing w:val="-2"/>
+          <w:w w:val="90"/>
+          <w:lang w:val="pt-BR"/>
+        </w:rPr>
+        <w:t xml:space="preserve"> </w:t>
+      </w:r>
+      <w:proofErr w:type="spellStart"/>
+      <w:r>
+        <w:rPr>
+          <w:spacing w:val="-2"/>
+          <w:w w:val="90"/>
+          <w:lang w:val="pt-BR"/>
+        </w:rPr>
+        <w:t>AnalysisBySystem</w:t>
+      </w:r>
+      <w:proofErr w:type="spellEnd"/>
+    </w:p>
+    <w:p>
+      <w:pPr>
+        <w:pStyle w:val="Heading1"/>
+        <w:numPr>
+          <w:ilvl w:val="0"/>
+          <w:numId w:val="0"/>
+        </w:numPr>
+        <w:ind w:left="360" w:hanging="360"/>
+        <w:rPr>
+          <w:spacing w:val="-2"/>
+          <w:w w:val="90"/>
+          <w:lang w:val="pt-BR"/>
+        </w:rPr>
+      </w:pPr>
+    </w:p>
+    <w:p>
+      <w:pPr>
+        <w:pStyle w:val="Heading3"/>
+        <w:ind w:left="0" w:firstLine="0"/>
+        <w:rPr>
+          <w:w w:val="90"/>
+          <w:lang w:val="pt-BR"/>
+        </w:rPr>
+      </w:pPr>
+      <w:r>
+        <w:rPr>
+          <w:w w:val="90"/>
+          <w:lang w:val="pt-BR"/>
+        </w:rPr>
+        <w:t xml:space="preserve">Notebook: </w:t>
+      </w:r>
+      <w:r>
+        <w:rPr>
+          <w:w w:val="90"/>
+          <w:lang w:val="pt-BR"/>
+        </w:rPr>
+        <w:t>Val_</w:t>
+      </w:r>
+      <w:r>
+        <w:rPr>
+          <w:w w:val="90"/>
+          <w:lang w:val="pt-BR"/>
+        </w:rPr>
+        <w:t>6XXX</w:t>
+      </w:r>
+    </w:p>
+    <w:p>
+      <w:pPr>
+        <w:pStyle w:val="Heading3"/>
+        <w:ind w:left="0" w:firstLine="0"/>
+        <w:rPr>
+          <w:w w:val="90"/>
+          <w:lang w:val="pt-BR"/>
+        </w:rPr>
+      </w:pPr>
+    </w:p>
+    <w:p>
+      <w:pPr>
+        <w:pStyle w:val="Heading3"/>
+        <w:ind w:left="0" w:firstLine="0"/>
+        <w:rPr>
+          <w:w w:val="90"/>
+          <w:lang w:val="pt-BR"/>
+        </w:rPr>
+      </w:pPr>
+      <w:proofErr w:type="spellStart"/>
+      <w:r>
+        <w:rPr>
+          <w:w w:val="90"/>
+          <w:lang w:val="pt-BR"/>
+        </w:rPr>
+        <w:t>Description</w:t>
+      </w:r>
+      <w:proofErr w:type="spellEnd"/>
+      <w:r>
+        <w:rPr>
+          <w:w w:val="90"/>
+          <w:lang w:val="pt-BR"/>
+        </w:rPr>
+        <w:t xml:space="preserve">: </w:t>
+      </w:r>
+    </w:p>
+    <w:p>
+      <w:pPr>
+        <w:pStyle w:val="Heading3"/>
+        <w:ind w:left="0" w:firstLine="0"/>
+        <w:rPr>
+          <w:w w:val="90"/>
+          <w:lang w:val="pt-BR"/>
+        </w:rPr>
+      </w:pPr>
+    </w:p>
+    <w:p>
+      <w:pPr>
+        <w:pStyle w:val="Heading1"/>
+        <w:numPr>
+          <w:ilvl w:val="0"/>
+          <w:numId w:val="0"/>
+        </w:numPr>
+        <w:ind w:left="360" w:hanging="360"/>
+        <w:rPr>
+          <w:spacing w:val="-2"/>
+          <w:w w:val="90"/>
+          <w:lang w:val="pt-BR"/>
+        </w:rPr>
+      </w:pPr>
+    </w:p>
+    <w:p>
+      <w:pPr>
+        <w:pStyle w:val="Heading1"/>
+        <w:numPr>
+          <w:ilvl w:val="0"/>
+          <w:numId w:val="0"/>
+        </w:numPr>
+        <w:ind w:left="360" w:hanging="360"/>
+        <w:rPr>
+          <w:spacing w:val="-2"/>
+          <w:w w:val="90"/>
+          <w:lang w:val="pt-BR"/>
+        </w:rPr>
+      </w:pPr>
+    </w:p>
+    <w:p>
+      <w:pPr>
+        <w:pStyle w:val="Heading1"/>
+        <w:numPr>
+          <w:ilvl w:val="0"/>
+          <w:numId w:val="0"/>
+        </w:numPr>
+        <w:ind w:left="360" w:hanging="360"/>
+        <w:rPr>
+          <w:spacing w:val="-2"/>
+          <w:w w:val="90"/>
+          <w:lang w:val="pt-BR"/>
+        </w:rPr>
+      </w:pPr>
+    </w:p>
+    <w:p>
+      <w:pPr>
+        <w:pStyle w:val="BodyText"/>
+        <w:rPr>
+          <w:spacing w:val="-2"/>
+          <w:w w:val="90"/>
+          <w:lang w:val="pt-BR"/>
+        </w:rPr>
+      </w:pPr>
+      <w:r>
+        <w:rPr>
+          <w:spacing w:val="-2"/>
+          <w:w w:val="90"/>
+          <w:lang w:val="pt-BR"/>
+        </w:rPr>
+        <w:t>Val_0_Colapsing_Low-Frequency_Categories-toMoreFrequent</w:t>
       </w:r>
     </w:p>
     <w:p>
@@ -16856,7 +17325,7 @@
       <w:lvlText w:val="%1."/>
       <w:lvlJc w:val="left"/>
       <w:pPr>
-        <w:ind w:left="360" w:hanging="360"/>
+        <w:ind w:left="1778" w:hanging="360"/>
       </w:pPr>
     </w:lvl>
     <w:lvl w:ilvl="1" w:tplc="04160019" w:tentative="1">
@@ -17267,6 +17736,18 @@
     </w:lvlOverride>
   </w:num>
   <w:num w:numId="12" w16cid:durableId="1614552364">
+    <w:abstractNumId w:val="7"/>
+  </w:num>
+  <w:num w:numId="13" w16cid:durableId="1459031990">
+    <w:abstractNumId w:val="7"/>
+  </w:num>
+  <w:num w:numId="14" w16cid:durableId="1635210654">
+    <w:abstractNumId w:val="7"/>
+  </w:num>
+  <w:num w:numId="15" w16cid:durableId="1852596941">
+    <w:abstractNumId w:val="7"/>
+  </w:num>
+  <w:num w:numId="16" w16cid:durableId="175585132">
     <w:abstractNumId w:val="7"/>
   </w:num>
   <w:numIdMacAtCleanup w:val="7"/>
@@ -17690,6 +18171,7 @@
       <w:numPr>
         <w:numId w:val="4"/>
       </w:numPr>
+      <w:ind w:left="360"/>
       <w:outlineLvl w:val="0"/>
     </w:pPr>
     <w:rPr>

</xml_diff>